<commit_message>
next 4 robustness and fixes in UC 5 - 8
</commit_message>
<xml_diff>
--- a/2nd_phase/Robustness-diagram-v0.1.docx
+++ b/2nd_phase/Robustness-diagram-v0.1.docx
@@ -1402,6 +1402,7 @@
         <w:jc w:val="both"/>
         <w:rPr>
           <w:rFonts w:ascii="Calibri" w:hAnsi="Calibri" w:cs="Calibri"/>
+          <w:lang w:val="el-GR"/>
         </w:rPr>
       </w:pPr>
       <w:r>
@@ -1497,6 +1498,7 @@
       <w:r>
         <w:rPr>
           <w:rFonts w:ascii="Calibri" w:hAnsi="Calibri" w:cs="Calibri"/>
+          <w:noProof/>
           <w:lang w:val="el-GR"/>
         </w:rPr>
         <w:drawing>
@@ -1542,21 +1544,15 @@
         <w:jc w:val="center"/>
         <w:rPr>
           <w:rFonts w:ascii="Calibri" w:hAnsi="Calibri" w:cs="Calibri"/>
-        </w:rPr>
-      </w:pPr>
-      <w:proofErr w:type="spellStart"/>
-      <w:r>
-        <w:rPr>
-          <w:rFonts w:ascii="Calibri" w:hAnsi="Calibri" w:cs="Calibri"/>
-        </w:rPr>
-        <w:t>Εικόν</w:t>
-      </w:r>
-      <w:proofErr w:type="spellEnd"/>
-      <w:r>
-        <w:rPr>
-          <w:rFonts w:ascii="Calibri" w:hAnsi="Calibri" w:cs="Calibri"/>
-        </w:rPr>
-        <w:t xml:space="preserve">α </w:t>
+          <w:lang w:val="el-GR"/>
+        </w:rPr>
+      </w:pPr>
+      <w:r>
+        <w:rPr>
+          <w:rFonts w:ascii="Calibri" w:hAnsi="Calibri" w:cs="Calibri"/>
+          <w:lang w:val="el-GR"/>
+        </w:rPr>
+        <w:t xml:space="preserve">Εικόνα </w:t>
       </w:r>
       <w:r>
         <w:rPr>
@@ -1567,8 +1563,35 @@
       <w:r>
         <w:rPr>
           <w:rFonts w:ascii="Calibri" w:hAnsi="Calibri" w:cs="Calibri"/>
-        </w:rPr>
-        <w:instrText xml:space="preserve"> SEQ Εικόνα \* ARABIC </w:instrText>
+          <w:lang w:val="el-GR"/>
+        </w:rPr>
+        <w:instrText xml:space="preserve"> </w:instrText>
+      </w:r>
+      <w:r>
+        <w:rPr>
+          <w:rFonts w:ascii="Calibri" w:hAnsi="Calibri" w:cs="Calibri"/>
+        </w:rPr>
+        <w:instrText>SEQ</w:instrText>
+      </w:r>
+      <w:r>
+        <w:rPr>
+          <w:rFonts w:ascii="Calibri" w:hAnsi="Calibri" w:cs="Calibri"/>
+          <w:lang w:val="el-GR"/>
+        </w:rPr>
+        <w:instrText xml:space="preserve"> Εικόνα \* </w:instrText>
+      </w:r>
+      <w:r>
+        <w:rPr>
+          <w:rFonts w:ascii="Calibri" w:hAnsi="Calibri" w:cs="Calibri"/>
+        </w:rPr>
+        <w:instrText>ARABIC</w:instrText>
+      </w:r>
+      <w:r>
+        <w:rPr>
+          <w:rFonts w:ascii="Calibri" w:hAnsi="Calibri" w:cs="Calibri"/>
+          <w:lang w:val="el-GR"/>
+        </w:rPr>
+        <w:instrText xml:space="preserve"> </w:instrText>
       </w:r>
       <w:r>
         <w:rPr>
@@ -1580,6 +1603,7 @@
         <w:rPr>
           <w:rFonts w:ascii="Calibri" w:hAnsi="Calibri" w:cs="Calibri"/>
           <w:noProof/>
+          <w:lang w:val="el-GR"/>
         </w:rPr>
         <w:t>1</w:t>
       </w:r>
@@ -1607,6 +1631,7 @@
       <w:pPr>
         <w:rPr>
           <w:rFonts w:ascii="Calibri" w:hAnsi="Calibri" w:cs="Calibri"/>
+          <w:lang w:val="el-GR"/>
         </w:rPr>
       </w:pPr>
     </w:p>
@@ -1631,16 +1656,7 @@
           <w:bCs/>
           <w:lang w:val="el-GR"/>
         </w:rPr>
-        <w:t>Διαγραφή</w:t>
-      </w:r>
-      <w:r>
-        <w:rPr>
-          <w:rFonts w:ascii="Calibri" w:hAnsi="Calibri" w:cs="Calibri"/>
-          <w:b/>
-          <w:bCs/>
-          <w:lang w:val="el-GR"/>
-        </w:rPr>
-        <w:t xml:space="preserve"> </w:t>
+        <w:t xml:space="preserve">Διαγραφή </w:t>
       </w:r>
       <w:r>
         <w:rPr>
@@ -1716,32 +1732,7 @@
           <w:szCs w:val="22"/>
           <w:lang w:val="el-GR"/>
         </w:rPr>
-        <w:t>Προγραμματιστή</w:t>
-      </w:r>
-      <w:r>
-        <w:rPr>
-          <w:rFonts w:ascii="Calibri" w:eastAsia="Arial" w:hAnsi="Calibri" w:cs="Calibri"/>
-          <w:sz w:val="22"/>
-          <w:szCs w:val="22"/>
-          <w:lang w:val="el-GR"/>
-        </w:rPr>
-        <w:t xml:space="preserve"> </w:t>
-      </w:r>
-      <w:r>
-        <w:rPr>
-          <w:rFonts w:ascii="Calibri" w:eastAsia="Arial" w:hAnsi="Calibri" w:cs="Calibri"/>
-          <w:sz w:val="22"/>
-          <w:szCs w:val="22"/>
-          <w:lang w:val="el-GR"/>
-        </w:rPr>
-        <w:t xml:space="preserve">(Ιδιοκτήτη) </w:t>
-      </w:r>
-      <w:r>
-        <w:rPr>
-          <w:rFonts w:ascii="Calibri" w:hAnsi="Calibri" w:cs="Calibri"/>
-          <w:lang w:val="el-GR"/>
-        </w:rPr>
-        <w:t xml:space="preserve">και τον </w:t>
+        <w:t xml:space="preserve">Προγραμματιστή </w:t>
       </w:r>
       <w:r>
         <w:rPr>
@@ -1752,7 +1743,23 @@
           <w:szCs w:val="22"/>
           <w:lang w:val="el-GR"/>
         </w:rPr>
-        <w:t>Ιδιοκτήτη</w:t>
+        <w:t>(Ιδιοκτήτη)</w:t>
+      </w:r>
+      <w:r>
+        <w:rPr>
+          <w:rFonts w:ascii="Calibri" w:eastAsia="Arial" w:hAnsi="Calibri" w:cs="Calibri"/>
+          <w:sz w:val="22"/>
+          <w:szCs w:val="22"/>
+          <w:lang w:val="el-GR"/>
+        </w:rPr>
+        <w:t xml:space="preserve"> </w:t>
+      </w:r>
+      <w:r>
+        <w:rPr>
+          <w:rFonts w:ascii="Calibri" w:hAnsi="Calibri" w:cs="Calibri"/>
+          <w:lang w:val="el-GR"/>
+        </w:rPr>
+        <w:t xml:space="preserve">και τον </w:t>
       </w:r>
       <w:r>
         <w:rPr>
@@ -1763,7 +1770,7 @@
           <w:szCs w:val="22"/>
           <w:lang w:val="el-GR"/>
         </w:rPr>
-        <w:t xml:space="preserve"> </w:t>
+        <w:t>Ιδιοκτήτη</w:t>
       </w:r>
       <w:r>
         <w:rPr>
@@ -1774,34 +1781,38 @@
           <w:szCs w:val="22"/>
           <w:lang w:val="el-GR"/>
         </w:rPr>
-        <w:t>Οργανισμού</w:t>
-      </w:r>
-      <w:r>
-        <w:rPr>
-          <w:rFonts w:ascii="Calibri" w:hAnsi="Calibri" w:cs="Calibri"/>
-          <w:lang w:val="el-GR"/>
-        </w:rPr>
-        <w:t>.</w:t>
-      </w:r>
-      <w:r>
-        <w:rPr>
-          <w:rFonts w:ascii="Calibri" w:hAnsi="Calibri" w:cs="Calibri"/>
-          <w:lang w:val="el-GR"/>
-        </w:rPr>
         <w:t xml:space="preserve"> </w:t>
       </w:r>
       <w:r>
         <w:rPr>
-          <w:rFonts w:ascii="Calibri" w:hAnsi="Calibri" w:cs="Calibri"/>
-          <w:lang w:val="el-GR"/>
-        </w:rPr>
-        <w:t xml:space="preserve">Για τους σκοπούς του συγκεκριμένου Διαγράμματος προσθέσαμε ως Χειριστή τον γενικό όρο </w:t>
-      </w:r>
-      <w:r>
-        <w:rPr>
-          <w:rFonts w:ascii="Calibri" w:hAnsi="Calibri" w:cs="Calibri"/>
+          <w:rFonts w:ascii="Calibri" w:eastAsia="Arial" w:hAnsi="Calibri" w:cs="Calibri"/>
           <w:i/>
           <w:iCs/>
+          <w:sz w:val="22"/>
+          <w:szCs w:val="22"/>
+          <w:lang w:val="el-GR"/>
+        </w:rPr>
+        <w:t>Οργανισμού</w:t>
+      </w:r>
+      <w:r>
+        <w:rPr>
+          <w:rFonts w:ascii="Calibri" w:hAnsi="Calibri" w:cs="Calibri"/>
+          <w:lang w:val="el-GR"/>
+        </w:rPr>
+        <w:t>.</w:t>
+      </w:r>
+      <w:r>
+        <w:rPr>
+          <w:rFonts w:ascii="Calibri" w:hAnsi="Calibri" w:cs="Calibri"/>
+          <w:lang w:val="el-GR"/>
+        </w:rPr>
+        <w:t xml:space="preserve"> Για τους σκοπούς του συγκεκριμένου Διαγράμματος προσθέσαμε ως Χειριστή τον γενικό όρο </w:t>
+      </w:r>
+      <w:r>
+        <w:rPr>
+          <w:rFonts w:ascii="Calibri" w:hAnsi="Calibri" w:cs="Calibri"/>
+          <w:i/>
+          <w:iCs/>
           <w:lang w:val="el-GR"/>
         </w:rPr>
         <w:t>Χρήστης</w:t>
@@ -1825,13 +1836,13 @@
       <w:r>
         <w:rPr>
           <w:rFonts w:ascii="Calibri" w:hAnsi="Calibri" w:cs="Calibri"/>
-          <w:lang w:val="el-GR"/>
+          <w:noProof/>
         </w:rPr>
         <w:drawing>
-          <wp:inline distT="0" distB="0" distL="0" distR="0" wp14:anchorId="5A53B9BE" wp14:editId="041CEC0C">
-            <wp:extent cx="5943600" cy="4063365"/>
+          <wp:inline distT="0" distB="0" distL="0" distR="0" wp14:anchorId="502A9439" wp14:editId="1D22BD12">
+            <wp:extent cx="5943600" cy="3912235"/>
             <wp:effectExtent l="0" t="0" r="0" b="0"/>
-            <wp:docPr id="1667953006" name="Picture 1"/>
+            <wp:docPr id="1149814619" name="Picture 1"/>
             <wp:cNvGraphicFramePr>
               <a:graphicFrameLocks xmlns:a="http://schemas.openxmlformats.org/drawingml/2006/main" noChangeAspect="1"/>
             </wp:cNvGraphicFramePr>
@@ -1839,7 +1850,7 @@
               <a:graphicData uri="http://schemas.openxmlformats.org/drawingml/2006/picture">
                 <pic:pic xmlns:pic="http://schemas.openxmlformats.org/drawingml/2006/picture">
                   <pic:nvPicPr>
-                    <pic:cNvPr id="1667953006" name=""/>
+                    <pic:cNvPr id="1149814619" name=""/>
                     <pic:cNvPicPr/>
                   </pic:nvPicPr>
                   <pic:blipFill>
@@ -1851,7 +1862,7 @@
                   <pic:spPr>
                     <a:xfrm>
                       <a:off x="0" y="0"/>
-                      <a:ext cx="5943600" cy="4063365"/>
+                      <a:ext cx="5943600" cy="3912235"/>
                     </a:xfrm>
                     <a:prstGeom prst="rect">
                       <a:avLst/>
@@ -1873,19 +1884,12 @@
           <w:lang w:val="el-GR"/>
         </w:rPr>
       </w:pPr>
-      <w:proofErr w:type="spellStart"/>
-      <w:r>
-        <w:rPr>
-          <w:rFonts w:ascii="Calibri" w:hAnsi="Calibri" w:cs="Calibri"/>
-        </w:rPr>
-        <w:t>Εικόν</w:t>
-      </w:r>
-      <w:proofErr w:type="spellEnd"/>
-      <w:r>
-        <w:rPr>
-          <w:rFonts w:ascii="Calibri" w:hAnsi="Calibri" w:cs="Calibri"/>
-        </w:rPr>
-        <w:t xml:space="preserve">α </w:t>
+      <w:r>
+        <w:rPr>
+          <w:rFonts w:ascii="Calibri" w:hAnsi="Calibri" w:cs="Calibri"/>
+          <w:lang w:val="el-GR"/>
+        </w:rPr>
+        <w:t xml:space="preserve">Εικόνα </w:t>
       </w:r>
       <w:r>
         <w:rPr>
@@ -1896,8 +1900,35 @@
       <w:r>
         <w:rPr>
           <w:rFonts w:ascii="Calibri" w:hAnsi="Calibri" w:cs="Calibri"/>
-        </w:rPr>
-        <w:instrText xml:space="preserve"> SEQ Εικόνα \* ARABIC </w:instrText>
+          <w:lang w:val="el-GR"/>
+        </w:rPr>
+        <w:instrText xml:space="preserve"> </w:instrText>
+      </w:r>
+      <w:r>
+        <w:rPr>
+          <w:rFonts w:ascii="Calibri" w:hAnsi="Calibri" w:cs="Calibri"/>
+        </w:rPr>
+        <w:instrText>SEQ</w:instrText>
+      </w:r>
+      <w:r>
+        <w:rPr>
+          <w:rFonts w:ascii="Calibri" w:hAnsi="Calibri" w:cs="Calibri"/>
+          <w:lang w:val="el-GR"/>
+        </w:rPr>
+        <w:instrText xml:space="preserve"> Εικόνα \* </w:instrText>
+      </w:r>
+      <w:r>
+        <w:rPr>
+          <w:rFonts w:ascii="Calibri" w:hAnsi="Calibri" w:cs="Calibri"/>
+        </w:rPr>
+        <w:instrText>ARABIC</w:instrText>
+      </w:r>
+      <w:r>
+        <w:rPr>
+          <w:rFonts w:ascii="Calibri" w:hAnsi="Calibri" w:cs="Calibri"/>
+          <w:lang w:val="el-GR"/>
+        </w:rPr>
+        <w:instrText xml:space="preserve"> </w:instrText>
       </w:r>
       <w:r>
         <w:rPr>
@@ -1909,6 +1940,7 @@
         <w:rPr>
           <w:rFonts w:ascii="Calibri" w:hAnsi="Calibri" w:cs="Calibri"/>
           <w:noProof/>
+          <w:lang w:val="el-GR"/>
         </w:rPr>
         <w:t>2</w:t>
       </w:r>
@@ -2042,6 +2074,7 @@
         <w:jc w:val="both"/>
         <w:rPr>
           <w:rFonts w:ascii="Calibri" w:hAnsi="Calibri" w:cs="Calibri"/>
+          <w:lang w:val="el-GR"/>
         </w:rPr>
       </w:pPr>
       <w:r>
@@ -2100,7 +2133,7 @@
           <w:szCs w:val="22"/>
           <w:lang w:val="el-GR"/>
         </w:rPr>
-        <w:t>Προγραμματιστή</w:t>
+        <w:t>Προγραμματιστή (Ιδιοκτήτη)</w:t>
       </w:r>
       <w:r>
         <w:rPr>
@@ -2159,6 +2192,7 @@
       </w:pPr>
       <w:r>
         <w:rPr>
+          <w:noProof/>
           <w:lang w:val="el-GR"/>
         </w:rPr>
         <w:drawing>
@@ -2204,21 +2238,15 @@
         <w:jc w:val="center"/>
         <w:rPr>
           <w:rFonts w:ascii="Calibri" w:hAnsi="Calibri" w:cs="Calibri"/>
-        </w:rPr>
-      </w:pPr>
-      <w:proofErr w:type="spellStart"/>
-      <w:r>
-        <w:rPr>
-          <w:rFonts w:ascii="Calibri" w:hAnsi="Calibri" w:cs="Calibri"/>
-        </w:rPr>
-        <w:t>Εικόν</w:t>
-      </w:r>
-      <w:proofErr w:type="spellEnd"/>
-      <w:r>
-        <w:rPr>
-          <w:rFonts w:ascii="Calibri" w:hAnsi="Calibri" w:cs="Calibri"/>
-        </w:rPr>
-        <w:t xml:space="preserve">α </w:t>
+          <w:lang w:val="el-GR"/>
+        </w:rPr>
+      </w:pPr>
+      <w:r>
+        <w:rPr>
+          <w:rFonts w:ascii="Calibri" w:hAnsi="Calibri" w:cs="Calibri"/>
+          <w:lang w:val="el-GR"/>
+        </w:rPr>
+        <w:t xml:space="preserve">Εικόνα </w:t>
       </w:r>
       <w:r>
         <w:rPr>
@@ -2229,8 +2257,35 @@
       <w:r>
         <w:rPr>
           <w:rFonts w:ascii="Calibri" w:hAnsi="Calibri" w:cs="Calibri"/>
-        </w:rPr>
-        <w:instrText xml:space="preserve"> SEQ Εικόνα \* ARABIC </w:instrText>
+          <w:lang w:val="el-GR"/>
+        </w:rPr>
+        <w:instrText xml:space="preserve"> </w:instrText>
+      </w:r>
+      <w:r>
+        <w:rPr>
+          <w:rFonts w:ascii="Calibri" w:hAnsi="Calibri" w:cs="Calibri"/>
+        </w:rPr>
+        <w:instrText>SEQ</w:instrText>
+      </w:r>
+      <w:r>
+        <w:rPr>
+          <w:rFonts w:ascii="Calibri" w:hAnsi="Calibri" w:cs="Calibri"/>
+          <w:lang w:val="el-GR"/>
+        </w:rPr>
+        <w:instrText xml:space="preserve"> Εικόνα \* </w:instrText>
+      </w:r>
+      <w:r>
+        <w:rPr>
+          <w:rFonts w:ascii="Calibri" w:hAnsi="Calibri" w:cs="Calibri"/>
+        </w:rPr>
+        <w:instrText>ARABIC</w:instrText>
+      </w:r>
+      <w:r>
+        <w:rPr>
+          <w:rFonts w:ascii="Calibri" w:hAnsi="Calibri" w:cs="Calibri"/>
+          <w:lang w:val="el-GR"/>
+        </w:rPr>
+        <w:instrText xml:space="preserve"> </w:instrText>
       </w:r>
       <w:r>
         <w:rPr>
@@ -2242,6 +2297,7 @@
         <w:rPr>
           <w:rFonts w:ascii="Calibri" w:hAnsi="Calibri" w:cs="Calibri"/>
           <w:noProof/>
+          <w:lang w:val="el-GR"/>
         </w:rPr>
         <w:t>3</w:t>
       </w:r>
@@ -2262,12 +2318,36 @@
         <w:rPr>
           <w:rFonts w:ascii="Calibri" w:hAnsi="Calibri" w:cs="Calibri"/>
         </w:rPr>
-        <w:t>Use Case</w:t>
-      </w:r>
-    </w:p>
-    <w:p/>
-    <w:p/>
-    <w:p/>
+        <w:t>Use</w:t>
+      </w:r>
+      <w:r>
+        <w:rPr>
+          <w:rFonts w:ascii="Calibri" w:hAnsi="Calibri" w:cs="Calibri"/>
+          <w:lang w:val="el-GR"/>
+        </w:rPr>
+        <w:t xml:space="preserve"> </w:t>
+      </w:r>
+      <w:r>
+        <w:rPr>
+          <w:rFonts w:ascii="Calibri" w:hAnsi="Calibri" w:cs="Calibri"/>
+        </w:rPr>
+        <w:t>Case</w:t>
+      </w:r>
+    </w:p>
+    <w:p>
+      <w:pPr>
+        <w:rPr>
+          <w:lang w:val="el-GR"/>
+        </w:rPr>
+      </w:pPr>
+    </w:p>
+    <w:p>
+      <w:pPr>
+        <w:rPr>
+          <w:lang w:val="el-GR"/>
+        </w:rPr>
+      </w:pPr>
+    </w:p>
     <w:p>
       <w:pPr>
         <w:pBdr>
@@ -2404,16 +2484,7 @@
           <w:szCs w:val="22"/>
           <w:lang w:val="el-GR"/>
         </w:rPr>
-        <w:t>Προγραμματιστή</w:t>
-      </w:r>
-      <w:r>
-        <w:rPr>
-          <w:rFonts w:ascii="Calibri" w:eastAsia="Arial" w:hAnsi="Calibri" w:cs="Calibri"/>
-          <w:sz w:val="22"/>
-          <w:szCs w:val="22"/>
-          <w:lang w:val="el-GR"/>
-        </w:rPr>
-        <w:t xml:space="preserve"> </w:t>
+        <w:t>Προγραμματιστή (Ιδιοκτήτη)</w:t>
       </w:r>
       <w:r>
         <w:rPr>
@@ -2497,13 +2568,13 @@
       <w:r>
         <w:rPr>
           <w:rFonts w:ascii="Calibri" w:hAnsi="Calibri" w:cs="Calibri"/>
-          <w:lang w:val="el-GR"/>
+          <w:noProof/>
         </w:rPr>
         <w:drawing>
-          <wp:inline distT="0" distB="0" distL="0" distR="0" wp14:anchorId="24E7FF67" wp14:editId="5160A95B">
-            <wp:extent cx="5943600" cy="3884295"/>
-            <wp:effectExtent l="0" t="0" r="0" b="1905"/>
-            <wp:docPr id="488142515" name="Picture 1"/>
+          <wp:inline distT="0" distB="0" distL="0" distR="0" wp14:anchorId="722CD786" wp14:editId="3F41B79D">
+            <wp:extent cx="5943600" cy="3881755"/>
+            <wp:effectExtent l="0" t="0" r="0" b="4445"/>
+            <wp:docPr id="1885953238" name="Picture 1"/>
             <wp:cNvGraphicFramePr>
               <a:graphicFrameLocks xmlns:a="http://schemas.openxmlformats.org/drawingml/2006/main" noChangeAspect="1"/>
             </wp:cNvGraphicFramePr>
@@ -2511,7 +2582,7 @@
               <a:graphicData uri="http://schemas.openxmlformats.org/drawingml/2006/picture">
                 <pic:pic xmlns:pic="http://schemas.openxmlformats.org/drawingml/2006/picture">
                   <pic:nvPicPr>
-                    <pic:cNvPr id="488142515" name=""/>
+                    <pic:cNvPr id="1885953238" name=""/>
                     <pic:cNvPicPr/>
                   </pic:nvPicPr>
                   <pic:blipFill>
@@ -2523,7 +2594,7 @@
                   <pic:spPr>
                     <a:xfrm>
                       <a:off x="0" y="0"/>
-                      <a:ext cx="5943600" cy="3884295"/>
+                      <a:ext cx="5943600" cy="3881755"/>
                     </a:xfrm>
                     <a:prstGeom prst="rect">
                       <a:avLst/>
@@ -2545,19 +2616,12 @@
           <w:lang w:val="el-GR"/>
         </w:rPr>
       </w:pPr>
-      <w:proofErr w:type="spellStart"/>
-      <w:r>
-        <w:rPr>
-          <w:rFonts w:ascii="Calibri" w:hAnsi="Calibri" w:cs="Calibri"/>
-        </w:rPr>
-        <w:t>Εικόν</w:t>
-      </w:r>
-      <w:proofErr w:type="spellEnd"/>
-      <w:r>
-        <w:rPr>
-          <w:rFonts w:ascii="Calibri" w:hAnsi="Calibri" w:cs="Calibri"/>
-        </w:rPr>
-        <w:t xml:space="preserve">α </w:t>
+      <w:r>
+        <w:rPr>
+          <w:rFonts w:ascii="Calibri" w:hAnsi="Calibri" w:cs="Calibri"/>
+          <w:lang w:val="el-GR"/>
+        </w:rPr>
+        <w:t xml:space="preserve">Εικόνα </w:t>
       </w:r>
       <w:r>
         <w:rPr>
@@ -2568,8 +2632,35 @@
       <w:r>
         <w:rPr>
           <w:rFonts w:ascii="Calibri" w:hAnsi="Calibri" w:cs="Calibri"/>
-        </w:rPr>
-        <w:instrText xml:space="preserve"> SEQ Εικόνα \* ARABIC </w:instrText>
+          <w:lang w:val="el-GR"/>
+        </w:rPr>
+        <w:instrText xml:space="preserve"> </w:instrText>
+      </w:r>
+      <w:r>
+        <w:rPr>
+          <w:rFonts w:ascii="Calibri" w:hAnsi="Calibri" w:cs="Calibri"/>
+        </w:rPr>
+        <w:instrText>SEQ</w:instrText>
+      </w:r>
+      <w:r>
+        <w:rPr>
+          <w:rFonts w:ascii="Calibri" w:hAnsi="Calibri" w:cs="Calibri"/>
+          <w:lang w:val="el-GR"/>
+        </w:rPr>
+        <w:instrText xml:space="preserve"> Εικόνα \* </w:instrText>
+      </w:r>
+      <w:r>
+        <w:rPr>
+          <w:rFonts w:ascii="Calibri" w:hAnsi="Calibri" w:cs="Calibri"/>
+        </w:rPr>
+        <w:instrText>ARABIC</w:instrText>
+      </w:r>
+      <w:r>
+        <w:rPr>
+          <w:rFonts w:ascii="Calibri" w:hAnsi="Calibri" w:cs="Calibri"/>
+          <w:lang w:val="el-GR"/>
+        </w:rPr>
+        <w:instrText xml:space="preserve"> </w:instrText>
       </w:r>
       <w:r>
         <w:rPr>
@@ -2581,6 +2672,7 @@
         <w:rPr>
           <w:rFonts w:ascii="Calibri" w:hAnsi="Calibri" w:cs="Calibri"/>
           <w:noProof/>
+          <w:lang w:val="el-GR"/>
         </w:rPr>
         <w:t>4</w:t>
       </w:r>
@@ -2601,244 +2693,1558 @@
         <w:rPr>
           <w:rFonts w:ascii="Calibri" w:hAnsi="Calibri" w:cs="Calibri"/>
         </w:rPr>
-        <w:t>Use Case</w:t>
-      </w:r>
-    </w:p>
-    <w:p>
-      <w:pPr>
-        <w:rPr>
-          <w:rFonts w:ascii="Calibri" w:hAnsi="Calibri" w:cs="Calibri"/>
-        </w:rPr>
-      </w:pPr>
-    </w:p>
-    <w:p>
-      <w:pPr>
-        <w:rPr>
-          <w:rFonts w:ascii="Calibri" w:hAnsi="Calibri" w:cs="Calibri"/>
-        </w:rPr>
-      </w:pPr>
-    </w:p>
-    <w:p>
-      <w:pPr>
-        <w:rPr>
-          <w:rFonts w:ascii="Calibri" w:hAnsi="Calibri" w:cs="Calibri"/>
-        </w:rPr>
-      </w:pPr>
-    </w:p>
-    <w:p>
-      <w:pPr>
-        <w:rPr>
-          <w:rFonts w:ascii="Calibri" w:hAnsi="Calibri" w:cs="Calibri"/>
-        </w:rPr>
-      </w:pPr>
-    </w:p>
-    <w:p>
-      <w:pPr>
-        <w:rPr>
-          <w:rFonts w:ascii="Calibri" w:hAnsi="Calibri" w:cs="Calibri"/>
-        </w:rPr>
-      </w:pPr>
-    </w:p>
-    <w:p>
-      <w:pPr>
-        <w:rPr>
-          <w:rFonts w:ascii="Calibri" w:hAnsi="Calibri" w:cs="Calibri"/>
-        </w:rPr>
-      </w:pPr>
-    </w:p>
-    <w:p>
-      <w:pPr>
-        <w:rPr>
-          <w:rFonts w:ascii="Calibri" w:hAnsi="Calibri" w:cs="Calibri"/>
-        </w:rPr>
-      </w:pPr>
-    </w:p>
-    <w:p>
-      <w:pPr>
-        <w:rPr>
-          <w:rFonts w:ascii="Calibri" w:hAnsi="Calibri" w:cs="Calibri"/>
-        </w:rPr>
-      </w:pPr>
-    </w:p>
-    <w:p>
-      <w:pPr>
-        <w:rPr>
-          <w:rFonts w:ascii="Calibri" w:hAnsi="Calibri" w:cs="Calibri"/>
-        </w:rPr>
-      </w:pPr>
-    </w:p>
-    <w:p>
-      <w:pPr>
-        <w:rPr>
-          <w:rFonts w:ascii="Calibri" w:hAnsi="Calibri" w:cs="Calibri"/>
-        </w:rPr>
-      </w:pPr>
-    </w:p>
-    <w:p>
-      <w:pPr>
-        <w:rPr>
-          <w:rFonts w:ascii="Calibri" w:hAnsi="Calibri" w:cs="Calibri"/>
-        </w:rPr>
-      </w:pPr>
-    </w:p>
-    <w:p>
-      <w:pPr>
-        <w:rPr>
-          <w:rFonts w:ascii="Calibri" w:hAnsi="Calibri" w:cs="Calibri"/>
-        </w:rPr>
-      </w:pPr>
-    </w:p>
-    <w:p>
-      <w:pPr>
-        <w:rPr>
-          <w:rFonts w:ascii="Calibri" w:hAnsi="Calibri" w:cs="Calibri"/>
-        </w:rPr>
-      </w:pPr>
-    </w:p>
-    <w:p>
-      <w:pPr>
-        <w:rPr>
-          <w:rFonts w:ascii="Calibri" w:hAnsi="Calibri" w:cs="Calibri"/>
-        </w:rPr>
-      </w:pPr>
-    </w:p>
-    <w:p>
-      <w:pPr>
-        <w:rPr>
-          <w:rFonts w:ascii="Calibri" w:hAnsi="Calibri" w:cs="Calibri"/>
-        </w:rPr>
-      </w:pPr>
-    </w:p>
-    <w:p>
-      <w:pPr>
-        <w:rPr>
-          <w:rFonts w:ascii="Calibri" w:hAnsi="Calibri" w:cs="Calibri"/>
-        </w:rPr>
-      </w:pPr>
-    </w:p>
-    <w:p>
-      <w:pPr>
-        <w:rPr>
-          <w:rFonts w:ascii="Calibri" w:hAnsi="Calibri" w:cs="Calibri"/>
-        </w:rPr>
-      </w:pPr>
-    </w:p>
-    <w:p>
-      <w:pPr>
-        <w:rPr>
-          <w:rFonts w:ascii="Calibri" w:hAnsi="Calibri" w:cs="Calibri"/>
-        </w:rPr>
-      </w:pPr>
-    </w:p>
-    <w:p>
-      <w:pPr>
-        <w:rPr>
-          <w:rFonts w:ascii="Calibri" w:hAnsi="Calibri" w:cs="Calibri"/>
-        </w:rPr>
-      </w:pPr>
-    </w:p>
-    <w:p>
-      <w:pPr>
-        <w:rPr>
-          <w:rFonts w:ascii="Calibri" w:hAnsi="Calibri" w:cs="Calibri"/>
-        </w:rPr>
-      </w:pPr>
-    </w:p>
-    <w:p>
-      <w:pPr>
-        <w:rPr>
-          <w:rFonts w:ascii="Calibri" w:hAnsi="Calibri" w:cs="Calibri"/>
-        </w:rPr>
-      </w:pPr>
-    </w:p>
-    <w:p>
-      <w:pPr>
-        <w:rPr>
-          <w:rFonts w:ascii="Calibri" w:hAnsi="Calibri" w:cs="Calibri"/>
-        </w:rPr>
-      </w:pPr>
-    </w:p>
-    <w:p>
-      <w:pPr>
-        <w:rPr>
-          <w:rFonts w:ascii="Calibri" w:hAnsi="Calibri" w:cs="Calibri"/>
-        </w:rPr>
-      </w:pPr>
-    </w:p>
-    <w:p>
-      <w:pPr>
-        <w:rPr>
-          <w:rFonts w:ascii="Calibri" w:hAnsi="Calibri" w:cs="Calibri"/>
-        </w:rPr>
-      </w:pPr>
-    </w:p>
-    <w:p>
-      <w:pPr>
-        <w:rPr>
-          <w:rFonts w:ascii="Calibri" w:hAnsi="Calibri" w:cs="Calibri"/>
-        </w:rPr>
-      </w:pPr>
-    </w:p>
-    <w:p>
-      <w:pPr>
-        <w:rPr>
-          <w:rFonts w:ascii="Calibri" w:hAnsi="Calibri" w:cs="Calibri"/>
-        </w:rPr>
-      </w:pPr>
-    </w:p>
-    <w:p>
-      <w:pPr>
-        <w:rPr>
-          <w:rFonts w:ascii="Calibri" w:hAnsi="Calibri" w:cs="Calibri"/>
-        </w:rPr>
-      </w:pPr>
-    </w:p>
-    <w:p>
-      <w:pPr>
-        <w:rPr>
-          <w:rFonts w:ascii="Calibri" w:hAnsi="Calibri" w:cs="Calibri"/>
-        </w:rPr>
-      </w:pPr>
-    </w:p>
-    <w:p>
-      <w:pPr>
-        <w:rPr>
-          <w:rFonts w:ascii="Calibri" w:hAnsi="Calibri" w:cs="Calibri"/>
-        </w:rPr>
-      </w:pPr>
-    </w:p>
-    <w:p>
-      <w:pPr>
-        <w:rPr>
-          <w:rFonts w:ascii="Calibri" w:hAnsi="Calibri" w:cs="Calibri"/>
-        </w:rPr>
-      </w:pPr>
-    </w:p>
-    <w:p>
-      <w:pPr>
-        <w:rPr>
-          <w:rFonts w:ascii="Calibri" w:hAnsi="Calibri" w:cs="Calibri"/>
-        </w:rPr>
-      </w:pPr>
-    </w:p>
-    <w:p>
-      <w:pPr>
-        <w:rPr>
-          <w:rFonts w:ascii="Calibri" w:hAnsi="Calibri" w:cs="Calibri"/>
-        </w:rPr>
-      </w:pPr>
-    </w:p>
-    <w:p>
-      <w:pPr>
-        <w:rPr>
-          <w:rFonts w:ascii="Calibri" w:hAnsi="Calibri" w:cs="Calibri"/>
-        </w:rPr>
-      </w:pPr>
-    </w:p>
-    <w:p>
-      <w:pPr>
-        <w:rPr>
-          <w:rFonts w:ascii="Calibri" w:hAnsi="Calibri" w:cs="Calibri"/>
+        <w:t>Use</w:t>
+      </w:r>
+      <w:r>
+        <w:rPr>
+          <w:rFonts w:ascii="Calibri" w:hAnsi="Calibri" w:cs="Calibri"/>
+          <w:lang w:val="el-GR"/>
+        </w:rPr>
+        <w:t xml:space="preserve"> </w:t>
+      </w:r>
+      <w:r>
+        <w:rPr>
+          <w:rFonts w:ascii="Calibri" w:hAnsi="Calibri" w:cs="Calibri"/>
+        </w:rPr>
+        <w:t>Case</w:t>
+      </w:r>
+    </w:p>
+    <w:p>
+      <w:pPr>
+        <w:rPr>
+          <w:rFonts w:ascii="Calibri" w:hAnsi="Calibri" w:cs="Calibri"/>
+          <w:lang w:val="el-GR"/>
+        </w:rPr>
+      </w:pPr>
+    </w:p>
+    <w:p>
+      <w:pPr>
+        <w:rPr>
+          <w:rFonts w:ascii="Calibri" w:hAnsi="Calibri" w:cs="Calibri"/>
+          <w:lang w:val="el-GR"/>
+        </w:rPr>
+      </w:pPr>
+    </w:p>
+    <w:p>
+      <w:pPr>
+        <w:rPr>
+          <w:rFonts w:ascii="Calibri" w:hAnsi="Calibri" w:cs="Calibri"/>
+          <w:lang w:val="el-GR"/>
+        </w:rPr>
+      </w:pPr>
+    </w:p>
+    <w:p>
+      <w:pPr>
+        <w:rPr>
+          <w:rFonts w:ascii="Calibri" w:hAnsi="Calibri" w:cs="Calibri"/>
+          <w:lang w:val="el-GR"/>
+        </w:rPr>
+      </w:pPr>
+    </w:p>
+    <w:p>
+      <w:pPr>
+        <w:rPr>
+          <w:rFonts w:ascii="Calibri" w:hAnsi="Calibri" w:cs="Calibri"/>
+          <w:lang w:val="el-GR"/>
+        </w:rPr>
+      </w:pPr>
+    </w:p>
+    <w:p>
+      <w:pPr>
+        <w:rPr>
+          <w:rFonts w:ascii="Calibri" w:hAnsi="Calibri" w:cs="Calibri"/>
+          <w:lang w:val="el-GR"/>
+        </w:rPr>
+      </w:pPr>
+    </w:p>
+    <w:p>
+      <w:pPr>
+        <w:rPr>
+          <w:rFonts w:ascii="Calibri" w:hAnsi="Calibri" w:cs="Calibri"/>
+          <w:lang w:val="el-GR"/>
+        </w:rPr>
+      </w:pPr>
+    </w:p>
+    <w:p>
+      <w:pPr>
+        <w:rPr>
+          <w:rFonts w:ascii="Calibri" w:hAnsi="Calibri" w:cs="Calibri"/>
+          <w:lang w:val="el-GR"/>
+        </w:rPr>
+      </w:pPr>
+    </w:p>
+    <w:p>
+      <w:pPr>
+        <w:pBdr>
+          <w:top w:val="single" w:sz="4" w:space="1" w:color="auto"/>
+          <w:bottom w:val="single" w:sz="4" w:space="1" w:color="auto"/>
+        </w:pBdr>
+        <w:jc w:val="center"/>
+        <w:rPr>
+          <w:rFonts w:ascii="Calibri" w:hAnsi="Calibri" w:cs="Calibri"/>
+          <w:b/>
+          <w:bCs/>
+          <w:lang w:val="el-GR"/>
+        </w:rPr>
+      </w:pPr>
+      <w:r>
+        <w:rPr>
+          <w:rFonts w:ascii="Calibri" w:hAnsi="Calibri" w:cs="Calibri"/>
+          <w:b/>
+          <w:bCs/>
+          <w:lang w:val="el-GR"/>
+        </w:rPr>
+        <w:t>Διαγραφή</w:t>
+      </w:r>
+      <w:r>
+        <w:rPr>
+          <w:rFonts w:ascii="Calibri" w:hAnsi="Calibri" w:cs="Calibri"/>
+          <w:b/>
+          <w:bCs/>
+          <w:lang w:val="el-GR"/>
+        </w:rPr>
+        <w:t xml:space="preserve"> </w:t>
+      </w:r>
+      <w:r>
+        <w:rPr>
+          <w:rFonts w:ascii="Calibri" w:hAnsi="Calibri" w:cs="Calibri"/>
+          <w:b/>
+          <w:bCs/>
+        </w:rPr>
+        <w:t>Use</w:t>
+      </w:r>
+      <w:r>
+        <w:rPr>
+          <w:rFonts w:ascii="Calibri" w:hAnsi="Calibri" w:cs="Calibri"/>
+          <w:b/>
+          <w:bCs/>
+          <w:lang w:val="el-GR"/>
+        </w:rPr>
+        <w:t xml:space="preserve"> </w:t>
+      </w:r>
+      <w:r>
+        <w:rPr>
+          <w:rFonts w:ascii="Calibri" w:hAnsi="Calibri" w:cs="Calibri"/>
+          <w:b/>
+          <w:bCs/>
+        </w:rPr>
+        <w:t>Case</w:t>
+      </w:r>
+    </w:p>
+    <w:p>
+      <w:pPr>
+        <w:jc w:val="both"/>
+        <w:rPr>
+          <w:rFonts w:ascii="Calibri" w:hAnsi="Calibri" w:cs="Calibri"/>
+          <w:lang w:val="el-GR"/>
+        </w:rPr>
+      </w:pPr>
+      <w:r>
+        <w:rPr>
+          <w:rFonts w:ascii="Calibri" w:hAnsi="Calibri" w:cs="Calibri"/>
+          <w:lang w:val="el-GR"/>
+        </w:rPr>
+        <w:t xml:space="preserve">Στην εικόνα </w:t>
+      </w:r>
+      <w:r>
+        <w:rPr>
+          <w:rFonts w:ascii="Calibri" w:hAnsi="Calibri" w:cs="Calibri"/>
+          <w:lang w:val="el-GR"/>
+        </w:rPr>
+        <w:t>5</w:t>
+      </w:r>
+      <w:r>
+        <w:rPr>
+          <w:rFonts w:ascii="Calibri" w:hAnsi="Calibri" w:cs="Calibri"/>
+          <w:lang w:val="el-GR"/>
+        </w:rPr>
+        <w:t>, παρουσιάζουμε το Διάγραμμα Ευρωστίας της Περίπτωσης Χρήσης «</w:t>
+      </w:r>
+      <w:r>
+        <w:rPr>
+          <w:rFonts w:ascii="Calibri" w:hAnsi="Calibri" w:cs="Calibri"/>
+          <w:lang w:val="el-GR"/>
+        </w:rPr>
+        <w:t>Διαγραφή</w:t>
+      </w:r>
+      <w:r>
+        <w:rPr>
+          <w:rFonts w:ascii="Calibri" w:hAnsi="Calibri" w:cs="Calibri"/>
+          <w:lang w:val="el-GR"/>
+        </w:rPr>
+        <w:t xml:space="preserve"> </w:t>
+      </w:r>
+      <w:r>
+        <w:rPr>
+          <w:rFonts w:ascii="Calibri" w:hAnsi="Calibri" w:cs="Calibri"/>
+        </w:rPr>
+        <w:t>Use</w:t>
+      </w:r>
+      <w:r>
+        <w:rPr>
+          <w:rFonts w:ascii="Calibri" w:hAnsi="Calibri" w:cs="Calibri"/>
+          <w:lang w:val="el-GR"/>
+        </w:rPr>
+        <w:t xml:space="preserve"> </w:t>
+      </w:r>
+      <w:r>
+        <w:rPr>
+          <w:rFonts w:ascii="Calibri" w:hAnsi="Calibri" w:cs="Calibri"/>
+        </w:rPr>
+        <w:t>Case</w:t>
+      </w:r>
+      <w:r>
+        <w:rPr>
+          <w:rFonts w:ascii="Calibri" w:hAnsi="Calibri" w:cs="Calibri"/>
+          <w:lang w:val="el-GR"/>
+        </w:rPr>
+        <w:t xml:space="preserve">». Ως Χρήστη θεωρούμε και τον </w:t>
+      </w:r>
+      <w:r>
+        <w:rPr>
+          <w:rFonts w:ascii="Calibri" w:eastAsia="Arial" w:hAnsi="Calibri" w:cs="Calibri"/>
+          <w:i/>
+          <w:iCs/>
+          <w:sz w:val="22"/>
+          <w:szCs w:val="22"/>
+          <w:lang w:val="el-GR"/>
+        </w:rPr>
+        <w:t>Προγραμματιστή (Ιδιοκτήτη)</w:t>
+      </w:r>
+      <w:r>
+        <w:rPr>
+          <w:rFonts w:ascii="Calibri" w:eastAsia="Arial" w:hAnsi="Calibri" w:cs="Calibri"/>
+          <w:sz w:val="22"/>
+          <w:szCs w:val="22"/>
+          <w:lang w:val="el-GR"/>
+        </w:rPr>
+        <w:t xml:space="preserve"> </w:t>
+      </w:r>
+      <w:r>
+        <w:rPr>
+          <w:rFonts w:ascii="Calibri" w:hAnsi="Calibri" w:cs="Calibri"/>
+          <w:lang w:val="el-GR"/>
+        </w:rPr>
+        <w:t xml:space="preserve">και τον </w:t>
+      </w:r>
+      <w:r>
+        <w:rPr>
+          <w:rFonts w:ascii="Calibri" w:eastAsia="Arial" w:hAnsi="Calibri" w:cs="Calibri"/>
+          <w:i/>
+          <w:iCs/>
+          <w:sz w:val="22"/>
+          <w:szCs w:val="22"/>
+          <w:lang w:val="el-GR"/>
+        </w:rPr>
+        <w:t>Ιδιοκτήτη Οργανισμού</w:t>
+      </w:r>
+      <w:r>
+        <w:rPr>
+          <w:rFonts w:ascii="Calibri" w:hAnsi="Calibri" w:cs="Calibri"/>
+          <w:lang w:val="el-GR"/>
+        </w:rPr>
+        <w:t xml:space="preserve">. Για τους σκοπούς του συγκεκριμένου Διαγράμματος προσθέσαμε ως Χειριστή τον γενικό όρο </w:t>
+      </w:r>
+      <w:r>
+        <w:rPr>
+          <w:rFonts w:ascii="Calibri" w:hAnsi="Calibri" w:cs="Calibri"/>
+          <w:i/>
+          <w:iCs/>
+          <w:lang w:val="el-GR"/>
+        </w:rPr>
+        <w:t>Χρήστης</w:t>
+      </w:r>
+      <w:r>
+        <w:rPr>
+          <w:rFonts w:ascii="Calibri" w:hAnsi="Calibri" w:cs="Calibri"/>
+          <w:lang w:val="el-GR"/>
+        </w:rPr>
+        <w:t>.</w:t>
+      </w:r>
+    </w:p>
+    <w:p>
+      <w:pPr>
+        <w:keepNext/>
+        <w:jc w:val="center"/>
+      </w:pPr>
+      <w:r>
+        <w:drawing>
+          <wp:inline distT="0" distB="0" distL="0" distR="0" wp14:anchorId="63269EFA" wp14:editId="60BAC4E5">
+            <wp:extent cx="5943600" cy="3005455"/>
+            <wp:effectExtent l="0" t="0" r="0" b="4445"/>
+            <wp:docPr id="2133083743" name="Picture 1"/>
+            <wp:cNvGraphicFramePr>
+              <a:graphicFrameLocks xmlns:a="http://schemas.openxmlformats.org/drawingml/2006/main" noChangeAspect="1"/>
+            </wp:cNvGraphicFramePr>
+            <a:graphic xmlns:a="http://schemas.openxmlformats.org/drawingml/2006/main">
+              <a:graphicData uri="http://schemas.openxmlformats.org/drawingml/2006/picture">
+                <pic:pic xmlns:pic="http://schemas.openxmlformats.org/drawingml/2006/picture">
+                  <pic:nvPicPr>
+                    <pic:cNvPr id="2133083743" name=""/>
+                    <pic:cNvPicPr/>
+                  </pic:nvPicPr>
+                  <pic:blipFill>
+                    <a:blip r:embed="rId13"/>
+                    <a:stretch>
+                      <a:fillRect/>
+                    </a:stretch>
+                  </pic:blipFill>
+                  <pic:spPr>
+                    <a:xfrm>
+                      <a:off x="0" y="0"/>
+                      <a:ext cx="5943600" cy="3005455"/>
+                    </a:xfrm>
+                    <a:prstGeom prst="rect">
+                      <a:avLst/>
+                    </a:prstGeom>
+                  </pic:spPr>
+                </pic:pic>
+              </a:graphicData>
+            </a:graphic>
+          </wp:inline>
+        </w:drawing>
+      </w:r>
+    </w:p>
+    <w:p>
+      <w:pPr>
+        <w:pStyle w:val="Caption"/>
+        <w:jc w:val="center"/>
+        <w:rPr>
+          <w:rFonts w:ascii="Calibri" w:hAnsi="Calibri" w:cs="Calibri"/>
+          <w:lang w:val="el-GR"/>
+        </w:rPr>
+      </w:pPr>
+      <w:r>
+        <w:rPr>
+          <w:lang w:val="el-GR"/>
+        </w:rPr>
+        <w:t>Εικόνα</w:t>
+      </w:r>
+      <w:r>
+        <w:rPr>
+          <w:lang w:val="el-GR"/>
+        </w:rPr>
+        <w:t xml:space="preserve"> </w:t>
+      </w:r>
+      <w:r>
+        <w:rPr>
+          <w:lang w:val="el-GR"/>
+        </w:rPr>
+        <w:t>5</w:t>
+      </w:r>
+      <w:r>
+        <w:rPr>
+          <w:noProof/>
+          <w:lang w:val="el-GR"/>
+        </w:rPr>
+        <w:t xml:space="preserve">: </w:t>
+      </w:r>
+      <w:r>
+        <w:rPr>
+          <w:noProof/>
+          <w:lang w:val="el-GR"/>
+        </w:rPr>
+        <w:t>Διαγραφή</w:t>
+      </w:r>
+      <w:r>
+        <w:rPr>
+          <w:noProof/>
+          <w:lang w:val="el-GR"/>
+        </w:rPr>
+        <w:t xml:space="preserve"> </w:t>
+      </w:r>
+      <w:r>
+        <w:rPr>
+          <w:noProof/>
+        </w:rPr>
+        <w:t>Use</w:t>
+      </w:r>
+      <w:r>
+        <w:rPr>
+          <w:noProof/>
+          <w:lang w:val="el-GR"/>
+        </w:rPr>
+        <w:t xml:space="preserve"> </w:t>
+      </w:r>
+      <w:r>
+        <w:rPr>
+          <w:noProof/>
+        </w:rPr>
+        <w:t>Case</w:t>
+      </w:r>
+    </w:p>
+    <w:p>
+      <w:pPr>
+        <w:rPr>
+          <w:rFonts w:ascii="Calibri" w:hAnsi="Calibri" w:cs="Calibri"/>
+          <w:lang w:val="el-GR"/>
+        </w:rPr>
+      </w:pPr>
+    </w:p>
+    <w:p>
+      <w:pPr>
+        <w:rPr>
+          <w:rFonts w:ascii="Calibri" w:hAnsi="Calibri" w:cs="Calibri"/>
+          <w:lang w:val="el-GR"/>
+        </w:rPr>
+      </w:pPr>
+    </w:p>
+    <w:p>
+      <w:pPr>
+        <w:rPr>
+          <w:rFonts w:ascii="Calibri" w:hAnsi="Calibri" w:cs="Calibri"/>
+          <w:lang w:val="el-GR"/>
+        </w:rPr>
+      </w:pPr>
+    </w:p>
+    <w:p>
+      <w:pPr>
+        <w:rPr>
+          <w:rFonts w:ascii="Calibri" w:hAnsi="Calibri" w:cs="Calibri"/>
+          <w:lang w:val="el-GR"/>
+        </w:rPr>
+      </w:pPr>
+    </w:p>
+    <w:p>
+      <w:pPr>
+        <w:rPr>
+          <w:rFonts w:ascii="Calibri" w:hAnsi="Calibri" w:cs="Calibri"/>
+          <w:lang w:val="el-GR"/>
+        </w:rPr>
+      </w:pPr>
+    </w:p>
+    <w:p>
+      <w:pPr>
+        <w:rPr>
+          <w:rFonts w:ascii="Calibri" w:hAnsi="Calibri" w:cs="Calibri"/>
+          <w:lang w:val="el-GR"/>
+        </w:rPr>
+      </w:pPr>
+    </w:p>
+    <w:p>
+      <w:pPr>
+        <w:rPr>
+          <w:rFonts w:ascii="Calibri" w:hAnsi="Calibri" w:cs="Calibri"/>
+          <w:lang w:val="el-GR"/>
+        </w:rPr>
+      </w:pPr>
+    </w:p>
+    <w:p>
+      <w:pPr>
+        <w:rPr>
+          <w:rFonts w:ascii="Calibri" w:hAnsi="Calibri" w:cs="Calibri"/>
+          <w:lang w:val="el-GR"/>
+        </w:rPr>
+      </w:pPr>
+    </w:p>
+    <w:p>
+      <w:pPr>
+        <w:rPr>
+          <w:rFonts w:ascii="Calibri" w:hAnsi="Calibri" w:cs="Calibri"/>
+          <w:lang w:val="el-GR"/>
+        </w:rPr>
+      </w:pPr>
+    </w:p>
+    <w:p>
+      <w:pPr>
+        <w:rPr>
+          <w:rFonts w:ascii="Calibri" w:hAnsi="Calibri" w:cs="Calibri"/>
+          <w:lang w:val="el-GR"/>
+        </w:rPr>
+      </w:pPr>
+    </w:p>
+    <w:p>
+      <w:pPr>
+        <w:rPr>
+          <w:rFonts w:ascii="Calibri" w:hAnsi="Calibri" w:cs="Calibri"/>
+          <w:lang w:val="el-GR"/>
+        </w:rPr>
+      </w:pPr>
+    </w:p>
+    <w:p>
+      <w:pPr>
+        <w:pBdr>
+          <w:top w:val="single" w:sz="4" w:space="1" w:color="auto"/>
+          <w:bottom w:val="single" w:sz="4" w:space="1" w:color="auto"/>
+        </w:pBdr>
+        <w:jc w:val="center"/>
+        <w:rPr>
+          <w:rFonts w:ascii="Calibri" w:hAnsi="Calibri" w:cs="Calibri"/>
+          <w:b/>
+          <w:bCs/>
+          <w:lang w:val="el-GR"/>
+        </w:rPr>
+      </w:pPr>
+      <w:r>
+        <w:rPr>
+          <w:rFonts w:ascii="Calibri" w:hAnsi="Calibri" w:cs="Calibri"/>
+          <w:b/>
+          <w:bCs/>
+          <w:lang w:val="el-GR"/>
+        </w:rPr>
+        <w:t xml:space="preserve">Δημιουργία </w:t>
+      </w:r>
+      <w:r>
+        <w:rPr>
+          <w:rFonts w:ascii="Calibri" w:hAnsi="Calibri" w:cs="Calibri"/>
+          <w:b/>
+          <w:bCs/>
+        </w:rPr>
+        <w:t>CRC</w:t>
+      </w:r>
+      <w:r>
+        <w:rPr>
+          <w:rFonts w:ascii="Calibri" w:hAnsi="Calibri" w:cs="Calibri"/>
+          <w:b/>
+          <w:bCs/>
+          <w:lang w:val="el-GR"/>
+        </w:rPr>
+        <w:t xml:space="preserve"> </w:t>
+      </w:r>
+      <w:r>
+        <w:rPr>
+          <w:rFonts w:ascii="Calibri" w:hAnsi="Calibri" w:cs="Calibri"/>
+          <w:b/>
+          <w:bCs/>
+        </w:rPr>
+        <w:t>Card</w:t>
+      </w:r>
+    </w:p>
+    <w:p>
+      <w:pPr>
+        <w:jc w:val="both"/>
+        <w:rPr>
+          <w:rFonts w:ascii="Calibri" w:hAnsi="Calibri" w:cs="Calibri"/>
+          <w:lang w:val="el-GR"/>
+        </w:rPr>
+      </w:pPr>
+      <w:r>
+        <w:rPr>
+          <w:rFonts w:ascii="Calibri" w:hAnsi="Calibri" w:cs="Calibri"/>
+          <w:lang w:val="el-GR"/>
+        </w:rPr>
+        <w:t xml:space="preserve">Στην εικόνα </w:t>
+      </w:r>
+      <w:r>
+        <w:rPr>
+          <w:rFonts w:ascii="Calibri" w:hAnsi="Calibri" w:cs="Calibri"/>
+          <w:lang w:val="el-GR"/>
+        </w:rPr>
+        <w:t>6</w:t>
+      </w:r>
+      <w:r>
+        <w:rPr>
+          <w:rFonts w:ascii="Calibri" w:hAnsi="Calibri" w:cs="Calibri"/>
+          <w:lang w:val="el-GR"/>
+        </w:rPr>
+        <w:t>, παρουσιάζουμε το Διάγραμμα Ευρωστίας της Περίπτωσης Χρήσης «</w:t>
+      </w:r>
+      <w:r>
+        <w:rPr>
+          <w:rFonts w:ascii="Calibri" w:hAnsi="Calibri" w:cs="Calibri"/>
+          <w:lang w:val="el-GR"/>
+        </w:rPr>
+        <w:t xml:space="preserve">Δημιουργία </w:t>
+      </w:r>
+      <w:r>
+        <w:rPr>
+          <w:rFonts w:ascii="Calibri" w:hAnsi="Calibri" w:cs="Calibri"/>
+        </w:rPr>
+        <w:t>CRC</w:t>
+      </w:r>
+      <w:r>
+        <w:rPr>
+          <w:rFonts w:ascii="Calibri" w:hAnsi="Calibri" w:cs="Calibri"/>
+          <w:lang w:val="el-GR"/>
+        </w:rPr>
+        <w:t xml:space="preserve"> </w:t>
+      </w:r>
+      <w:r>
+        <w:rPr>
+          <w:rFonts w:ascii="Calibri" w:hAnsi="Calibri" w:cs="Calibri"/>
+        </w:rPr>
+        <w:t>Card</w:t>
+      </w:r>
+      <w:r>
+        <w:rPr>
+          <w:rFonts w:ascii="Calibri" w:hAnsi="Calibri" w:cs="Calibri"/>
+          <w:lang w:val="el-GR"/>
+        </w:rPr>
+        <w:t xml:space="preserve">». Ως Χρήστη θεωρούμε και τον </w:t>
+      </w:r>
+      <w:r>
+        <w:rPr>
+          <w:rFonts w:ascii="Calibri" w:eastAsia="Arial" w:hAnsi="Calibri" w:cs="Calibri"/>
+          <w:i/>
+          <w:iCs/>
+          <w:sz w:val="22"/>
+          <w:szCs w:val="22"/>
+          <w:lang w:val="el-GR"/>
+        </w:rPr>
+        <w:t>Προγραμματιστή (Ιδιοκτήτη)</w:t>
+      </w:r>
+      <w:r>
+        <w:rPr>
+          <w:rFonts w:ascii="Calibri" w:eastAsia="Arial" w:hAnsi="Calibri" w:cs="Calibri"/>
+          <w:sz w:val="22"/>
+          <w:szCs w:val="22"/>
+          <w:lang w:val="el-GR"/>
+        </w:rPr>
+        <w:t xml:space="preserve"> </w:t>
+      </w:r>
+      <w:r>
+        <w:rPr>
+          <w:rFonts w:ascii="Calibri" w:hAnsi="Calibri" w:cs="Calibri"/>
+          <w:lang w:val="el-GR"/>
+        </w:rPr>
+        <w:t xml:space="preserve">και τον </w:t>
+      </w:r>
+      <w:r>
+        <w:rPr>
+          <w:rFonts w:ascii="Calibri" w:eastAsia="Arial" w:hAnsi="Calibri" w:cs="Calibri"/>
+          <w:i/>
+          <w:iCs/>
+          <w:sz w:val="22"/>
+          <w:szCs w:val="22"/>
+          <w:lang w:val="el-GR"/>
+        </w:rPr>
+        <w:t>Ιδιοκτήτη Οργανισμού</w:t>
+      </w:r>
+      <w:r>
+        <w:rPr>
+          <w:rFonts w:ascii="Calibri" w:hAnsi="Calibri" w:cs="Calibri"/>
+          <w:lang w:val="el-GR"/>
+        </w:rPr>
+        <w:t xml:space="preserve">. Για τους σκοπούς του συγκεκριμένου Διαγράμματος προσθέσαμε ως Χειριστή τον γενικό όρο </w:t>
+      </w:r>
+      <w:r>
+        <w:rPr>
+          <w:rFonts w:ascii="Calibri" w:hAnsi="Calibri" w:cs="Calibri"/>
+          <w:i/>
+          <w:iCs/>
+          <w:lang w:val="el-GR"/>
+        </w:rPr>
+        <w:t>Χρήστης</w:t>
+      </w:r>
+      <w:r>
+        <w:rPr>
+          <w:rFonts w:ascii="Calibri" w:hAnsi="Calibri" w:cs="Calibri"/>
+          <w:lang w:val="el-GR"/>
+        </w:rPr>
+        <w:t>.</w:t>
+      </w:r>
+    </w:p>
+    <w:p>
+      <w:pPr>
+        <w:keepNext/>
+        <w:jc w:val="center"/>
+      </w:pPr>
+      <w:r>
+        <w:rPr>
+          <w:rFonts w:ascii="Calibri" w:hAnsi="Calibri" w:cs="Calibri"/>
+          <w:noProof/>
+        </w:rPr>
+        <w:drawing>
+          <wp:inline distT="0" distB="0" distL="0" distR="0" wp14:anchorId="4DA230E4" wp14:editId="75ED2441">
+            <wp:extent cx="5943600" cy="5584825"/>
+            <wp:effectExtent l="0" t="0" r="0" b="0"/>
+            <wp:docPr id="955802027" name="Picture 1"/>
+            <wp:cNvGraphicFramePr>
+              <a:graphicFrameLocks xmlns:a="http://schemas.openxmlformats.org/drawingml/2006/main" noChangeAspect="1"/>
+            </wp:cNvGraphicFramePr>
+            <a:graphic xmlns:a="http://schemas.openxmlformats.org/drawingml/2006/main">
+              <a:graphicData uri="http://schemas.openxmlformats.org/drawingml/2006/picture">
+                <pic:pic xmlns:pic="http://schemas.openxmlformats.org/drawingml/2006/picture">
+                  <pic:nvPicPr>
+                    <pic:cNvPr id="955802027" name=""/>
+                    <pic:cNvPicPr/>
+                  </pic:nvPicPr>
+                  <pic:blipFill>
+                    <a:blip r:embed="rId14"/>
+                    <a:stretch>
+                      <a:fillRect/>
+                    </a:stretch>
+                  </pic:blipFill>
+                  <pic:spPr>
+                    <a:xfrm>
+                      <a:off x="0" y="0"/>
+                      <a:ext cx="5943600" cy="5584825"/>
+                    </a:xfrm>
+                    <a:prstGeom prst="rect">
+                      <a:avLst/>
+                    </a:prstGeom>
+                  </pic:spPr>
+                </pic:pic>
+              </a:graphicData>
+            </a:graphic>
+          </wp:inline>
+        </w:drawing>
+      </w:r>
+    </w:p>
+    <w:p>
+      <w:pPr>
+        <w:pStyle w:val="Caption"/>
+        <w:jc w:val="center"/>
+        <w:rPr>
+          <w:rFonts w:ascii="Calibri" w:hAnsi="Calibri" w:cs="Calibri"/>
+          <w:lang w:val="el-GR"/>
+        </w:rPr>
+      </w:pPr>
+      <w:r>
+        <w:rPr>
+          <w:lang w:val="el-GR"/>
+        </w:rPr>
+        <w:t>Εικόνα</w:t>
+      </w:r>
+      <w:r>
+        <w:rPr>
+          <w:lang w:val="el-GR"/>
+        </w:rPr>
+        <w:t xml:space="preserve"> </w:t>
+      </w:r>
+      <w:r>
+        <w:rPr>
+          <w:lang w:val="el-GR"/>
+        </w:rPr>
+        <w:t>6</w:t>
+      </w:r>
+      <w:r>
+        <w:rPr>
+          <w:lang w:val="el-GR"/>
+        </w:rPr>
+        <w:t>:</w:t>
+      </w:r>
+      <w:r>
+        <w:rPr>
+          <w:lang w:val="el-GR"/>
+        </w:rPr>
+        <w:t xml:space="preserve"> Δημιουργία </w:t>
+      </w:r>
+      <w:r>
+        <w:t>CRC</w:t>
+      </w:r>
+      <w:r>
+        <w:rPr>
+          <w:lang w:val="el-GR"/>
+        </w:rPr>
+        <w:t xml:space="preserve"> </w:t>
+      </w:r>
+      <w:r>
+        <w:t>Card</w:t>
+      </w:r>
+    </w:p>
+    <w:p>
+      <w:pPr>
+        <w:rPr>
+          <w:rFonts w:ascii="Calibri" w:hAnsi="Calibri" w:cs="Calibri"/>
+          <w:lang w:val="el-GR"/>
+        </w:rPr>
+      </w:pPr>
+    </w:p>
+    <w:p>
+      <w:pPr>
+        <w:rPr>
+          <w:rFonts w:ascii="Calibri" w:hAnsi="Calibri" w:cs="Calibri"/>
+          <w:lang w:val="el-GR"/>
+        </w:rPr>
+      </w:pPr>
+    </w:p>
+    <w:p>
+      <w:pPr>
+        <w:rPr>
+          <w:rFonts w:ascii="Calibri" w:hAnsi="Calibri" w:cs="Calibri"/>
+          <w:lang w:val="el-GR"/>
+        </w:rPr>
+      </w:pPr>
+    </w:p>
+    <w:p>
+      <w:pPr>
+        <w:pBdr>
+          <w:top w:val="single" w:sz="4" w:space="1" w:color="auto"/>
+          <w:bottom w:val="single" w:sz="4" w:space="1" w:color="auto"/>
+        </w:pBdr>
+        <w:jc w:val="center"/>
+        <w:rPr>
+          <w:rFonts w:ascii="Calibri" w:hAnsi="Calibri" w:cs="Calibri"/>
+          <w:b/>
+          <w:bCs/>
+          <w:lang w:val="el-GR"/>
+        </w:rPr>
+      </w:pPr>
+      <w:r>
+        <w:rPr>
+          <w:rFonts w:ascii="Calibri" w:hAnsi="Calibri" w:cs="Calibri"/>
+          <w:b/>
+          <w:bCs/>
+          <w:lang w:val="el-GR"/>
+        </w:rPr>
+        <w:t>Επεξεργασία</w:t>
+      </w:r>
+      <w:r>
+        <w:rPr>
+          <w:rFonts w:ascii="Calibri" w:hAnsi="Calibri" w:cs="Calibri"/>
+          <w:b/>
+          <w:bCs/>
+          <w:lang w:val="el-GR"/>
+        </w:rPr>
+        <w:t xml:space="preserve"> </w:t>
+      </w:r>
+      <w:r>
+        <w:rPr>
+          <w:rFonts w:ascii="Calibri" w:hAnsi="Calibri" w:cs="Calibri"/>
+          <w:b/>
+          <w:bCs/>
+        </w:rPr>
+        <w:t>CRC</w:t>
+      </w:r>
+      <w:r>
+        <w:rPr>
+          <w:rFonts w:ascii="Calibri" w:hAnsi="Calibri" w:cs="Calibri"/>
+          <w:b/>
+          <w:bCs/>
+          <w:lang w:val="el-GR"/>
+        </w:rPr>
+        <w:t xml:space="preserve"> </w:t>
+      </w:r>
+      <w:r>
+        <w:rPr>
+          <w:rFonts w:ascii="Calibri" w:hAnsi="Calibri" w:cs="Calibri"/>
+          <w:b/>
+          <w:bCs/>
+        </w:rPr>
+        <w:t>Card</w:t>
+      </w:r>
+    </w:p>
+    <w:p>
+      <w:pPr>
+        <w:jc w:val="both"/>
+        <w:rPr>
+          <w:rFonts w:ascii="Calibri" w:hAnsi="Calibri" w:cs="Calibri"/>
+          <w:lang w:val="el-GR"/>
+        </w:rPr>
+      </w:pPr>
+      <w:r>
+        <w:rPr>
+          <w:rFonts w:ascii="Calibri" w:hAnsi="Calibri" w:cs="Calibri"/>
+          <w:lang w:val="el-GR"/>
+        </w:rPr>
+        <w:t xml:space="preserve">Στην εικόνα </w:t>
+      </w:r>
+      <w:r>
+        <w:rPr>
+          <w:rFonts w:ascii="Calibri" w:hAnsi="Calibri" w:cs="Calibri"/>
+          <w:lang w:val="el-GR"/>
+        </w:rPr>
+        <w:t>7</w:t>
+      </w:r>
+      <w:r>
+        <w:rPr>
+          <w:rFonts w:ascii="Calibri" w:hAnsi="Calibri" w:cs="Calibri"/>
+          <w:lang w:val="el-GR"/>
+        </w:rPr>
+        <w:t>, παρουσιάζουμε το Διάγραμμα Ευρωστίας της Περίπτωσης Χρήσης «</w:t>
+      </w:r>
+      <w:r>
+        <w:rPr>
+          <w:rFonts w:ascii="Calibri" w:hAnsi="Calibri" w:cs="Calibri"/>
+          <w:lang w:val="el-GR"/>
+        </w:rPr>
+        <w:t>Επεξεργασία</w:t>
+      </w:r>
+      <w:r>
+        <w:rPr>
+          <w:rFonts w:ascii="Calibri" w:hAnsi="Calibri" w:cs="Calibri"/>
+          <w:lang w:val="el-GR"/>
+        </w:rPr>
+        <w:t xml:space="preserve"> </w:t>
+      </w:r>
+      <w:r>
+        <w:rPr>
+          <w:rFonts w:ascii="Calibri" w:hAnsi="Calibri" w:cs="Calibri"/>
+        </w:rPr>
+        <w:t>CRC</w:t>
+      </w:r>
+      <w:r>
+        <w:rPr>
+          <w:rFonts w:ascii="Calibri" w:hAnsi="Calibri" w:cs="Calibri"/>
+          <w:lang w:val="el-GR"/>
+        </w:rPr>
+        <w:t xml:space="preserve"> </w:t>
+      </w:r>
+      <w:r>
+        <w:rPr>
+          <w:rFonts w:ascii="Calibri" w:hAnsi="Calibri" w:cs="Calibri"/>
+        </w:rPr>
+        <w:t>Card</w:t>
+      </w:r>
+      <w:r>
+        <w:rPr>
+          <w:rFonts w:ascii="Calibri" w:hAnsi="Calibri" w:cs="Calibri"/>
+          <w:lang w:val="el-GR"/>
+        </w:rPr>
+        <w:t xml:space="preserve">». Ως Χρήστη θεωρούμε και τον </w:t>
+      </w:r>
+      <w:r>
+        <w:rPr>
+          <w:rFonts w:ascii="Calibri" w:eastAsia="Arial" w:hAnsi="Calibri" w:cs="Calibri"/>
+          <w:i/>
+          <w:iCs/>
+          <w:sz w:val="22"/>
+          <w:szCs w:val="22"/>
+          <w:lang w:val="el-GR"/>
+        </w:rPr>
+        <w:t>Προγραμματιστή (Ιδιοκτήτη)</w:t>
+      </w:r>
+      <w:r>
+        <w:rPr>
+          <w:rFonts w:ascii="Calibri" w:eastAsia="Arial" w:hAnsi="Calibri" w:cs="Calibri"/>
+          <w:sz w:val="22"/>
+          <w:szCs w:val="22"/>
+          <w:lang w:val="el-GR"/>
+        </w:rPr>
+        <w:t xml:space="preserve">, τον </w:t>
+      </w:r>
+      <w:r>
+        <w:rPr>
+          <w:rFonts w:ascii="Calibri" w:eastAsia="Arial" w:hAnsi="Calibri" w:cs="Calibri"/>
+          <w:i/>
+          <w:iCs/>
+          <w:sz w:val="22"/>
+          <w:szCs w:val="22"/>
+          <w:lang w:val="el-GR"/>
+        </w:rPr>
+        <w:t>Συνεργάτη</w:t>
+      </w:r>
+      <w:r>
+        <w:rPr>
+          <w:rFonts w:ascii="Calibri" w:eastAsia="Arial" w:hAnsi="Calibri" w:cs="Calibri"/>
+          <w:sz w:val="22"/>
+          <w:szCs w:val="22"/>
+          <w:lang w:val="el-GR"/>
+        </w:rPr>
+        <w:t xml:space="preserve"> </w:t>
+      </w:r>
+      <w:r>
+        <w:rPr>
+          <w:rFonts w:ascii="Calibri" w:hAnsi="Calibri" w:cs="Calibri"/>
+          <w:lang w:val="el-GR"/>
+        </w:rPr>
+        <w:t xml:space="preserve">και τον </w:t>
+      </w:r>
+      <w:r>
+        <w:rPr>
+          <w:rFonts w:ascii="Calibri" w:eastAsia="Arial" w:hAnsi="Calibri" w:cs="Calibri"/>
+          <w:i/>
+          <w:iCs/>
+          <w:sz w:val="22"/>
+          <w:szCs w:val="22"/>
+          <w:lang w:val="el-GR"/>
+        </w:rPr>
+        <w:t>Ιδιοκτήτη Οργανισμού</w:t>
+      </w:r>
+      <w:r>
+        <w:rPr>
+          <w:rFonts w:ascii="Calibri" w:hAnsi="Calibri" w:cs="Calibri"/>
+          <w:lang w:val="el-GR"/>
+        </w:rPr>
+        <w:t xml:space="preserve">. Για τους σκοπούς του συγκεκριμένου Διαγράμματος προσθέσαμε ως Χειριστή τον γενικό όρο </w:t>
+      </w:r>
+      <w:r>
+        <w:rPr>
+          <w:rFonts w:ascii="Calibri" w:hAnsi="Calibri" w:cs="Calibri"/>
+          <w:i/>
+          <w:iCs/>
+          <w:lang w:val="el-GR"/>
+        </w:rPr>
+        <w:t>Χρήστης</w:t>
+      </w:r>
+      <w:r>
+        <w:rPr>
+          <w:rFonts w:ascii="Calibri" w:hAnsi="Calibri" w:cs="Calibri"/>
+          <w:lang w:val="el-GR"/>
+        </w:rPr>
+        <w:t>.</w:t>
+      </w:r>
+    </w:p>
+    <w:p>
+      <w:pPr>
+        <w:keepNext/>
+        <w:jc w:val="center"/>
+      </w:pPr>
+      <w:r>
+        <w:rPr>
+          <w:rFonts w:ascii="Calibri" w:hAnsi="Calibri" w:cs="Calibri"/>
+          <w:noProof/>
+          <w:lang w:val="el-GR"/>
+        </w:rPr>
+        <w:drawing>
+          <wp:inline distT="0" distB="0" distL="0" distR="0" wp14:anchorId="0420EFF7" wp14:editId="72A929F0">
+            <wp:extent cx="5943600" cy="4280535"/>
+            <wp:effectExtent l="0" t="0" r="0" b="5715"/>
+            <wp:docPr id="722666908" name="Picture 1"/>
+            <wp:cNvGraphicFramePr>
+              <a:graphicFrameLocks xmlns:a="http://schemas.openxmlformats.org/drawingml/2006/main" noChangeAspect="1"/>
+            </wp:cNvGraphicFramePr>
+            <a:graphic xmlns:a="http://schemas.openxmlformats.org/drawingml/2006/main">
+              <a:graphicData uri="http://schemas.openxmlformats.org/drawingml/2006/picture">
+                <pic:pic xmlns:pic="http://schemas.openxmlformats.org/drawingml/2006/picture">
+                  <pic:nvPicPr>
+                    <pic:cNvPr id="722666908" name=""/>
+                    <pic:cNvPicPr/>
+                  </pic:nvPicPr>
+                  <pic:blipFill>
+                    <a:blip r:embed="rId15"/>
+                    <a:stretch>
+                      <a:fillRect/>
+                    </a:stretch>
+                  </pic:blipFill>
+                  <pic:spPr>
+                    <a:xfrm>
+                      <a:off x="0" y="0"/>
+                      <a:ext cx="5943600" cy="4280535"/>
+                    </a:xfrm>
+                    <a:prstGeom prst="rect">
+                      <a:avLst/>
+                    </a:prstGeom>
+                  </pic:spPr>
+                </pic:pic>
+              </a:graphicData>
+            </a:graphic>
+          </wp:inline>
+        </w:drawing>
+      </w:r>
+    </w:p>
+    <w:p>
+      <w:pPr>
+        <w:pStyle w:val="Caption"/>
+        <w:jc w:val="center"/>
+        <w:rPr>
+          <w:rFonts w:ascii="Calibri" w:hAnsi="Calibri" w:cs="Calibri"/>
+          <w:lang w:val="el-GR"/>
+        </w:rPr>
+      </w:pPr>
+      <w:r>
+        <w:rPr>
+          <w:lang w:val="el-GR"/>
+        </w:rPr>
+        <w:t>Εικόνα</w:t>
+      </w:r>
+      <w:r>
+        <w:rPr>
+          <w:lang w:val="el-GR"/>
+        </w:rPr>
+        <w:t xml:space="preserve"> 7: </w:t>
+      </w:r>
+      <w:r>
+        <w:rPr>
+          <w:lang w:val="el-GR"/>
+        </w:rPr>
+        <w:t xml:space="preserve">Επεξεργασία </w:t>
+      </w:r>
+      <w:r>
+        <w:t>CRC</w:t>
+      </w:r>
+      <w:r>
+        <w:rPr>
+          <w:lang w:val="el-GR"/>
+        </w:rPr>
+        <w:t xml:space="preserve"> </w:t>
+      </w:r>
+      <w:r>
+        <w:t>Card</w:t>
+      </w:r>
+    </w:p>
+    <w:p>
+      <w:pPr>
+        <w:rPr>
+          <w:rFonts w:ascii="Calibri" w:hAnsi="Calibri" w:cs="Calibri"/>
+          <w:lang w:val="el-GR"/>
+        </w:rPr>
+      </w:pPr>
+    </w:p>
+    <w:p>
+      <w:pPr>
+        <w:rPr>
+          <w:rFonts w:ascii="Calibri" w:hAnsi="Calibri" w:cs="Calibri"/>
+          <w:lang w:val="el-GR"/>
+        </w:rPr>
+      </w:pPr>
+    </w:p>
+    <w:p>
+      <w:pPr>
+        <w:rPr>
+          <w:rFonts w:ascii="Calibri" w:hAnsi="Calibri" w:cs="Calibri"/>
+          <w:lang w:val="el-GR"/>
+        </w:rPr>
+      </w:pPr>
+    </w:p>
+    <w:p>
+      <w:pPr>
+        <w:rPr>
+          <w:rFonts w:ascii="Calibri" w:hAnsi="Calibri" w:cs="Calibri"/>
+          <w:lang w:val="el-GR"/>
+        </w:rPr>
+      </w:pPr>
+    </w:p>
+    <w:p>
+      <w:pPr>
+        <w:rPr>
+          <w:rFonts w:ascii="Calibri" w:hAnsi="Calibri" w:cs="Calibri"/>
+          <w:lang w:val="el-GR"/>
+        </w:rPr>
+      </w:pPr>
+    </w:p>
+    <w:p>
+      <w:pPr>
+        <w:rPr>
+          <w:rFonts w:ascii="Calibri" w:hAnsi="Calibri" w:cs="Calibri"/>
+          <w:lang w:val="el-GR"/>
+        </w:rPr>
+      </w:pPr>
+    </w:p>
+    <w:p>
+      <w:pPr>
+        <w:rPr>
+          <w:rFonts w:ascii="Calibri" w:hAnsi="Calibri" w:cs="Calibri"/>
+          <w:lang w:val="el-GR"/>
+        </w:rPr>
+      </w:pPr>
+    </w:p>
+    <w:p>
+      <w:pPr>
+        <w:pBdr>
+          <w:top w:val="single" w:sz="4" w:space="1" w:color="auto"/>
+          <w:bottom w:val="single" w:sz="4" w:space="1" w:color="auto"/>
+        </w:pBdr>
+        <w:jc w:val="center"/>
+        <w:rPr>
+          <w:rFonts w:ascii="Calibri" w:hAnsi="Calibri" w:cs="Calibri"/>
+          <w:b/>
+          <w:bCs/>
+          <w:lang w:val="el-GR"/>
+        </w:rPr>
+      </w:pPr>
+      <w:r>
+        <w:rPr>
+          <w:rFonts w:ascii="Calibri" w:hAnsi="Calibri" w:cs="Calibri"/>
+          <w:b/>
+          <w:bCs/>
+          <w:lang w:val="el-GR"/>
+        </w:rPr>
+        <w:t>Διαγραφή</w:t>
+      </w:r>
+      <w:r>
+        <w:rPr>
+          <w:rFonts w:ascii="Calibri" w:hAnsi="Calibri" w:cs="Calibri"/>
+          <w:b/>
+          <w:bCs/>
+          <w:lang w:val="el-GR"/>
+        </w:rPr>
+        <w:t xml:space="preserve"> </w:t>
+      </w:r>
+      <w:r>
+        <w:rPr>
+          <w:rFonts w:ascii="Calibri" w:hAnsi="Calibri" w:cs="Calibri"/>
+          <w:b/>
+          <w:bCs/>
+        </w:rPr>
+        <w:t>CRC</w:t>
+      </w:r>
+      <w:r>
+        <w:rPr>
+          <w:rFonts w:ascii="Calibri" w:hAnsi="Calibri" w:cs="Calibri"/>
+          <w:b/>
+          <w:bCs/>
+          <w:lang w:val="el-GR"/>
+        </w:rPr>
+        <w:t xml:space="preserve"> </w:t>
+      </w:r>
+      <w:r>
+        <w:rPr>
+          <w:rFonts w:ascii="Calibri" w:hAnsi="Calibri" w:cs="Calibri"/>
+          <w:b/>
+          <w:bCs/>
+        </w:rPr>
+        <w:t>Card</w:t>
+      </w:r>
+    </w:p>
+    <w:p>
+      <w:pPr>
+        <w:jc w:val="both"/>
+        <w:rPr>
+          <w:rFonts w:ascii="Calibri" w:hAnsi="Calibri" w:cs="Calibri"/>
+          <w:lang w:val="el-GR"/>
+        </w:rPr>
+      </w:pPr>
+      <w:r>
+        <w:rPr>
+          <w:rFonts w:ascii="Calibri" w:hAnsi="Calibri" w:cs="Calibri"/>
+          <w:lang w:val="el-GR"/>
+        </w:rPr>
+        <w:t xml:space="preserve">Στην εικόνα </w:t>
+      </w:r>
+      <w:r>
+        <w:rPr>
+          <w:rFonts w:ascii="Calibri" w:hAnsi="Calibri" w:cs="Calibri"/>
+          <w:lang w:val="el-GR"/>
+        </w:rPr>
+        <w:t>8</w:t>
+      </w:r>
+      <w:r>
+        <w:rPr>
+          <w:rFonts w:ascii="Calibri" w:hAnsi="Calibri" w:cs="Calibri"/>
+          <w:lang w:val="el-GR"/>
+        </w:rPr>
+        <w:t>, παρουσιάζουμε το Διάγραμμα Ευρωστίας της Περίπτωσης Χρήσης «</w:t>
+      </w:r>
+      <w:r>
+        <w:rPr>
+          <w:rFonts w:ascii="Calibri" w:hAnsi="Calibri" w:cs="Calibri"/>
+          <w:lang w:val="el-GR"/>
+        </w:rPr>
+        <w:t>Διαγραφή</w:t>
+      </w:r>
+      <w:r>
+        <w:rPr>
+          <w:rFonts w:ascii="Calibri" w:hAnsi="Calibri" w:cs="Calibri"/>
+          <w:lang w:val="el-GR"/>
+        </w:rPr>
+        <w:t xml:space="preserve"> </w:t>
+      </w:r>
+      <w:r>
+        <w:rPr>
+          <w:rFonts w:ascii="Calibri" w:hAnsi="Calibri" w:cs="Calibri"/>
+        </w:rPr>
+        <w:t>CRC</w:t>
+      </w:r>
+      <w:r>
+        <w:rPr>
+          <w:rFonts w:ascii="Calibri" w:hAnsi="Calibri" w:cs="Calibri"/>
+          <w:lang w:val="el-GR"/>
+        </w:rPr>
+        <w:t xml:space="preserve"> </w:t>
+      </w:r>
+      <w:r>
+        <w:rPr>
+          <w:rFonts w:ascii="Calibri" w:hAnsi="Calibri" w:cs="Calibri"/>
+        </w:rPr>
+        <w:t>Card</w:t>
+      </w:r>
+      <w:r>
+        <w:rPr>
+          <w:rFonts w:ascii="Calibri" w:hAnsi="Calibri" w:cs="Calibri"/>
+          <w:lang w:val="el-GR"/>
+        </w:rPr>
+        <w:t xml:space="preserve">». Ως Χρήστη θεωρούμε και τον </w:t>
+      </w:r>
+      <w:r>
+        <w:rPr>
+          <w:rFonts w:ascii="Calibri" w:eastAsia="Arial" w:hAnsi="Calibri" w:cs="Calibri"/>
+          <w:i/>
+          <w:iCs/>
+          <w:sz w:val="22"/>
+          <w:szCs w:val="22"/>
+          <w:lang w:val="el-GR"/>
+        </w:rPr>
+        <w:t>Προγραμματιστή (Ιδιοκτήτη)</w:t>
+      </w:r>
+      <w:r>
+        <w:rPr>
+          <w:rFonts w:ascii="Calibri" w:eastAsia="Arial" w:hAnsi="Calibri" w:cs="Calibri"/>
+          <w:i/>
+          <w:iCs/>
+          <w:sz w:val="22"/>
+          <w:szCs w:val="22"/>
+          <w:lang w:val="el-GR"/>
+        </w:rPr>
+        <w:t xml:space="preserve"> </w:t>
+      </w:r>
+      <w:r>
+        <w:rPr>
+          <w:rFonts w:ascii="Calibri" w:hAnsi="Calibri" w:cs="Calibri"/>
+          <w:lang w:val="el-GR"/>
+        </w:rPr>
+        <w:t xml:space="preserve">και τον </w:t>
+      </w:r>
+      <w:r>
+        <w:rPr>
+          <w:rFonts w:ascii="Calibri" w:eastAsia="Arial" w:hAnsi="Calibri" w:cs="Calibri"/>
+          <w:i/>
+          <w:iCs/>
+          <w:sz w:val="22"/>
+          <w:szCs w:val="22"/>
+          <w:lang w:val="el-GR"/>
+        </w:rPr>
+        <w:t>Ιδιοκτήτη Οργανισμού</w:t>
+      </w:r>
+      <w:r>
+        <w:rPr>
+          <w:rFonts w:ascii="Calibri" w:hAnsi="Calibri" w:cs="Calibri"/>
+          <w:lang w:val="el-GR"/>
+        </w:rPr>
+        <w:t xml:space="preserve">. Για τους σκοπούς του συγκεκριμένου </w:t>
+      </w:r>
+      <w:r>
+        <w:rPr>
+          <w:rFonts w:ascii="Calibri" w:hAnsi="Calibri" w:cs="Calibri"/>
+          <w:lang w:val="el-GR"/>
+        </w:rPr>
+        <w:t>δ</w:t>
+      </w:r>
+      <w:r>
+        <w:rPr>
+          <w:rFonts w:ascii="Calibri" w:hAnsi="Calibri" w:cs="Calibri"/>
+          <w:lang w:val="el-GR"/>
+        </w:rPr>
+        <w:t xml:space="preserve">ιαγράμματος προσθέσαμε ως Χειριστή τον γενικό όρο </w:t>
+      </w:r>
+      <w:r>
+        <w:rPr>
+          <w:rFonts w:ascii="Calibri" w:hAnsi="Calibri" w:cs="Calibri"/>
+          <w:i/>
+          <w:iCs/>
+          <w:lang w:val="el-GR"/>
+        </w:rPr>
+        <w:t>Χρήστης</w:t>
+      </w:r>
+      <w:r>
+        <w:rPr>
+          <w:rFonts w:ascii="Calibri" w:hAnsi="Calibri" w:cs="Calibri"/>
+          <w:lang w:val="el-GR"/>
+        </w:rPr>
+        <w:t>.</w:t>
+      </w:r>
+    </w:p>
+    <w:p>
+      <w:pPr>
+        <w:keepNext/>
+        <w:jc w:val="center"/>
+      </w:pPr>
+      <w:r>
+        <w:rPr>
+          <w:rFonts w:ascii="Calibri" w:hAnsi="Calibri" w:cs="Calibri"/>
+        </w:rPr>
+        <w:drawing>
+          <wp:inline distT="0" distB="0" distL="0" distR="0" wp14:anchorId="76819580" wp14:editId="3FCBD314">
+            <wp:extent cx="5943600" cy="3908425"/>
+            <wp:effectExtent l="0" t="0" r="0" b="0"/>
+            <wp:docPr id="886640220" name="Picture 1"/>
+            <wp:cNvGraphicFramePr>
+              <a:graphicFrameLocks xmlns:a="http://schemas.openxmlformats.org/drawingml/2006/main" noChangeAspect="1"/>
+            </wp:cNvGraphicFramePr>
+            <a:graphic xmlns:a="http://schemas.openxmlformats.org/drawingml/2006/main">
+              <a:graphicData uri="http://schemas.openxmlformats.org/drawingml/2006/picture">
+                <pic:pic xmlns:pic="http://schemas.openxmlformats.org/drawingml/2006/picture">
+                  <pic:nvPicPr>
+                    <pic:cNvPr id="886640220" name=""/>
+                    <pic:cNvPicPr/>
+                  </pic:nvPicPr>
+                  <pic:blipFill>
+                    <a:blip r:embed="rId16"/>
+                    <a:stretch>
+                      <a:fillRect/>
+                    </a:stretch>
+                  </pic:blipFill>
+                  <pic:spPr>
+                    <a:xfrm>
+                      <a:off x="0" y="0"/>
+                      <a:ext cx="5943600" cy="3908425"/>
+                    </a:xfrm>
+                    <a:prstGeom prst="rect">
+                      <a:avLst/>
+                    </a:prstGeom>
+                  </pic:spPr>
+                </pic:pic>
+              </a:graphicData>
+            </a:graphic>
+          </wp:inline>
+        </w:drawing>
+      </w:r>
+    </w:p>
+    <w:p>
+      <w:pPr>
+        <w:pStyle w:val="Caption"/>
+        <w:jc w:val="center"/>
+        <w:rPr>
+          <w:rFonts w:ascii="Calibri" w:hAnsi="Calibri" w:cs="Calibri"/>
+        </w:rPr>
+      </w:pPr>
+      <w:r>
+        <w:rPr>
+          <w:lang w:val="el-GR"/>
+        </w:rPr>
+        <w:t>Εικόνα</w:t>
+      </w:r>
+      <w:r>
+        <w:t xml:space="preserve"> 8</w:t>
+      </w:r>
+      <w:r>
+        <w:rPr>
+          <w:lang w:val="el-GR"/>
+        </w:rPr>
+        <w:t xml:space="preserve">: Διαγραφή </w:t>
+      </w:r>
+      <w:r>
+        <w:t>CRC Card</w:t>
+      </w:r>
+    </w:p>
+    <w:p>
+      <w:pPr>
+        <w:rPr>
+          <w:rFonts w:ascii="Calibri" w:hAnsi="Calibri" w:cs="Calibri"/>
+          <w:lang w:val="el-GR"/>
+        </w:rPr>
+      </w:pPr>
+    </w:p>
+    <w:p>
+      <w:pPr>
+        <w:rPr>
+          <w:rFonts w:ascii="Calibri" w:hAnsi="Calibri" w:cs="Calibri"/>
+          <w:lang w:val="el-GR"/>
+        </w:rPr>
+      </w:pPr>
+    </w:p>
+    <w:p>
+      <w:pPr>
+        <w:rPr>
+          <w:rFonts w:ascii="Calibri" w:hAnsi="Calibri" w:cs="Calibri"/>
+          <w:lang w:val="el-GR"/>
+        </w:rPr>
+      </w:pPr>
+    </w:p>
+    <w:p>
+      <w:pPr>
+        <w:rPr>
+          <w:rFonts w:ascii="Calibri" w:hAnsi="Calibri" w:cs="Calibri"/>
+          <w:lang w:val="el-GR"/>
+        </w:rPr>
+      </w:pPr>
+    </w:p>
+    <w:p>
+      <w:pPr>
+        <w:rPr>
+          <w:rFonts w:ascii="Calibri" w:hAnsi="Calibri" w:cs="Calibri"/>
+          <w:lang w:val="el-GR"/>
+        </w:rPr>
+      </w:pPr>
+    </w:p>
+    <w:p>
+      <w:pPr>
+        <w:rPr>
+          <w:rFonts w:ascii="Calibri" w:hAnsi="Calibri" w:cs="Calibri"/>
+          <w:lang w:val="el-GR"/>
+        </w:rPr>
+      </w:pPr>
+    </w:p>
+    <w:p>
+      <w:pPr>
+        <w:rPr>
+          <w:rFonts w:ascii="Calibri" w:hAnsi="Calibri" w:cs="Calibri"/>
+          <w:lang w:val="el-GR"/>
+        </w:rPr>
+      </w:pPr>
+    </w:p>
+    <w:p>
+      <w:pPr>
+        <w:rPr>
+          <w:rFonts w:ascii="Calibri" w:hAnsi="Calibri" w:cs="Calibri"/>
+          <w:lang w:val="el-GR"/>
+        </w:rPr>
+      </w:pPr>
+    </w:p>
+    <w:p>
+      <w:pPr>
+        <w:rPr>
+          <w:rFonts w:ascii="Calibri" w:hAnsi="Calibri" w:cs="Calibri"/>
+          <w:lang w:val="el-GR"/>
+        </w:rPr>
+      </w:pPr>
+    </w:p>
+    <w:p>
+      <w:pPr>
+        <w:rPr>
+          <w:rFonts w:ascii="Calibri" w:hAnsi="Calibri" w:cs="Calibri"/>
+          <w:lang w:val="el-GR"/>
+        </w:rPr>
+      </w:pPr>
+    </w:p>
+    <w:p>
+      <w:pPr>
+        <w:rPr>
+          <w:rFonts w:ascii="Calibri" w:hAnsi="Calibri" w:cs="Calibri"/>
+          <w:lang w:val="el-GR"/>
+        </w:rPr>
+      </w:pPr>
+    </w:p>
+    <w:p>
+      <w:pPr>
+        <w:rPr>
+          <w:rFonts w:ascii="Calibri" w:hAnsi="Calibri" w:cs="Calibri"/>
+          <w:lang w:val="el-GR"/>
+        </w:rPr>
+      </w:pPr>
+    </w:p>
+    <w:p>
+      <w:pPr>
+        <w:rPr>
+          <w:rFonts w:ascii="Calibri" w:hAnsi="Calibri" w:cs="Calibri"/>
+          <w:lang w:val="el-GR"/>
+        </w:rPr>
+      </w:pPr>
+    </w:p>
+    <w:p>
+      <w:pPr>
+        <w:rPr>
+          <w:rFonts w:ascii="Calibri" w:hAnsi="Calibri" w:cs="Calibri"/>
+          <w:lang w:val="el-GR"/>
+        </w:rPr>
+      </w:pPr>
+    </w:p>
+    <w:p>
+      <w:pPr>
+        <w:rPr>
+          <w:rFonts w:ascii="Calibri" w:hAnsi="Calibri" w:cs="Calibri"/>
+          <w:lang w:val="el-GR"/>
+        </w:rPr>
+      </w:pPr>
+    </w:p>
+    <w:p>
+      <w:pPr>
+        <w:rPr>
+          <w:rFonts w:ascii="Calibri" w:hAnsi="Calibri" w:cs="Calibri"/>
+          <w:lang w:val="el-GR"/>
+        </w:rPr>
+      </w:pPr>
+    </w:p>
+    <w:p>
+      <w:pPr>
+        <w:rPr>
+          <w:rFonts w:ascii="Calibri" w:hAnsi="Calibri" w:cs="Calibri"/>
+          <w:lang w:val="el-GR"/>
+        </w:rPr>
+      </w:pPr>
+    </w:p>
+    <w:p>
+      <w:pPr>
+        <w:rPr>
+          <w:rFonts w:ascii="Calibri" w:hAnsi="Calibri" w:cs="Calibri"/>
+          <w:lang w:val="el-GR"/>
+        </w:rPr>
+      </w:pPr>
+    </w:p>
+    <w:p>
+      <w:pPr>
+        <w:rPr>
+          <w:rFonts w:ascii="Calibri" w:hAnsi="Calibri" w:cs="Calibri"/>
+          <w:lang w:val="el-GR"/>
+        </w:rPr>
+      </w:pPr>
+    </w:p>
+    <w:p>
+      <w:pPr>
+        <w:rPr>
+          <w:rFonts w:ascii="Calibri" w:hAnsi="Calibri" w:cs="Calibri"/>
+          <w:lang w:val="el-GR"/>
         </w:rPr>
       </w:pPr>
     </w:p>
@@ -2939,7 +4345,7 @@
         </w:rPr>
         <w:t xml:space="preserve"> με τη χρήση του εργαλείου </w:t>
       </w:r>
-      <w:hyperlink r:id="rId13" w:history="1">
+      <w:hyperlink r:id="rId17" w:history="1">
         <w:r>
           <w:rPr>
             <w:rStyle w:val="Hyperlink"/>
@@ -2981,8 +4387,8 @@
       </w:pPr>
     </w:p>
     <w:sectPr>
-      <w:headerReference w:type="default" r:id="rId14"/>
-      <w:footerReference w:type="default" r:id="rId15"/>
+      <w:headerReference w:type="default" r:id="rId18"/>
+      <w:footerReference w:type="default" r:id="rId19"/>
       <w:pgSz w:w="12240" w:h="15840"/>
       <w:pgMar w:top="1440" w:right="1440" w:bottom="1440" w:left="1440" w:header="720" w:footer="720" w:gutter="0"/>
       <w:cols w:space="720"/>

</xml_diff>

<commit_message>
nexxt 4 robustness and UC updates and fixes
</commit_message>
<xml_diff>
--- a/2nd_phase/Robustness-diagram-v0.1.docx
+++ b/2nd_phase/Robustness-diagram-v0.1.docx
@@ -1430,8 +1430,6 @@
           <w:rFonts w:ascii="Calibri" w:eastAsia="Arial" w:hAnsi="Calibri" w:cs="Calibri"/>
           <w:i/>
           <w:iCs/>
-          <w:sz w:val="22"/>
-          <w:szCs w:val="22"/>
           <w:lang w:val="el-GR"/>
         </w:rPr>
         <w:t>Προγραμματιστή</w:t>
@@ -1457,8 +1455,6 @@
           <w:rFonts w:ascii="Calibri" w:eastAsia="Arial" w:hAnsi="Calibri" w:cs="Calibri"/>
           <w:i/>
           <w:iCs/>
-          <w:sz w:val="22"/>
-          <w:szCs w:val="22"/>
           <w:lang w:val="el-GR"/>
         </w:rPr>
         <w:t>Ιδιοκτήτη Οργανισμού</w:t>
@@ -1603,7 +1599,6 @@
         <w:rPr>
           <w:rFonts w:ascii="Calibri" w:hAnsi="Calibri" w:cs="Calibri"/>
           <w:noProof/>
-          <w:lang w:val="el-GR"/>
         </w:rPr>
         <w:t>1</w:t>
       </w:r>
@@ -1728,8 +1723,6 @@
           <w:rFonts w:ascii="Calibri" w:eastAsia="Arial" w:hAnsi="Calibri" w:cs="Calibri"/>
           <w:i/>
           <w:iCs/>
-          <w:sz w:val="22"/>
-          <w:szCs w:val="22"/>
           <w:lang w:val="el-GR"/>
         </w:rPr>
         <w:t xml:space="preserve">Προγραμματιστή </w:t>
@@ -1739,8 +1732,6 @@
           <w:rFonts w:ascii="Calibri" w:eastAsia="Arial" w:hAnsi="Calibri" w:cs="Calibri"/>
           <w:i/>
           <w:iCs/>
-          <w:sz w:val="22"/>
-          <w:szCs w:val="22"/>
           <w:lang w:val="el-GR"/>
         </w:rPr>
         <w:t>(Ιδιοκτήτη)</w:t>
@@ -1748,8 +1739,6 @@
       <w:r>
         <w:rPr>
           <w:rFonts w:ascii="Calibri" w:eastAsia="Arial" w:hAnsi="Calibri" w:cs="Calibri"/>
-          <w:sz w:val="22"/>
-          <w:szCs w:val="22"/>
           <w:lang w:val="el-GR"/>
         </w:rPr>
         <w:t xml:space="preserve"> </w:t>
@@ -1766,8 +1755,6 @@
           <w:rFonts w:ascii="Calibri" w:eastAsia="Arial" w:hAnsi="Calibri" w:cs="Calibri"/>
           <w:i/>
           <w:iCs/>
-          <w:sz w:val="22"/>
-          <w:szCs w:val="22"/>
           <w:lang w:val="el-GR"/>
         </w:rPr>
         <w:t>Ιδιοκτήτη</w:t>
@@ -1777,8 +1764,6 @@
           <w:rFonts w:ascii="Calibri" w:eastAsia="Arial" w:hAnsi="Calibri" w:cs="Calibri"/>
           <w:i/>
           <w:iCs/>
-          <w:sz w:val="22"/>
-          <w:szCs w:val="22"/>
           <w:lang w:val="el-GR"/>
         </w:rPr>
         <w:t xml:space="preserve"> </w:t>
@@ -1788,8 +1773,6 @@
           <w:rFonts w:ascii="Calibri" w:eastAsia="Arial" w:hAnsi="Calibri" w:cs="Calibri"/>
           <w:i/>
           <w:iCs/>
-          <w:sz w:val="22"/>
-          <w:szCs w:val="22"/>
           <w:lang w:val="el-GR"/>
         </w:rPr>
         <w:t>Οργανισμού</w:t>
@@ -1940,7 +1923,6 @@
         <w:rPr>
           <w:rFonts w:ascii="Calibri" w:hAnsi="Calibri" w:cs="Calibri"/>
           <w:noProof/>
-          <w:lang w:val="el-GR"/>
         </w:rPr>
         <w:t>2</w:t>
       </w:r>
@@ -2129,8 +2111,6 @@
           <w:rFonts w:ascii="Calibri" w:eastAsia="Arial" w:hAnsi="Calibri" w:cs="Calibri"/>
           <w:i/>
           <w:iCs/>
-          <w:sz w:val="22"/>
-          <w:szCs w:val="22"/>
           <w:lang w:val="el-GR"/>
         </w:rPr>
         <w:t>Προγραμματιστή (Ιδιοκτήτη)</w:t>
@@ -2156,8 +2136,6 @@
           <w:rFonts w:ascii="Calibri" w:eastAsia="Arial" w:hAnsi="Calibri" w:cs="Calibri"/>
           <w:i/>
           <w:iCs/>
-          <w:sz w:val="22"/>
-          <w:szCs w:val="22"/>
           <w:lang w:val="el-GR"/>
         </w:rPr>
         <w:t>Ιδιοκτήτη Οργανισμού</w:t>
@@ -2297,7 +2275,6 @@
         <w:rPr>
           <w:rFonts w:ascii="Calibri" w:hAnsi="Calibri" w:cs="Calibri"/>
           <w:noProof/>
-          <w:lang w:val="el-GR"/>
         </w:rPr>
         <w:t>3</w:t>
       </w:r>
@@ -2480,8 +2457,6 @@
           <w:rFonts w:ascii="Calibri" w:eastAsia="Arial" w:hAnsi="Calibri" w:cs="Calibri"/>
           <w:i/>
           <w:iCs/>
-          <w:sz w:val="22"/>
-          <w:szCs w:val="22"/>
           <w:lang w:val="el-GR"/>
         </w:rPr>
         <w:t>Προγραμματιστή (Ιδιοκτήτη)</w:t>
@@ -2493,15 +2468,20 @@
           <w:szCs w:val="22"/>
           <w:lang w:val="el-GR"/>
         </w:rPr>
-        <w:t xml:space="preserve">, τον </w:t>
+        <w:t xml:space="preserve">, </w:t>
+      </w:r>
+      <w:r>
+        <w:rPr>
+          <w:rFonts w:ascii="Calibri" w:eastAsia="Arial" w:hAnsi="Calibri" w:cs="Calibri"/>
+          <w:lang w:val="el-GR"/>
+        </w:rPr>
+        <w:t xml:space="preserve">τον </w:t>
       </w:r>
       <w:r>
         <w:rPr>
           <w:rFonts w:ascii="Calibri" w:eastAsia="Arial" w:hAnsi="Calibri" w:cs="Calibri"/>
           <w:i/>
           <w:iCs/>
-          <w:sz w:val="22"/>
-          <w:szCs w:val="22"/>
           <w:lang w:val="el-GR"/>
         </w:rPr>
         <w:t>Συνεργάτη</w:t>
@@ -2509,8 +2489,6 @@
       <w:r>
         <w:rPr>
           <w:rFonts w:ascii="Calibri" w:eastAsia="Arial" w:hAnsi="Calibri" w:cs="Calibri"/>
-          <w:sz w:val="22"/>
-          <w:szCs w:val="22"/>
           <w:lang w:val="el-GR"/>
         </w:rPr>
         <w:t xml:space="preserve"> </w:t>
@@ -2527,8 +2505,6 @@
           <w:rFonts w:ascii="Calibri" w:eastAsia="Arial" w:hAnsi="Calibri" w:cs="Calibri"/>
           <w:i/>
           <w:iCs/>
-          <w:sz w:val="22"/>
-          <w:szCs w:val="22"/>
           <w:lang w:val="el-GR"/>
         </w:rPr>
         <w:t>Ιδιοκτήτη Οργανισμού</w:t>
@@ -2672,7 +2648,6 @@
         <w:rPr>
           <w:rFonts w:ascii="Calibri" w:hAnsi="Calibri" w:cs="Calibri"/>
           <w:noProof/>
-          <w:lang w:val="el-GR"/>
         </w:rPr>
         <w:t>4</w:t>
       </w:r>
@@ -2905,8 +2880,6 @@
           <w:rFonts w:ascii="Calibri" w:eastAsia="Arial" w:hAnsi="Calibri" w:cs="Calibri"/>
           <w:i/>
           <w:iCs/>
-          <w:sz w:val="22"/>
-          <w:szCs w:val="22"/>
           <w:lang w:val="el-GR"/>
         </w:rPr>
         <w:t>Προγραμματιστή (Ιδιοκτήτη)</w:t>
@@ -2932,8 +2905,6 @@
           <w:rFonts w:ascii="Calibri" w:eastAsia="Arial" w:hAnsi="Calibri" w:cs="Calibri"/>
           <w:i/>
           <w:iCs/>
-          <w:sz w:val="22"/>
-          <w:szCs w:val="22"/>
           <w:lang w:val="el-GR"/>
         </w:rPr>
         <w:t>Ιδιοκτήτη Οργανισμού</w:t>
@@ -2968,6 +2939,9 @@
         <w:jc w:val="center"/>
       </w:pPr>
       <w:r>
+        <w:rPr>
+          <w:noProof/>
+        </w:rPr>
         <w:drawing>
           <wp:inline distT="0" distB="0" distL="0" distR="0" wp14:anchorId="63269EFA" wp14:editId="60BAC4E5">
             <wp:extent cx="5943600" cy="3005455"/>
@@ -3277,8 +3251,6 @@
           <w:rFonts w:ascii="Calibri" w:eastAsia="Arial" w:hAnsi="Calibri" w:cs="Calibri"/>
           <w:i/>
           <w:iCs/>
-          <w:sz w:val="22"/>
-          <w:szCs w:val="22"/>
           <w:lang w:val="el-GR"/>
         </w:rPr>
         <w:t>Προγραμματιστή (Ιδιοκτήτη)</w:t>
@@ -3286,8 +3258,6 @@
       <w:r>
         <w:rPr>
           <w:rFonts w:ascii="Calibri" w:eastAsia="Arial" w:hAnsi="Calibri" w:cs="Calibri"/>
-          <w:sz w:val="22"/>
-          <w:szCs w:val="22"/>
           <w:lang w:val="el-GR"/>
         </w:rPr>
         <w:t xml:space="preserve"> </w:t>
@@ -3304,8 +3274,6 @@
           <w:rFonts w:ascii="Calibri" w:eastAsia="Arial" w:hAnsi="Calibri" w:cs="Calibri"/>
           <w:i/>
           <w:iCs/>
-          <w:sz w:val="22"/>
-          <w:szCs w:val="22"/>
           <w:lang w:val="el-GR"/>
         </w:rPr>
         <w:t>Ιδιοκτήτη Οργανισμού</w:t>
@@ -3589,8 +3557,6 @@
           <w:rFonts w:ascii="Calibri" w:eastAsia="Arial" w:hAnsi="Calibri" w:cs="Calibri"/>
           <w:i/>
           <w:iCs/>
-          <w:sz w:val="22"/>
-          <w:szCs w:val="22"/>
           <w:lang w:val="el-GR"/>
         </w:rPr>
         <w:t>Προγραμματιστή (Ιδιοκτήτη)</w:t>
@@ -3602,15 +3568,20 @@
           <w:szCs w:val="22"/>
           <w:lang w:val="el-GR"/>
         </w:rPr>
-        <w:t xml:space="preserve">, τον </w:t>
+        <w:t xml:space="preserve">, </w:t>
+      </w:r>
+      <w:r>
+        <w:rPr>
+          <w:rFonts w:ascii="Calibri" w:eastAsia="Arial" w:hAnsi="Calibri" w:cs="Calibri"/>
+          <w:lang w:val="el-GR"/>
+        </w:rPr>
+        <w:t xml:space="preserve">τον </w:t>
       </w:r>
       <w:r>
         <w:rPr>
           <w:rFonts w:ascii="Calibri" w:eastAsia="Arial" w:hAnsi="Calibri" w:cs="Calibri"/>
           <w:i/>
           <w:iCs/>
-          <w:sz w:val="22"/>
-          <w:szCs w:val="22"/>
           <w:lang w:val="el-GR"/>
         </w:rPr>
         <w:t>Συνεργάτη</w:t>
@@ -3618,8 +3589,6 @@
       <w:r>
         <w:rPr>
           <w:rFonts w:ascii="Calibri" w:eastAsia="Arial" w:hAnsi="Calibri" w:cs="Calibri"/>
-          <w:sz w:val="22"/>
-          <w:szCs w:val="22"/>
           <w:lang w:val="el-GR"/>
         </w:rPr>
         <w:t xml:space="preserve"> </w:t>
@@ -3636,8 +3605,6 @@
           <w:rFonts w:ascii="Calibri" w:eastAsia="Arial" w:hAnsi="Calibri" w:cs="Calibri"/>
           <w:i/>
           <w:iCs/>
-          <w:sz w:val="22"/>
-          <w:szCs w:val="22"/>
           <w:lang w:val="el-GR"/>
         </w:rPr>
         <w:t>Ιδιοκτήτη Οργανισμού</w:t>
@@ -3942,8 +3909,6 @@
           <w:rFonts w:ascii="Calibri" w:eastAsia="Arial" w:hAnsi="Calibri" w:cs="Calibri"/>
           <w:i/>
           <w:iCs/>
-          <w:sz w:val="22"/>
-          <w:szCs w:val="22"/>
           <w:lang w:val="el-GR"/>
         </w:rPr>
         <w:t>Προγραμματιστή (Ιδιοκτήτη)</w:t>
@@ -3953,8 +3918,6 @@
           <w:rFonts w:ascii="Calibri" w:eastAsia="Arial" w:hAnsi="Calibri" w:cs="Calibri"/>
           <w:i/>
           <w:iCs/>
-          <w:sz w:val="22"/>
-          <w:szCs w:val="22"/>
           <w:lang w:val="el-GR"/>
         </w:rPr>
         <w:t xml:space="preserve"> </w:t>
@@ -3971,8 +3934,6 @@
           <w:rFonts w:ascii="Calibri" w:eastAsia="Arial" w:hAnsi="Calibri" w:cs="Calibri"/>
           <w:i/>
           <w:iCs/>
-          <w:sz w:val="22"/>
-          <w:szCs w:val="22"/>
           <w:lang w:val="el-GR"/>
         </w:rPr>
         <w:t>Ιδιοκτήτη Οργανισμού</w:t>
@@ -4023,6 +3984,7 @@
       <w:r>
         <w:rPr>
           <w:rFonts w:ascii="Calibri" w:hAnsi="Calibri" w:cs="Calibri"/>
+          <w:noProof/>
         </w:rPr>
         <w:drawing>
           <wp:inline distT="0" distB="0" distL="0" distR="0" wp14:anchorId="76819580" wp14:editId="3FCBD314">
@@ -4067,6 +4029,7 @@
         <w:jc w:val="center"/>
         <w:rPr>
           <w:rFonts w:ascii="Calibri" w:hAnsi="Calibri" w:cs="Calibri"/>
+          <w:lang w:val="el-GR"/>
         </w:rPr>
       </w:pPr>
       <w:r>
@@ -4076,6 +4039,9 @@
         <w:t>Εικόνα</w:t>
       </w:r>
       <w:r>
+        <w:rPr>
+          <w:lang w:val="el-GR"/>
+        </w:rPr>
         <w:t xml:space="preserve"> 8</w:t>
       </w:r>
       <w:r>
@@ -4085,8 +4051,2822 @@
         <w:t xml:space="preserve">: Διαγραφή </w:t>
       </w:r>
       <w:r>
-        <w:t>CRC Card</w:t>
-      </w:r>
+        <w:t>CRC</w:t>
+      </w:r>
+      <w:r>
+        <w:rPr>
+          <w:lang w:val="el-GR"/>
+        </w:rPr>
+        <w:t xml:space="preserve"> </w:t>
+      </w:r>
+      <w:r>
+        <w:t>Card</w:t>
+      </w:r>
+    </w:p>
+    <w:p>
+      <w:pPr>
+        <w:rPr>
+          <w:rFonts w:ascii="Calibri" w:hAnsi="Calibri" w:cs="Calibri"/>
+          <w:lang w:val="el-GR"/>
+        </w:rPr>
+      </w:pPr>
+    </w:p>
+    <w:p>
+      <w:pPr>
+        <w:rPr>
+          <w:rFonts w:ascii="Calibri" w:hAnsi="Calibri" w:cs="Calibri"/>
+          <w:lang w:val="el-GR"/>
+        </w:rPr>
+      </w:pPr>
+    </w:p>
+    <w:p>
+      <w:pPr>
+        <w:rPr>
+          <w:rFonts w:ascii="Calibri" w:hAnsi="Calibri" w:cs="Calibri"/>
+          <w:lang w:val="el-GR"/>
+        </w:rPr>
+      </w:pPr>
+    </w:p>
+    <w:p>
+      <w:pPr>
+        <w:rPr>
+          <w:rFonts w:ascii="Calibri" w:hAnsi="Calibri" w:cs="Calibri"/>
+          <w:lang w:val="el-GR"/>
+        </w:rPr>
+      </w:pPr>
+    </w:p>
+    <w:p>
+      <w:pPr>
+        <w:rPr>
+          <w:rFonts w:ascii="Calibri" w:hAnsi="Calibri" w:cs="Calibri"/>
+          <w:lang w:val="el-GR"/>
+        </w:rPr>
+      </w:pPr>
+    </w:p>
+    <w:p>
+      <w:pPr>
+        <w:rPr>
+          <w:rFonts w:ascii="Calibri" w:hAnsi="Calibri" w:cs="Calibri"/>
+          <w:lang w:val="el-GR"/>
+        </w:rPr>
+      </w:pPr>
+    </w:p>
+    <w:p>
+      <w:pPr>
+        <w:rPr>
+          <w:rFonts w:ascii="Calibri" w:hAnsi="Calibri" w:cs="Calibri"/>
+          <w:lang w:val="el-GR"/>
+        </w:rPr>
+      </w:pPr>
+    </w:p>
+    <w:p>
+      <w:pPr>
+        <w:rPr>
+          <w:rFonts w:ascii="Calibri" w:hAnsi="Calibri" w:cs="Calibri"/>
+          <w:lang w:val="el-GR"/>
+        </w:rPr>
+      </w:pPr>
+    </w:p>
+    <w:p>
+      <w:pPr>
+        <w:pBdr>
+          <w:top w:val="single" w:sz="4" w:space="1" w:color="auto"/>
+          <w:bottom w:val="single" w:sz="4" w:space="1" w:color="auto"/>
+        </w:pBdr>
+        <w:jc w:val="center"/>
+        <w:rPr>
+          <w:rFonts w:ascii="Calibri" w:hAnsi="Calibri" w:cs="Calibri"/>
+          <w:b/>
+          <w:bCs/>
+          <w:lang w:val="el-GR"/>
+        </w:rPr>
+      </w:pPr>
+      <w:r>
+        <w:rPr>
+          <w:rFonts w:ascii="Calibri" w:hAnsi="Calibri" w:cs="Calibri"/>
+          <w:b/>
+          <w:bCs/>
+          <w:lang w:val="el-GR"/>
+        </w:rPr>
+        <w:t xml:space="preserve">Παραγωγή </w:t>
+      </w:r>
+      <w:r>
+        <w:rPr>
+          <w:rFonts w:ascii="Calibri" w:hAnsi="Calibri" w:cs="Calibri"/>
+          <w:b/>
+          <w:bCs/>
+        </w:rPr>
+        <w:t>script</w:t>
+      </w:r>
+      <w:r>
+        <w:rPr>
+          <w:rFonts w:ascii="Calibri" w:hAnsi="Calibri" w:cs="Calibri"/>
+          <w:b/>
+          <w:bCs/>
+          <w:lang w:val="el-GR"/>
+        </w:rPr>
+        <w:t xml:space="preserve"> </w:t>
+      </w:r>
+      <w:r>
+        <w:rPr>
+          <w:rFonts w:ascii="Calibri" w:hAnsi="Calibri" w:cs="Calibri"/>
+          <w:b/>
+          <w:bCs/>
+          <w:lang w:val="el-GR"/>
+        </w:rPr>
+        <w:t xml:space="preserve">Διαγράμματος </w:t>
+      </w:r>
+      <w:r>
+        <w:rPr>
+          <w:rFonts w:ascii="Calibri" w:hAnsi="Calibri" w:cs="Calibri"/>
+          <w:b/>
+          <w:bCs/>
+        </w:rPr>
+        <w:t>Use</w:t>
+      </w:r>
+      <w:r>
+        <w:rPr>
+          <w:rFonts w:ascii="Calibri" w:hAnsi="Calibri" w:cs="Calibri"/>
+          <w:b/>
+          <w:bCs/>
+          <w:lang w:val="el-GR"/>
+        </w:rPr>
+        <w:t xml:space="preserve"> </w:t>
+      </w:r>
+      <w:r>
+        <w:rPr>
+          <w:rFonts w:ascii="Calibri" w:hAnsi="Calibri" w:cs="Calibri"/>
+          <w:b/>
+          <w:bCs/>
+        </w:rPr>
+        <w:t>Case</w:t>
+      </w:r>
+    </w:p>
+    <w:p>
+      <w:pPr>
+        <w:jc w:val="both"/>
+        <w:rPr>
+          <w:rFonts w:ascii="Calibri" w:hAnsi="Calibri" w:cs="Calibri"/>
+          <w:lang w:val="el-GR"/>
+        </w:rPr>
+      </w:pPr>
+      <w:r>
+        <w:rPr>
+          <w:rFonts w:ascii="Calibri" w:hAnsi="Calibri" w:cs="Calibri"/>
+          <w:lang w:val="el-GR"/>
+        </w:rPr>
+        <w:t xml:space="preserve">Στην εικόνα </w:t>
+      </w:r>
+      <w:r>
+        <w:rPr>
+          <w:rFonts w:ascii="Calibri" w:hAnsi="Calibri" w:cs="Calibri"/>
+          <w:lang w:val="el-GR"/>
+        </w:rPr>
+        <w:t>9</w:t>
+      </w:r>
+      <w:r>
+        <w:rPr>
+          <w:rFonts w:ascii="Calibri" w:hAnsi="Calibri" w:cs="Calibri"/>
+          <w:lang w:val="el-GR"/>
+        </w:rPr>
+        <w:t>, παρουσιάζουμε το Διάγραμμα Ευρωστίας της Περίπτωσης Χρήσης «</w:t>
+      </w:r>
+      <w:r>
+        <w:rPr>
+          <w:rFonts w:ascii="Calibri" w:hAnsi="Calibri" w:cs="Calibri"/>
+          <w:lang w:val="el-GR"/>
+        </w:rPr>
+        <w:t xml:space="preserve">Παραγωγή </w:t>
+      </w:r>
+      <w:r>
+        <w:rPr>
+          <w:rFonts w:ascii="Calibri" w:hAnsi="Calibri" w:cs="Calibri"/>
+        </w:rPr>
+        <w:t>script</w:t>
+      </w:r>
+      <w:r>
+        <w:rPr>
+          <w:rFonts w:ascii="Calibri" w:hAnsi="Calibri" w:cs="Calibri"/>
+          <w:lang w:val="el-GR"/>
+        </w:rPr>
+        <w:t xml:space="preserve"> διαγράμματος </w:t>
+      </w:r>
+      <w:r>
+        <w:rPr>
+          <w:rFonts w:ascii="Calibri" w:hAnsi="Calibri" w:cs="Calibri"/>
+        </w:rPr>
+        <w:t>Use</w:t>
+      </w:r>
+      <w:r>
+        <w:rPr>
+          <w:rFonts w:ascii="Calibri" w:hAnsi="Calibri" w:cs="Calibri"/>
+          <w:lang w:val="el-GR"/>
+        </w:rPr>
+        <w:t xml:space="preserve"> </w:t>
+      </w:r>
+      <w:r>
+        <w:rPr>
+          <w:rFonts w:ascii="Calibri" w:hAnsi="Calibri" w:cs="Calibri"/>
+        </w:rPr>
+        <w:t>Case</w:t>
+      </w:r>
+      <w:r>
+        <w:rPr>
+          <w:rFonts w:ascii="Calibri" w:hAnsi="Calibri" w:cs="Calibri"/>
+          <w:lang w:val="el-GR"/>
+        </w:rPr>
+        <w:t xml:space="preserve">». Ως Χρήστη θεωρούμε και τον </w:t>
+      </w:r>
+      <w:r>
+        <w:rPr>
+          <w:rFonts w:ascii="Calibri" w:eastAsia="Arial" w:hAnsi="Calibri" w:cs="Calibri"/>
+          <w:i/>
+          <w:iCs/>
+          <w:lang w:val="el-GR"/>
+        </w:rPr>
+        <w:t>Προγραμματιστή (Ιδιοκτήτη)</w:t>
+      </w:r>
+      <w:r>
+        <w:rPr>
+          <w:rFonts w:ascii="Calibri" w:eastAsia="Arial" w:hAnsi="Calibri" w:cs="Calibri"/>
+          <w:i/>
+          <w:iCs/>
+          <w:lang w:val="el-GR"/>
+        </w:rPr>
+        <w:t>,</w:t>
+      </w:r>
+      <w:r>
+        <w:rPr>
+          <w:rFonts w:ascii="Calibri" w:eastAsia="Arial" w:hAnsi="Calibri" w:cs="Calibri"/>
+          <w:lang w:val="el-GR"/>
+        </w:rPr>
+        <w:t xml:space="preserve"> </w:t>
+      </w:r>
+      <w:r>
+        <w:rPr>
+          <w:rFonts w:ascii="Calibri" w:eastAsia="Arial" w:hAnsi="Calibri" w:cs="Calibri"/>
+          <w:sz w:val="22"/>
+          <w:szCs w:val="22"/>
+          <w:lang w:val="el-GR"/>
+        </w:rPr>
+        <w:t xml:space="preserve">τον </w:t>
+      </w:r>
+      <w:r>
+        <w:rPr>
+          <w:rFonts w:ascii="Calibri" w:eastAsia="Arial" w:hAnsi="Calibri" w:cs="Calibri"/>
+          <w:i/>
+          <w:iCs/>
+          <w:lang w:val="el-GR"/>
+        </w:rPr>
+        <w:t>Συνεργάτη</w:t>
+      </w:r>
+      <w:r>
+        <w:rPr>
+          <w:rFonts w:ascii="Calibri" w:eastAsia="Arial" w:hAnsi="Calibri" w:cs="Calibri"/>
+          <w:lang w:val="el-GR"/>
+        </w:rPr>
+        <w:t xml:space="preserve">, τον </w:t>
+      </w:r>
+      <w:proofErr w:type="spellStart"/>
+      <w:r>
+        <w:rPr>
+          <w:rFonts w:ascii="Calibri" w:eastAsia="Arial" w:hAnsi="Calibri" w:cs="Calibri"/>
+          <w:i/>
+          <w:iCs/>
+          <w:lang w:val="el-GR"/>
+        </w:rPr>
+        <w:t>Αξιολογητή</w:t>
+      </w:r>
+      <w:proofErr w:type="spellEnd"/>
+      <w:r>
+        <w:rPr>
+          <w:rFonts w:ascii="Calibri" w:eastAsia="Arial" w:hAnsi="Calibri" w:cs="Calibri"/>
+          <w:lang w:val="el-GR"/>
+        </w:rPr>
+        <w:t xml:space="preserve">, </w:t>
+      </w:r>
+      <w:r>
+        <w:rPr>
+          <w:rFonts w:ascii="Calibri" w:eastAsia="Arial" w:hAnsi="Calibri" w:cs="Calibri"/>
+          <w:i/>
+          <w:iCs/>
+          <w:sz w:val="22"/>
+          <w:szCs w:val="22"/>
+          <w:lang w:val="el-GR"/>
+        </w:rPr>
+        <w:t xml:space="preserve"> </w:t>
+      </w:r>
+      <w:r>
+        <w:rPr>
+          <w:rFonts w:ascii="Calibri" w:hAnsi="Calibri" w:cs="Calibri"/>
+          <w:lang w:val="el-GR"/>
+        </w:rPr>
+        <w:t xml:space="preserve">και τον </w:t>
+      </w:r>
+      <w:r>
+        <w:rPr>
+          <w:rFonts w:ascii="Calibri" w:eastAsia="Arial" w:hAnsi="Calibri" w:cs="Calibri"/>
+          <w:i/>
+          <w:iCs/>
+          <w:lang w:val="el-GR"/>
+        </w:rPr>
+        <w:t>Ιδιοκτήτη Οργανισμού</w:t>
+      </w:r>
+      <w:r>
+        <w:rPr>
+          <w:rFonts w:ascii="Calibri" w:hAnsi="Calibri" w:cs="Calibri"/>
+          <w:lang w:val="el-GR"/>
+        </w:rPr>
+        <w:t xml:space="preserve">. Για τους σκοπούς του συγκεκριμένου διαγράμματος προσθέσαμε ως Χειριστή τον γενικό όρο </w:t>
+      </w:r>
+      <w:r>
+        <w:rPr>
+          <w:rFonts w:ascii="Calibri" w:hAnsi="Calibri" w:cs="Calibri"/>
+          <w:i/>
+          <w:iCs/>
+          <w:lang w:val="el-GR"/>
+        </w:rPr>
+        <w:t>Χρήστης</w:t>
+      </w:r>
+      <w:r>
+        <w:rPr>
+          <w:rFonts w:ascii="Calibri" w:hAnsi="Calibri" w:cs="Calibri"/>
+          <w:lang w:val="el-GR"/>
+        </w:rPr>
+        <w:t>.</w:t>
+      </w:r>
+    </w:p>
+    <w:p>
+      <w:pPr>
+        <w:keepNext/>
+        <w:jc w:val="center"/>
+      </w:pPr>
+      <w:r>
+        <w:rPr>
+          <w:rFonts w:ascii="Calibri" w:hAnsi="Calibri" w:cs="Calibri"/>
+          <w:noProof/>
+          <w:lang w:val="el-GR"/>
+        </w:rPr>
+        <w:drawing>
+          <wp:inline distT="0" distB="0" distL="0" distR="0" wp14:anchorId="6BA52FDA" wp14:editId="7064E12A">
+            <wp:extent cx="5943600" cy="3768090"/>
+            <wp:effectExtent l="0" t="0" r="0" b="3810"/>
+            <wp:docPr id="1806754205" name="Picture 1"/>
+            <wp:cNvGraphicFramePr>
+              <a:graphicFrameLocks xmlns:a="http://schemas.openxmlformats.org/drawingml/2006/main" noChangeAspect="1"/>
+            </wp:cNvGraphicFramePr>
+            <a:graphic xmlns:a="http://schemas.openxmlformats.org/drawingml/2006/main">
+              <a:graphicData uri="http://schemas.openxmlformats.org/drawingml/2006/picture">
+                <pic:pic xmlns:pic="http://schemas.openxmlformats.org/drawingml/2006/picture">
+                  <pic:nvPicPr>
+                    <pic:cNvPr id="1806754205" name=""/>
+                    <pic:cNvPicPr/>
+                  </pic:nvPicPr>
+                  <pic:blipFill>
+                    <a:blip r:embed="rId17"/>
+                    <a:stretch>
+                      <a:fillRect/>
+                    </a:stretch>
+                  </pic:blipFill>
+                  <pic:spPr>
+                    <a:xfrm>
+                      <a:off x="0" y="0"/>
+                      <a:ext cx="5943600" cy="3768090"/>
+                    </a:xfrm>
+                    <a:prstGeom prst="rect">
+                      <a:avLst/>
+                    </a:prstGeom>
+                  </pic:spPr>
+                </pic:pic>
+              </a:graphicData>
+            </a:graphic>
+          </wp:inline>
+        </w:drawing>
+      </w:r>
+    </w:p>
+    <w:p>
+      <w:pPr>
+        <w:pStyle w:val="Caption"/>
+        <w:jc w:val="center"/>
+        <w:rPr>
+          <w:rFonts w:ascii="Calibri" w:hAnsi="Calibri" w:cs="Calibri"/>
+          <w:lang w:val="el-GR"/>
+        </w:rPr>
+      </w:pPr>
+      <w:r>
+        <w:rPr>
+          <w:lang w:val="el-GR"/>
+        </w:rPr>
+        <w:t>Εικόνα</w:t>
+      </w:r>
+      <w:r>
+        <w:rPr>
+          <w:lang w:val="el-GR"/>
+        </w:rPr>
+        <w:t xml:space="preserve"> 9</w:t>
+      </w:r>
+      <w:r>
+        <w:rPr>
+          <w:lang w:val="el-GR"/>
+        </w:rPr>
+        <w:t xml:space="preserve">: Παραγωγή </w:t>
+      </w:r>
+      <w:r>
+        <w:t>script</w:t>
+      </w:r>
+      <w:r>
+        <w:rPr>
+          <w:lang w:val="el-GR"/>
+        </w:rPr>
+        <w:t xml:space="preserve"> </w:t>
+      </w:r>
+      <w:r>
+        <w:rPr>
+          <w:lang w:val="el-GR"/>
+        </w:rPr>
+        <w:t xml:space="preserve">διαγράμματος </w:t>
+      </w:r>
+      <w:r>
+        <w:t>Use</w:t>
+      </w:r>
+      <w:r>
+        <w:rPr>
+          <w:lang w:val="el-GR"/>
+        </w:rPr>
+        <w:t xml:space="preserve"> </w:t>
+      </w:r>
+      <w:r>
+        <w:t>Case</w:t>
+      </w:r>
+    </w:p>
+    <w:p>
+      <w:pPr>
+        <w:rPr>
+          <w:rFonts w:ascii="Calibri" w:hAnsi="Calibri" w:cs="Calibri"/>
+          <w:lang w:val="el-GR"/>
+        </w:rPr>
+      </w:pPr>
+    </w:p>
+    <w:p>
+      <w:pPr>
+        <w:rPr>
+          <w:rFonts w:ascii="Calibri" w:hAnsi="Calibri" w:cs="Calibri"/>
+          <w:lang w:val="el-GR"/>
+        </w:rPr>
+      </w:pPr>
+    </w:p>
+    <w:p>
+      <w:pPr>
+        <w:rPr>
+          <w:rFonts w:ascii="Calibri" w:hAnsi="Calibri" w:cs="Calibri"/>
+          <w:lang w:val="el-GR"/>
+        </w:rPr>
+      </w:pPr>
+    </w:p>
+    <w:p>
+      <w:pPr>
+        <w:rPr>
+          <w:rFonts w:ascii="Calibri" w:hAnsi="Calibri" w:cs="Calibri"/>
+          <w:lang w:val="el-GR"/>
+        </w:rPr>
+      </w:pPr>
+    </w:p>
+    <w:p>
+      <w:pPr>
+        <w:rPr>
+          <w:rFonts w:ascii="Calibri" w:hAnsi="Calibri" w:cs="Calibri"/>
+          <w:lang w:val="el-GR"/>
+        </w:rPr>
+      </w:pPr>
+    </w:p>
+    <w:p>
+      <w:pPr>
+        <w:rPr>
+          <w:rFonts w:ascii="Calibri" w:hAnsi="Calibri" w:cs="Calibri"/>
+          <w:lang w:val="el-GR"/>
+        </w:rPr>
+      </w:pPr>
+    </w:p>
+    <w:p>
+      <w:pPr>
+        <w:rPr>
+          <w:rFonts w:ascii="Calibri" w:hAnsi="Calibri" w:cs="Calibri"/>
+          <w:lang w:val="el-GR"/>
+        </w:rPr>
+      </w:pPr>
+    </w:p>
+    <w:p>
+      <w:pPr>
+        <w:rPr>
+          <w:rFonts w:ascii="Calibri" w:hAnsi="Calibri" w:cs="Calibri"/>
+          <w:lang w:val="el-GR"/>
+        </w:rPr>
+      </w:pPr>
+    </w:p>
+    <w:p>
+      <w:pPr>
+        <w:rPr>
+          <w:rFonts w:ascii="Calibri" w:hAnsi="Calibri" w:cs="Calibri"/>
+          <w:lang w:val="el-GR"/>
+        </w:rPr>
+      </w:pPr>
+    </w:p>
+    <w:p>
+      <w:pPr>
+        <w:pBdr>
+          <w:top w:val="single" w:sz="4" w:space="1" w:color="auto"/>
+          <w:bottom w:val="single" w:sz="4" w:space="1" w:color="auto"/>
+        </w:pBdr>
+        <w:jc w:val="center"/>
+        <w:rPr>
+          <w:rFonts w:ascii="Calibri" w:hAnsi="Calibri" w:cs="Calibri"/>
+          <w:b/>
+          <w:bCs/>
+          <w:lang w:val="el-GR"/>
+        </w:rPr>
+      </w:pPr>
+      <w:r>
+        <w:rPr>
+          <w:rFonts w:ascii="Calibri" w:hAnsi="Calibri" w:cs="Calibri"/>
+          <w:b/>
+          <w:bCs/>
+          <w:lang w:val="el-GR"/>
+        </w:rPr>
+        <w:t xml:space="preserve">Παραγωγή </w:t>
+      </w:r>
+      <w:r>
+        <w:rPr>
+          <w:rFonts w:ascii="Calibri" w:hAnsi="Calibri" w:cs="Calibri"/>
+          <w:b/>
+          <w:bCs/>
+        </w:rPr>
+        <w:t>script</w:t>
+      </w:r>
+      <w:r>
+        <w:rPr>
+          <w:rFonts w:ascii="Calibri" w:hAnsi="Calibri" w:cs="Calibri"/>
+          <w:b/>
+          <w:bCs/>
+          <w:lang w:val="el-GR"/>
+        </w:rPr>
+        <w:t xml:space="preserve"> </w:t>
+      </w:r>
+      <w:r>
+        <w:rPr>
+          <w:rFonts w:ascii="Calibri" w:hAnsi="Calibri" w:cs="Calibri"/>
+          <w:b/>
+          <w:bCs/>
+          <w:lang w:val="el-GR"/>
+        </w:rPr>
+        <w:t xml:space="preserve">Διαγράμματος </w:t>
+      </w:r>
+      <w:proofErr w:type="spellStart"/>
+      <w:r>
+        <w:rPr>
+          <w:rFonts w:ascii="Calibri" w:hAnsi="Calibri" w:cs="Calibri"/>
+          <w:b/>
+          <w:bCs/>
+          <w:lang w:val="el-GR"/>
+        </w:rPr>
+        <w:t>Διαγράμματος</w:t>
+      </w:r>
+      <w:proofErr w:type="spellEnd"/>
+      <w:r>
+        <w:rPr>
+          <w:rFonts w:ascii="Calibri" w:hAnsi="Calibri" w:cs="Calibri"/>
+          <w:b/>
+          <w:bCs/>
+          <w:lang w:val="el-GR"/>
+        </w:rPr>
+        <w:t xml:space="preserve"> Κλάσεων</w:t>
+      </w:r>
+    </w:p>
+    <w:p>
+      <w:pPr>
+        <w:jc w:val="both"/>
+        <w:rPr>
+          <w:rFonts w:ascii="Calibri" w:hAnsi="Calibri" w:cs="Calibri"/>
+          <w:lang w:val="el-GR"/>
+        </w:rPr>
+      </w:pPr>
+      <w:r>
+        <w:rPr>
+          <w:rFonts w:ascii="Calibri" w:hAnsi="Calibri" w:cs="Calibri"/>
+          <w:lang w:val="el-GR"/>
+        </w:rPr>
+        <w:t xml:space="preserve">Στην εικόνα </w:t>
+      </w:r>
+      <w:r>
+        <w:rPr>
+          <w:rFonts w:ascii="Calibri" w:hAnsi="Calibri" w:cs="Calibri"/>
+          <w:lang w:val="el-GR"/>
+        </w:rPr>
+        <w:t>10</w:t>
+      </w:r>
+      <w:r>
+        <w:rPr>
+          <w:rFonts w:ascii="Calibri" w:hAnsi="Calibri" w:cs="Calibri"/>
+          <w:lang w:val="el-GR"/>
+        </w:rPr>
+        <w:t xml:space="preserve">, παρουσιάζουμε το Διάγραμμα Ευρωστίας της Περίπτωσης Χρήσης «Παραγωγή </w:t>
+      </w:r>
+      <w:r>
+        <w:rPr>
+          <w:rFonts w:ascii="Calibri" w:hAnsi="Calibri" w:cs="Calibri"/>
+        </w:rPr>
+        <w:t>script</w:t>
+      </w:r>
+      <w:r>
+        <w:rPr>
+          <w:rFonts w:ascii="Calibri" w:hAnsi="Calibri" w:cs="Calibri"/>
+          <w:lang w:val="el-GR"/>
+        </w:rPr>
+        <w:t xml:space="preserve"> διαγράμματος </w:t>
+      </w:r>
+      <w:proofErr w:type="spellStart"/>
+      <w:r>
+        <w:rPr>
+          <w:rFonts w:ascii="Calibri" w:hAnsi="Calibri" w:cs="Calibri"/>
+          <w:lang w:val="el-GR"/>
+        </w:rPr>
+        <w:t>Διαγράμματος</w:t>
+      </w:r>
+      <w:proofErr w:type="spellEnd"/>
+      <w:r>
+        <w:rPr>
+          <w:rFonts w:ascii="Calibri" w:hAnsi="Calibri" w:cs="Calibri"/>
+          <w:lang w:val="el-GR"/>
+        </w:rPr>
+        <w:t xml:space="preserve"> Κλάσεων</w:t>
+      </w:r>
+      <w:r>
+        <w:rPr>
+          <w:rFonts w:ascii="Calibri" w:hAnsi="Calibri" w:cs="Calibri"/>
+          <w:lang w:val="el-GR"/>
+        </w:rPr>
+        <w:t xml:space="preserve">». Ως Χρήστη θεωρούμε και τον </w:t>
+      </w:r>
+      <w:r>
+        <w:rPr>
+          <w:rFonts w:ascii="Calibri" w:eastAsia="Arial" w:hAnsi="Calibri" w:cs="Calibri"/>
+          <w:i/>
+          <w:iCs/>
+          <w:lang w:val="el-GR"/>
+        </w:rPr>
+        <w:t>Προγραμματιστή (Ιδιοκτήτη),</w:t>
+      </w:r>
+      <w:r>
+        <w:rPr>
+          <w:rFonts w:ascii="Calibri" w:eastAsia="Arial" w:hAnsi="Calibri" w:cs="Calibri"/>
+          <w:lang w:val="el-GR"/>
+        </w:rPr>
+        <w:t xml:space="preserve"> </w:t>
+      </w:r>
+      <w:r>
+        <w:rPr>
+          <w:rFonts w:ascii="Calibri" w:eastAsia="Arial" w:hAnsi="Calibri" w:cs="Calibri"/>
+          <w:sz w:val="22"/>
+          <w:szCs w:val="22"/>
+          <w:lang w:val="el-GR"/>
+        </w:rPr>
+        <w:t xml:space="preserve">τον </w:t>
+      </w:r>
+      <w:r>
+        <w:rPr>
+          <w:rFonts w:ascii="Calibri" w:eastAsia="Arial" w:hAnsi="Calibri" w:cs="Calibri"/>
+          <w:i/>
+          <w:iCs/>
+          <w:lang w:val="el-GR"/>
+        </w:rPr>
+        <w:t>Συνεργάτη</w:t>
+      </w:r>
+      <w:r>
+        <w:rPr>
+          <w:rFonts w:ascii="Calibri" w:eastAsia="Arial" w:hAnsi="Calibri" w:cs="Calibri"/>
+          <w:lang w:val="el-GR"/>
+        </w:rPr>
+        <w:t xml:space="preserve">, τον </w:t>
+      </w:r>
+      <w:proofErr w:type="spellStart"/>
+      <w:r>
+        <w:rPr>
+          <w:rFonts w:ascii="Calibri" w:eastAsia="Arial" w:hAnsi="Calibri" w:cs="Calibri"/>
+          <w:i/>
+          <w:iCs/>
+          <w:lang w:val="el-GR"/>
+        </w:rPr>
+        <w:t>Αξιολογητή</w:t>
+      </w:r>
+      <w:proofErr w:type="spellEnd"/>
+      <w:r>
+        <w:rPr>
+          <w:rFonts w:ascii="Calibri" w:eastAsia="Arial" w:hAnsi="Calibri" w:cs="Calibri"/>
+          <w:lang w:val="el-GR"/>
+        </w:rPr>
+        <w:t xml:space="preserve">, </w:t>
+      </w:r>
+      <w:r>
+        <w:rPr>
+          <w:rFonts w:ascii="Calibri" w:eastAsia="Arial" w:hAnsi="Calibri" w:cs="Calibri"/>
+          <w:i/>
+          <w:iCs/>
+          <w:sz w:val="22"/>
+          <w:szCs w:val="22"/>
+          <w:lang w:val="el-GR"/>
+        </w:rPr>
+        <w:t xml:space="preserve"> </w:t>
+      </w:r>
+      <w:r>
+        <w:rPr>
+          <w:rFonts w:ascii="Calibri" w:hAnsi="Calibri" w:cs="Calibri"/>
+          <w:lang w:val="el-GR"/>
+        </w:rPr>
+        <w:t xml:space="preserve">και τον </w:t>
+      </w:r>
+      <w:r>
+        <w:rPr>
+          <w:rFonts w:ascii="Calibri" w:eastAsia="Arial" w:hAnsi="Calibri" w:cs="Calibri"/>
+          <w:i/>
+          <w:iCs/>
+          <w:lang w:val="el-GR"/>
+        </w:rPr>
+        <w:t>Ιδιοκτήτη Οργανισμού</w:t>
+      </w:r>
+      <w:r>
+        <w:rPr>
+          <w:rFonts w:ascii="Calibri" w:hAnsi="Calibri" w:cs="Calibri"/>
+          <w:lang w:val="el-GR"/>
+        </w:rPr>
+        <w:t xml:space="preserve">. Για τους σκοπούς του συγκεκριμένου διαγράμματος προσθέσαμε ως Χειριστή τον γενικό όρο </w:t>
+      </w:r>
+      <w:r>
+        <w:rPr>
+          <w:rFonts w:ascii="Calibri" w:hAnsi="Calibri" w:cs="Calibri"/>
+          <w:i/>
+          <w:iCs/>
+          <w:lang w:val="el-GR"/>
+        </w:rPr>
+        <w:t>Χρήστης</w:t>
+      </w:r>
+      <w:r>
+        <w:rPr>
+          <w:rFonts w:ascii="Calibri" w:hAnsi="Calibri" w:cs="Calibri"/>
+          <w:lang w:val="el-GR"/>
+        </w:rPr>
+        <w:t>.</w:t>
+      </w:r>
+    </w:p>
+    <w:p>
+      <w:pPr>
+        <w:keepNext/>
+        <w:jc w:val="center"/>
+      </w:pPr>
+      <w:r>
+        <w:rPr>
+          <w:rFonts w:ascii="Calibri" w:hAnsi="Calibri" w:cs="Calibri"/>
+          <w:noProof/>
+          <w:lang w:val="el-GR"/>
+        </w:rPr>
+        <w:drawing>
+          <wp:inline distT="0" distB="0" distL="0" distR="0" wp14:anchorId="0AC5C425" wp14:editId="007817FD">
+            <wp:extent cx="5943600" cy="3460750"/>
+            <wp:effectExtent l="0" t="0" r="0" b="6350"/>
+            <wp:docPr id="381856395" name="Picture 1"/>
+            <wp:cNvGraphicFramePr>
+              <a:graphicFrameLocks xmlns:a="http://schemas.openxmlformats.org/drawingml/2006/main" noChangeAspect="1"/>
+            </wp:cNvGraphicFramePr>
+            <a:graphic xmlns:a="http://schemas.openxmlformats.org/drawingml/2006/main">
+              <a:graphicData uri="http://schemas.openxmlformats.org/drawingml/2006/picture">
+                <pic:pic xmlns:pic="http://schemas.openxmlformats.org/drawingml/2006/picture">
+                  <pic:nvPicPr>
+                    <pic:cNvPr id="381856395" name=""/>
+                    <pic:cNvPicPr/>
+                  </pic:nvPicPr>
+                  <pic:blipFill>
+                    <a:blip r:embed="rId18"/>
+                    <a:stretch>
+                      <a:fillRect/>
+                    </a:stretch>
+                  </pic:blipFill>
+                  <pic:spPr>
+                    <a:xfrm>
+                      <a:off x="0" y="0"/>
+                      <a:ext cx="5943600" cy="3460750"/>
+                    </a:xfrm>
+                    <a:prstGeom prst="rect">
+                      <a:avLst/>
+                    </a:prstGeom>
+                  </pic:spPr>
+                </pic:pic>
+              </a:graphicData>
+            </a:graphic>
+          </wp:inline>
+        </w:drawing>
+      </w:r>
+    </w:p>
+    <w:p>
+      <w:pPr>
+        <w:pStyle w:val="Caption"/>
+        <w:jc w:val="center"/>
+        <w:rPr>
+          <w:rFonts w:ascii="Calibri" w:hAnsi="Calibri" w:cs="Calibri"/>
+          <w:lang w:val="el-GR"/>
+        </w:rPr>
+      </w:pPr>
+      <w:r>
+        <w:rPr>
+          <w:lang w:val="el-GR"/>
+        </w:rPr>
+        <w:t>Εικόνα</w:t>
+      </w:r>
+      <w:r>
+        <w:rPr>
+          <w:lang w:val="el-GR"/>
+        </w:rPr>
+        <w:t xml:space="preserve"> </w:t>
+      </w:r>
+      <w:r>
+        <w:fldChar w:fldCharType="begin"/>
+      </w:r>
+      <w:r>
+        <w:rPr>
+          <w:lang w:val="el-GR"/>
+        </w:rPr>
+        <w:instrText xml:space="preserve"> </w:instrText>
+      </w:r>
+      <w:r>
+        <w:instrText>SEQ</w:instrText>
+      </w:r>
+      <w:r>
+        <w:rPr>
+          <w:lang w:val="el-GR"/>
+        </w:rPr>
+        <w:instrText xml:space="preserve"> </w:instrText>
+      </w:r>
+      <w:r>
+        <w:instrText>Figure</w:instrText>
+      </w:r>
+      <w:r>
+        <w:rPr>
+          <w:lang w:val="el-GR"/>
+        </w:rPr>
+        <w:instrText xml:space="preserve"> \* </w:instrText>
+      </w:r>
+      <w:r>
+        <w:instrText>ARABIC</w:instrText>
+      </w:r>
+      <w:r>
+        <w:rPr>
+          <w:lang w:val="el-GR"/>
+        </w:rPr>
+        <w:instrText xml:space="preserve"> </w:instrText>
+      </w:r>
+      <w:r>
+        <w:fldChar w:fldCharType="separate"/>
+      </w:r>
+      <w:r>
+        <w:rPr>
+          <w:noProof/>
+          <w:lang w:val="el-GR"/>
+        </w:rPr>
+        <w:t>1</w:t>
+      </w:r>
+      <w:r>
+        <w:fldChar w:fldCharType="end"/>
+      </w:r>
+      <w:r>
+        <w:rPr>
+          <w:lang w:val="el-GR"/>
+        </w:rPr>
+        <w:t xml:space="preserve">0: Παραγωγή </w:t>
+      </w:r>
+      <w:r>
+        <w:t>script</w:t>
+      </w:r>
+      <w:r>
+        <w:rPr>
+          <w:lang w:val="el-GR"/>
+        </w:rPr>
+        <w:t xml:space="preserve"> </w:t>
+      </w:r>
+      <w:r>
+        <w:rPr>
+          <w:lang w:val="el-GR"/>
+        </w:rPr>
+        <w:t>διαγράμματος κλάσεων</w:t>
+      </w:r>
+    </w:p>
+    <w:p>
+      <w:pPr>
+        <w:rPr>
+          <w:rFonts w:ascii="Calibri" w:hAnsi="Calibri" w:cs="Calibri"/>
+          <w:lang w:val="el-GR"/>
+        </w:rPr>
+      </w:pPr>
+    </w:p>
+    <w:p>
+      <w:pPr>
+        <w:rPr>
+          <w:rFonts w:ascii="Calibri" w:hAnsi="Calibri" w:cs="Calibri"/>
+          <w:lang w:val="el-GR"/>
+        </w:rPr>
+      </w:pPr>
+    </w:p>
+    <w:p>
+      <w:pPr>
+        <w:rPr>
+          <w:rFonts w:ascii="Calibri" w:hAnsi="Calibri" w:cs="Calibri"/>
+          <w:lang w:val="el-GR"/>
+        </w:rPr>
+      </w:pPr>
+    </w:p>
+    <w:p>
+      <w:pPr>
+        <w:rPr>
+          <w:rFonts w:ascii="Calibri" w:hAnsi="Calibri" w:cs="Calibri"/>
+          <w:lang w:val="el-GR"/>
+        </w:rPr>
+      </w:pPr>
+    </w:p>
+    <w:p>
+      <w:pPr>
+        <w:rPr>
+          <w:rFonts w:ascii="Calibri" w:hAnsi="Calibri" w:cs="Calibri"/>
+          <w:lang w:val="el-GR"/>
+        </w:rPr>
+      </w:pPr>
+    </w:p>
+    <w:p>
+      <w:pPr>
+        <w:rPr>
+          <w:rFonts w:ascii="Calibri" w:hAnsi="Calibri" w:cs="Calibri"/>
+          <w:lang w:val="el-GR"/>
+        </w:rPr>
+      </w:pPr>
+    </w:p>
+    <w:p>
+      <w:pPr>
+        <w:rPr>
+          <w:rFonts w:ascii="Calibri" w:hAnsi="Calibri" w:cs="Calibri"/>
+          <w:lang w:val="el-GR"/>
+        </w:rPr>
+      </w:pPr>
+    </w:p>
+    <w:p>
+      <w:pPr>
+        <w:rPr>
+          <w:rFonts w:ascii="Calibri" w:hAnsi="Calibri" w:cs="Calibri"/>
+          <w:lang w:val="el-GR"/>
+        </w:rPr>
+      </w:pPr>
+    </w:p>
+    <w:p>
+      <w:pPr>
+        <w:rPr>
+          <w:rFonts w:ascii="Calibri" w:hAnsi="Calibri" w:cs="Calibri"/>
+          <w:lang w:val="el-GR"/>
+        </w:rPr>
+      </w:pPr>
+    </w:p>
+    <w:p>
+      <w:pPr>
+        <w:rPr>
+          <w:rFonts w:ascii="Calibri" w:hAnsi="Calibri" w:cs="Calibri"/>
+          <w:lang w:val="el-GR"/>
+        </w:rPr>
+      </w:pPr>
+    </w:p>
+    <w:p>
+      <w:pPr>
+        <w:pBdr>
+          <w:top w:val="single" w:sz="4" w:space="1" w:color="auto"/>
+          <w:bottom w:val="single" w:sz="4" w:space="1" w:color="auto"/>
+        </w:pBdr>
+        <w:jc w:val="center"/>
+        <w:rPr>
+          <w:rFonts w:ascii="Calibri" w:hAnsi="Calibri" w:cs="Calibri"/>
+          <w:b/>
+          <w:bCs/>
+          <w:lang w:val="el-GR"/>
+        </w:rPr>
+      </w:pPr>
+      <w:r>
+        <w:rPr>
+          <w:rFonts w:ascii="Calibri" w:hAnsi="Calibri" w:cs="Calibri"/>
+          <w:b/>
+          <w:bCs/>
+          <w:lang w:val="el-GR"/>
+        </w:rPr>
+        <w:t xml:space="preserve">Αντιγραφή παραγόμενου </w:t>
+      </w:r>
+      <w:r>
+        <w:rPr>
+          <w:rFonts w:ascii="Calibri" w:hAnsi="Calibri" w:cs="Calibri"/>
+          <w:b/>
+          <w:bCs/>
+        </w:rPr>
+        <w:t>script</w:t>
+      </w:r>
+    </w:p>
+    <w:p>
+      <w:pPr>
+        <w:jc w:val="both"/>
+        <w:rPr>
+          <w:rFonts w:ascii="Calibri" w:hAnsi="Calibri" w:cs="Calibri"/>
+          <w:lang w:val="el-GR"/>
+        </w:rPr>
+      </w:pPr>
+      <w:r>
+        <w:rPr>
+          <w:rFonts w:ascii="Calibri" w:hAnsi="Calibri" w:cs="Calibri"/>
+          <w:lang w:val="el-GR"/>
+        </w:rPr>
+        <w:t xml:space="preserve">Στην εικόνα </w:t>
+      </w:r>
+      <w:r>
+        <w:rPr>
+          <w:rFonts w:ascii="Calibri" w:hAnsi="Calibri" w:cs="Calibri"/>
+          <w:lang w:val="el-GR"/>
+        </w:rPr>
+        <w:t>1</w:t>
+      </w:r>
+      <w:r>
+        <w:rPr>
+          <w:rFonts w:ascii="Calibri" w:hAnsi="Calibri" w:cs="Calibri"/>
+          <w:lang w:val="el-GR"/>
+        </w:rPr>
+        <w:t>1</w:t>
+      </w:r>
+      <w:r>
+        <w:rPr>
+          <w:rFonts w:ascii="Calibri" w:hAnsi="Calibri" w:cs="Calibri"/>
+          <w:lang w:val="el-GR"/>
+        </w:rPr>
+        <w:t>, παρουσιάζουμε το Διάγραμμα Ευρωστίας της Περίπτωσης Χρήσης «</w:t>
+      </w:r>
+      <w:r>
+        <w:rPr>
+          <w:rFonts w:ascii="Calibri" w:hAnsi="Calibri" w:cs="Calibri"/>
+          <w:lang w:val="el-GR"/>
+        </w:rPr>
+        <w:t>Αντιγραφή</w:t>
+      </w:r>
+      <w:r>
+        <w:rPr>
+          <w:rFonts w:ascii="Calibri" w:hAnsi="Calibri" w:cs="Calibri"/>
+          <w:lang w:val="el-GR"/>
+        </w:rPr>
+        <w:t xml:space="preserve"> </w:t>
+      </w:r>
+      <w:r>
+        <w:rPr>
+          <w:rFonts w:ascii="Calibri" w:hAnsi="Calibri" w:cs="Calibri"/>
+          <w:lang w:val="el-GR"/>
+        </w:rPr>
+        <w:t xml:space="preserve">παραγόμενου </w:t>
+      </w:r>
+      <w:r>
+        <w:rPr>
+          <w:rFonts w:ascii="Calibri" w:hAnsi="Calibri" w:cs="Calibri"/>
+        </w:rPr>
+        <w:t>script</w:t>
+      </w:r>
+      <w:r>
+        <w:rPr>
+          <w:rFonts w:ascii="Calibri" w:hAnsi="Calibri" w:cs="Calibri"/>
+          <w:lang w:val="el-GR"/>
+        </w:rPr>
+        <w:t xml:space="preserve">». Ως Χρήστη θεωρούμε και τον </w:t>
+      </w:r>
+      <w:r>
+        <w:rPr>
+          <w:rFonts w:ascii="Calibri" w:eastAsia="Arial" w:hAnsi="Calibri" w:cs="Calibri"/>
+          <w:i/>
+          <w:iCs/>
+          <w:lang w:val="el-GR"/>
+        </w:rPr>
+        <w:t>Προγραμματιστή (Ιδιοκτήτη),</w:t>
+      </w:r>
+      <w:r>
+        <w:rPr>
+          <w:rFonts w:ascii="Calibri" w:eastAsia="Arial" w:hAnsi="Calibri" w:cs="Calibri"/>
+          <w:lang w:val="el-GR"/>
+        </w:rPr>
+        <w:t xml:space="preserve"> </w:t>
+      </w:r>
+      <w:r>
+        <w:rPr>
+          <w:rFonts w:ascii="Calibri" w:eastAsia="Arial" w:hAnsi="Calibri" w:cs="Calibri"/>
+          <w:sz w:val="22"/>
+          <w:szCs w:val="22"/>
+          <w:lang w:val="el-GR"/>
+        </w:rPr>
+        <w:t xml:space="preserve">τον </w:t>
+      </w:r>
+      <w:r>
+        <w:rPr>
+          <w:rFonts w:ascii="Calibri" w:eastAsia="Arial" w:hAnsi="Calibri" w:cs="Calibri"/>
+          <w:i/>
+          <w:iCs/>
+          <w:lang w:val="el-GR"/>
+        </w:rPr>
+        <w:t>Συνεργάτη</w:t>
+      </w:r>
+      <w:r>
+        <w:rPr>
+          <w:rFonts w:ascii="Calibri" w:eastAsia="Arial" w:hAnsi="Calibri" w:cs="Calibri"/>
+          <w:lang w:val="el-GR"/>
+        </w:rPr>
+        <w:t xml:space="preserve">, τον </w:t>
+      </w:r>
+      <w:proofErr w:type="spellStart"/>
+      <w:r>
+        <w:rPr>
+          <w:rFonts w:ascii="Calibri" w:eastAsia="Arial" w:hAnsi="Calibri" w:cs="Calibri"/>
+          <w:i/>
+          <w:iCs/>
+          <w:lang w:val="el-GR"/>
+        </w:rPr>
+        <w:t>Αξιολογητή</w:t>
+      </w:r>
+      <w:proofErr w:type="spellEnd"/>
+      <w:r>
+        <w:rPr>
+          <w:rFonts w:ascii="Calibri" w:eastAsia="Arial" w:hAnsi="Calibri" w:cs="Calibri"/>
+          <w:lang w:val="el-GR"/>
+        </w:rPr>
+        <w:t xml:space="preserve">, </w:t>
+      </w:r>
+      <w:r>
+        <w:rPr>
+          <w:rFonts w:ascii="Calibri" w:eastAsia="Arial" w:hAnsi="Calibri" w:cs="Calibri"/>
+          <w:i/>
+          <w:iCs/>
+          <w:sz w:val="22"/>
+          <w:szCs w:val="22"/>
+          <w:lang w:val="el-GR"/>
+        </w:rPr>
+        <w:t xml:space="preserve"> </w:t>
+      </w:r>
+      <w:r>
+        <w:rPr>
+          <w:rFonts w:ascii="Calibri" w:hAnsi="Calibri" w:cs="Calibri"/>
+          <w:lang w:val="el-GR"/>
+        </w:rPr>
+        <w:t xml:space="preserve">και τον </w:t>
+      </w:r>
+      <w:r>
+        <w:rPr>
+          <w:rFonts w:ascii="Calibri" w:eastAsia="Arial" w:hAnsi="Calibri" w:cs="Calibri"/>
+          <w:i/>
+          <w:iCs/>
+          <w:lang w:val="el-GR"/>
+        </w:rPr>
+        <w:t>Ιδιοκτήτη Οργανισμού</w:t>
+      </w:r>
+      <w:r>
+        <w:rPr>
+          <w:rFonts w:ascii="Calibri" w:hAnsi="Calibri" w:cs="Calibri"/>
+          <w:lang w:val="el-GR"/>
+        </w:rPr>
+        <w:t xml:space="preserve">. Για τους σκοπούς του συγκεκριμένου διαγράμματος προσθέσαμε ως Χειριστή τον γενικό όρο </w:t>
+      </w:r>
+      <w:r>
+        <w:rPr>
+          <w:rFonts w:ascii="Calibri" w:hAnsi="Calibri" w:cs="Calibri"/>
+          <w:i/>
+          <w:iCs/>
+          <w:lang w:val="el-GR"/>
+        </w:rPr>
+        <w:t>Χρήστης</w:t>
+      </w:r>
+      <w:r>
+        <w:rPr>
+          <w:rFonts w:ascii="Calibri" w:hAnsi="Calibri" w:cs="Calibri"/>
+          <w:lang w:val="el-GR"/>
+        </w:rPr>
+        <w:t>.</w:t>
+      </w:r>
+    </w:p>
+    <w:p>
+      <w:pPr>
+        <w:rPr>
+          <w:rFonts w:ascii="Calibri" w:hAnsi="Calibri" w:cs="Calibri"/>
+          <w:lang w:val="el-GR"/>
+        </w:rPr>
+      </w:pPr>
+    </w:p>
+    <w:p>
+      <w:pPr>
+        <w:rPr>
+          <w:rFonts w:ascii="Calibri" w:hAnsi="Calibri" w:cs="Calibri"/>
+          <w:lang w:val="el-GR"/>
+        </w:rPr>
+      </w:pPr>
+    </w:p>
+    <w:p>
+      <w:pPr>
+        <w:rPr>
+          <w:rFonts w:ascii="Calibri" w:hAnsi="Calibri" w:cs="Calibri"/>
+          <w:lang w:val="el-GR"/>
+        </w:rPr>
+      </w:pPr>
+    </w:p>
+    <w:p>
+      <w:pPr>
+        <w:rPr>
+          <w:rFonts w:ascii="Calibri" w:hAnsi="Calibri" w:cs="Calibri"/>
+          <w:lang w:val="el-GR"/>
+        </w:rPr>
+      </w:pPr>
+    </w:p>
+    <w:p>
+      <w:pPr>
+        <w:rPr>
+          <w:rFonts w:ascii="Calibri" w:hAnsi="Calibri" w:cs="Calibri"/>
+          <w:lang w:val="el-GR"/>
+        </w:rPr>
+      </w:pPr>
+    </w:p>
+    <w:p>
+      <w:pPr>
+        <w:rPr>
+          <w:rFonts w:ascii="Calibri" w:hAnsi="Calibri" w:cs="Calibri"/>
+          <w:lang w:val="el-GR"/>
+        </w:rPr>
+      </w:pPr>
+    </w:p>
+    <w:p>
+      <w:pPr>
+        <w:rPr>
+          <w:rFonts w:ascii="Calibri" w:hAnsi="Calibri" w:cs="Calibri"/>
+          <w:lang w:val="el-GR"/>
+        </w:rPr>
+      </w:pPr>
+    </w:p>
+    <w:p>
+      <w:pPr>
+        <w:rPr>
+          <w:rFonts w:ascii="Calibri" w:hAnsi="Calibri" w:cs="Calibri"/>
+          <w:lang w:val="el-GR"/>
+        </w:rPr>
+      </w:pPr>
+    </w:p>
+    <w:p>
+      <w:pPr>
+        <w:rPr>
+          <w:rFonts w:ascii="Calibri" w:hAnsi="Calibri" w:cs="Calibri"/>
+          <w:lang w:val="el-GR"/>
+        </w:rPr>
+      </w:pPr>
+    </w:p>
+    <w:p>
+      <w:pPr>
+        <w:rPr>
+          <w:rFonts w:ascii="Calibri" w:hAnsi="Calibri" w:cs="Calibri"/>
+          <w:lang w:val="el-GR"/>
+        </w:rPr>
+      </w:pPr>
+    </w:p>
+    <w:p>
+      <w:pPr>
+        <w:rPr>
+          <w:rFonts w:ascii="Calibri" w:hAnsi="Calibri" w:cs="Calibri"/>
+          <w:lang w:val="el-GR"/>
+        </w:rPr>
+      </w:pPr>
+    </w:p>
+    <w:p>
+      <w:pPr>
+        <w:rPr>
+          <w:rFonts w:ascii="Calibri" w:hAnsi="Calibri" w:cs="Calibri"/>
+          <w:lang w:val="el-GR"/>
+        </w:rPr>
+      </w:pPr>
+    </w:p>
+    <w:p>
+      <w:pPr>
+        <w:rPr>
+          <w:rFonts w:ascii="Calibri" w:hAnsi="Calibri" w:cs="Calibri"/>
+          <w:lang w:val="el-GR"/>
+        </w:rPr>
+      </w:pPr>
+    </w:p>
+    <w:p>
+      <w:pPr>
+        <w:rPr>
+          <w:rFonts w:ascii="Calibri" w:hAnsi="Calibri" w:cs="Calibri"/>
+          <w:lang w:val="el-GR"/>
+        </w:rPr>
+      </w:pPr>
+    </w:p>
+    <w:p>
+      <w:pPr>
+        <w:rPr>
+          <w:rFonts w:ascii="Calibri" w:hAnsi="Calibri" w:cs="Calibri"/>
+          <w:lang w:val="el-GR"/>
+        </w:rPr>
+      </w:pPr>
+    </w:p>
+    <w:p>
+      <w:pPr>
+        <w:rPr>
+          <w:rFonts w:ascii="Calibri" w:hAnsi="Calibri" w:cs="Calibri"/>
+          <w:lang w:val="el-GR"/>
+        </w:rPr>
+      </w:pPr>
+    </w:p>
+    <w:p>
+      <w:pPr>
+        <w:rPr>
+          <w:rFonts w:ascii="Calibri" w:hAnsi="Calibri" w:cs="Calibri"/>
+          <w:lang w:val="el-GR"/>
+        </w:rPr>
+      </w:pPr>
+    </w:p>
+    <w:p>
+      <w:pPr>
+        <w:rPr>
+          <w:rFonts w:ascii="Calibri" w:hAnsi="Calibri" w:cs="Calibri"/>
+          <w:lang w:val="el-GR"/>
+        </w:rPr>
+      </w:pPr>
+    </w:p>
+    <w:p>
+      <w:pPr>
+        <w:rPr>
+          <w:rFonts w:ascii="Calibri" w:hAnsi="Calibri" w:cs="Calibri"/>
+          <w:lang w:val="el-GR"/>
+        </w:rPr>
+      </w:pPr>
+    </w:p>
+    <w:p>
+      <w:pPr>
+        <w:rPr>
+          <w:rFonts w:ascii="Calibri" w:hAnsi="Calibri" w:cs="Calibri"/>
+          <w:lang w:val="el-GR"/>
+        </w:rPr>
+      </w:pPr>
+    </w:p>
+    <w:p>
+      <w:pPr>
+        <w:rPr>
+          <w:rFonts w:ascii="Calibri" w:hAnsi="Calibri" w:cs="Calibri"/>
+          <w:lang w:val="el-GR"/>
+        </w:rPr>
+      </w:pPr>
+    </w:p>
+    <w:p>
+      <w:pPr>
+        <w:rPr>
+          <w:rFonts w:ascii="Calibri" w:hAnsi="Calibri" w:cs="Calibri"/>
+          <w:lang w:val="el-GR"/>
+        </w:rPr>
+      </w:pPr>
+    </w:p>
+    <w:p>
+      <w:pPr>
+        <w:pBdr>
+          <w:top w:val="single" w:sz="4" w:space="1" w:color="auto"/>
+          <w:bottom w:val="single" w:sz="4" w:space="1" w:color="auto"/>
+        </w:pBdr>
+        <w:jc w:val="center"/>
+        <w:rPr>
+          <w:rFonts w:ascii="Calibri" w:hAnsi="Calibri" w:cs="Calibri"/>
+          <w:b/>
+          <w:bCs/>
+          <w:lang w:val="el-GR"/>
+        </w:rPr>
+      </w:pPr>
+      <w:r>
+        <w:rPr>
+          <w:rFonts w:ascii="Calibri" w:hAnsi="Calibri" w:cs="Calibri"/>
+          <w:b/>
+          <w:bCs/>
+          <w:lang w:val="el-GR"/>
+        </w:rPr>
+        <w:t xml:space="preserve">Διαμοιρασμός </w:t>
+      </w:r>
+      <w:r>
+        <w:rPr>
+          <w:rFonts w:ascii="Calibri" w:hAnsi="Calibri" w:cs="Calibri"/>
+          <w:b/>
+          <w:bCs/>
+        </w:rPr>
+        <w:t>Project</w:t>
+      </w:r>
+      <w:r>
+        <w:rPr>
+          <w:rFonts w:ascii="Calibri" w:hAnsi="Calibri" w:cs="Calibri"/>
+          <w:b/>
+          <w:bCs/>
+          <w:lang w:val="el-GR"/>
+        </w:rPr>
+        <w:t xml:space="preserve"> </w:t>
+      </w:r>
+    </w:p>
+    <w:p>
+      <w:pPr>
+        <w:jc w:val="both"/>
+        <w:rPr>
+          <w:rFonts w:ascii="Calibri" w:hAnsi="Calibri" w:cs="Calibri"/>
+          <w:lang w:val="el-GR"/>
+        </w:rPr>
+      </w:pPr>
+      <w:r>
+        <w:rPr>
+          <w:rFonts w:ascii="Calibri" w:hAnsi="Calibri" w:cs="Calibri"/>
+          <w:lang w:val="el-GR"/>
+        </w:rPr>
+        <w:t xml:space="preserve">Στην εικόνα </w:t>
+      </w:r>
+      <w:r>
+        <w:rPr>
+          <w:rFonts w:ascii="Calibri" w:hAnsi="Calibri" w:cs="Calibri"/>
+          <w:lang w:val="el-GR"/>
+        </w:rPr>
+        <w:t>1</w:t>
+      </w:r>
+      <w:r>
+        <w:rPr>
+          <w:rFonts w:ascii="Calibri" w:hAnsi="Calibri" w:cs="Calibri"/>
+          <w:lang w:val="el-GR"/>
+        </w:rPr>
+        <w:t>2</w:t>
+      </w:r>
+      <w:r>
+        <w:rPr>
+          <w:rFonts w:ascii="Calibri" w:hAnsi="Calibri" w:cs="Calibri"/>
+          <w:lang w:val="el-GR"/>
+        </w:rPr>
+        <w:t>, παρουσιάζουμε το Διάγραμμα Ευρωστίας της Περίπτωσης Χρήσης «</w:t>
+      </w:r>
+      <w:r>
+        <w:rPr>
+          <w:rFonts w:ascii="Calibri" w:hAnsi="Calibri" w:cs="Calibri"/>
+          <w:lang w:val="el-GR"/>
+        </w:rPr>
+        <w:t>Διαμοιρασμός</w:t>
+      </w:r>
+      <w:r>
+        <w:rPr>
+          <w:rFonts w:ascii="Calibri" w:hAnsi="Calibri" w:cs="Calibri"/>
+          <w:lang w:val="el-GR"/>
+        </w:rPr>
+        <w:t xml:space="preserve"> </w:t>
+      </w:r>
+      <w:r>
+        <w:rPr>
+          <w:rFonts w:ascii="Calibri" w:hAnsi="Calibri" w:cs="Calibri"/>
+        </w:rPr>
+        <w:t>Project</w:t>
+      </w:r>
+      <w:r>
+        <w:rPr>
+          <w:rFonts w:ascii="Calibri" w:hAnsi="Calibri" w:cs="Calibri"/>
+          <w:lang w:val="el-GR"/>
+        </w:rPr>
+        <w:t xml:space="preserve">». Ως Χρήστη θεωρούμε  τον </w:t>
+      </w:r>
+      <w:r>
+        <w:rPr>
+          <w:rFonts w:ascii="Calibri" w:eastAsia="Arial" w:hAnsi="Calibri" w:cs="Calibri"/>
+          <w:i/>
+          <w:iCs/>
+          <w:lang w:val="el-GR"/>
+        </w:rPr>
+        <w:t>Ιδιοκτήτη Οργανισμού</w:t>
+      </w:r>
+      <w:r>
+        <w:rPr>
+          <w:rFonts w:ascii="Calibri" w:hAnsi="Calibri" w:cs="Calibri"/>
+          <w:lang w:val="el-GR"/>
+        </w:rPr>
+        <w:t>.</w:t>
+      </w:r>
+    </w:p>
+    <w:p>
+      <w:pPr>
+        <w:keepNext/>
+        <w:jc w:val="center"/>
+      </w:pPr>
+      <w:r>
+        <w:rPr>
+          <w:rFonts w:ascii="Calibri" w:hAnsi="Calibri" w:cs="Calibri"/>
+          <w:lang w:val="el-GR"/>
+        </w:rPr>
+        <w:drawing>
+          <wp:inline distT="0" distB="0" distL="0" distR="0" wp14:anchorId="00C6E71C" wp14:editId="58F1FE0C">
+            <wp:extent cx="5943600" cy="5644515"/>
+            <wp:effectExtent l="0" t="0" r="0" b="0"/>
+            <wp:docPr id="895530561" name="Picture 1"/>
+            <wp:cNvGraphicFramePr>
+              <a:graphicFrameLocks xmlns:a="http://schemas.openxmlformats.org/drawingml/2006/main" noChangeAspect="1"/>
+            </wp:cNvGraphicFramePr>
+            <a:graphic xmlns:a="http://schemas.openxmlformats.org/drawingml/2006/main">
+              <a:graphicData uri="http://schemas.openxmlformats.org/drawingml/2006/picture">
+                <pic:pic xmlns:pic="http://schemas.openxmlformats.org/drawingml/2006/picture">
+                  <pic:nvPicPr>
+                    <pic:cNvPr id="895530561" name=""/>
+                    <pic:cNvPicPr/>
+                  </pic:nvPicPr>
+                  <pic:blipFill>
+                    <a:blip r:embed="rId19"/>
+                    <a:stretch>
+                      <a:fillRect/>
+                    </a:stretch>
+                  </pic:blipFill>
+                  <pic:spPr>
+                    <a:xfrm>
+                      <a:off x="0" y="0"/>
+                      <a:ext cx="5943600" cy="5644515"/>
+                    </a:xfrm>
+                    <a:prstGeom prst="rect">
+                      <a:avLst/>
+                    </a:prstGeom>
+                  </pic:spPr>
+                </pic:pic>
+              </a:graphicData>
+            </a:graphic>
+          </wp:inline>
+        </w:drawing>
+      </w:r>
+    </w:p>
+    <w:p>
+      <w:pPr>
+        <w:pStyle w:val="Caption"/>
+        <w:jc w:val="center"/>
+        <w:rPr>
+          <w:rFonts w:ascii="Calibri" w:hAnsi="Calibri" w:cs="Calibri"/>
+          <w:lang w:val="el-GR"/>
+        </w:rPr>
+      </w:pPr>
+      <w:proofErr w:type="spellStart"/>
+      <w:r>
+        <w:t>Εικόν</w:t>
+      </w:r>
+      <w:proofErr w:type="spellEnd"/>
+      <w:r>
+        <w:t>α 12</w:t>
+      </w:r>
+      <w:r>
+        <w:rPr>
+          <w:lang w:val="el-GR"/>
+        </w:rPr>
+        <w:t xml:space="preserve">: Διαμοιρασμός </w:t>
+      </w:r>
+      <w:r>
+        <w:t>Project</w:t>
+      </w:r>
+    </w:p>
+    <w:p>
+      <w:pPr>
+        <w:rPr>
+          <w:rFonts w:ascii="Calibri" w:hAnsi="Calibri" w:cs="Calibri"/>
+          <w:lang w:val="el-GR"/>
+        </w:rPr>
+      </w:pPr>
+    </w:p>
+    <w:p>
+      <w:pPr>
+        <w:rPr>
+          <w:rFonts w:ascii="Calibri" w:hAnsi="Calibri" w:cs="Calibri"/>
+          <w:lang w:val="el-GR"/>
+        </w:rPr>
+      </w:pPr>
+    </w:p>
+    <w:p>
+      <w:pPr>
+        <w:rPr>
+          <w:rFonts w:ascii="Calibri" w:hAnsi="Calibri" w:cs="Calibri"/>
+          <w:lang w:val="el-GR"/>
+        </w:rPr>
+      </w:pPr>
+    </w:p>
+    <w:p>
+      <w:pPr>
+        <w:rPr>
+          <w:rFonts w:ascii="Calibri" w:hAnsi="Calibri" w:cs="Calibri"/>
+        </w:rPr>
+      </w:pPr>
+    </w:p>
+    <w:p>
+      <w:pPr>
+        <w:pBdr>
+          <w:top w:val="single" w:sz="4" w:space="1" w:color="auto"/>
+          <w:bottom w:val="single" w:sz="4" w:space="1" w:color="auto"/>
+        </w:pBdr>
+        <w:jc w:val="center"/>
+        <w:rPr>
+          <w:rFonts w:ascii="Calibri" w:hAnsi="Calibri" w:cs="Calibri"/>
+          <w:b/>
+          <w:bCs/>
+          <w:lang w:val="el-GR"/>
+        </w:rPr>
+      </w:pPr>
+      <w:r>
+        <w:rPr>
+          <w:rFonts w:ascii="Calibri" w:hAnsi="Calibri" w:cs="Calibri"/>
+          <w:b/>
+          <w:bCs/>
+          <w:lang w:val="el-GR"/>
+        </w:rPr>
+        <w:t>Διαχείριση</w:t>
+      </w:r>
+      <w:r>
+        <w:rPr>
+          <w:rFonts w:ascii="Calibri" w:hAnsi="Calibri" w:cs="Calibri"/>
+          <w:b/>
+          <w:bCs/>
+          <w:lang w:val="el-GR"/>
+        </w:rPr>
+        <w:t xml:space="preserve"> </w:t>
+      </w:r>
+      <w:r>
+        <w:rPr>
+          <w:rFonts w:ascii="Calibri" w:hAnsi="Calibri" w:cs="Calibri"/>
+          <w:b/>
+          <w:bCs/>
+          <w:lang w:val="el-GR"/>
+        </w:rPr>
+        <w:t>Χρηστών</w:t>
+      </w:r>
+    </w:p>
+    <w:p>
+      <w:pPr>
+        <w:jc w:val="both"/>
+        <w:rPr>
+          <w:rFonts w:ascii="Calibri" w:hAnsi="Calibri" w:cs="Calibri"/>
+          <w:lang w:val="el-GR"/>
+        </w:rPr>
+      </w:pPr>
+      <w:r>
+        <w:rPr>
+          <w:rFonts w:ascii="Calibri" w:hAnsi="Calibri" w:cs="Calibri"/>
+          <w:lang w:val="el-GR"/>
+        </w:rPr>
+        <w:t xml:space="preserve">Στην εικόνα </w:t>
+      </w:r>
+      <w:r>
+        <w:rPr>
+          <w:rFonts w:ascii="Calibri" w:hAnsi="Calibri" w:cs="Calibri"/>
+          <w:lang w:val="el-GR"/>
+        </w:rPr>
+        <w:t>1</w:t>
+      </w:r>
+      <w:r>
+        <w:rPr>
+          <w:rFonts w:ascii="Calibri" w:hAnsi="Calibri" w:cs="Calibri"/>
+          <w:lang w:val="el-GR"/>
+        </w:rPr>
+        <w:t>3</w:t>
+      </w:r>
+      <w:r>
+        <w:rPr>
+          <w:rFonts w:ascii="Calibri" w:hAnsi="Calibri" w:cs="Calibri"/>
+          <w:lang w:val="el-GR"/>
+        </w:rPr>
+        <w:t>, παρουσιάζουμε το Διάγραμμα Ευρωστίας της Περίπτωσης Χρήσης «</w:t>
+      </w:r>
+      <w:r>
+        <w:rPr>
+          <w:rFonts w:ascii="Calibri" w:hAnsi="Calibri" w:cs="Calibri"/>
+          <w:lang w:val="el-GR"/>
+        </w:rPr>
+        <w:t>Διαχείριση Χρηστών</w:t>
+      </w:r>
+      <w:r>
+        <w:rPr>
+          <w:rFonts w:ascii="Calibri" w:hAnsi="Calibri" w:cs="Calibri"/>
+          <w:lang w:val="el-GR"/>
+        </w:rPr>
+        <w:t xml:space="preserve">». Ως Χρήστη θεωρούμε  τον </w:t>
+      </w:r>
+      <w:r>
+        <w:rPr>
+          <w:rFonts w:ascii="Calibri" w:eastAsia="Arial" w:hAnsi="Calibri" w:cs="Calibri"/>
+          <w:i/>
+          <w:iCs/>
+          <w:lang w:val="el-GR"/>
+        </w:rPr>
+        <w:t>Διαχειριστή</w:t>
+      </w:r>
+      <w:r>
+        <w:rPr>
+          <w:rFonts w:ascii="Calibri" w:hAnsi="Calibri" w:cs="Calibri"/>
+          <w:lang w:val="el-GR"/>
+        </w:rPr>
+        <w:t>.</w:t>
+      </w:r>
+    </w:p>
+    <w:p>
+      <w:pPr>
+        <w:keepNext/>
+        <w:jc w:val="center"/>
+      </w:pPr>
+      <w:r>
+        <w:rPr>
+          <w:rFonts w:ascii="Calibri" w:hAnsi="Calibri" w:cs="Calibri"/>
+          <w:lang w:val="el-GR"/>
+        </w:rPr>
+        <w:drawing>
+          <wp:inline distT="0" distB="0" distL="0" distR="0" wp14:anchorId="3712D5F5" wp14:editId="1459971A">
+            <wp:extent cx="5943600" cy="5033010"/>
+            <wp:effectExtent l="0" t="0" r="0" b="0"/>
+            <wp:docPr id="858168845" name="Picture 1"/>
+            <wp:cNvGraphicFramePr>
+              <a:graphicFrameLocks xmlns:a="http://schemas.openxmlformats.org/drawingml/2006/main" noChangeAspect="1"/>
+            </wp:cNvGraphicFramePr>
+            <a:graphic xmlns:a="http://schemas.openxmlformats.org/drawingml/2006/main">
+              <a:graphicData uri="http://schemas.openxmlformats.org/drawingml/2006/picture">
+                <pic:pic xmlns:pic="http://schemas.openxmlformats.org/drawingml/2006/picture">
+                  <pic:nvPicPr>
+                    <pic:cNvPr id="858168845" name=""/>
+                    <pic:cNvPicPr/>
+                  </pic:nvPicPr>
+                  <pic:blipFill>
+                    <a:blip r:embed="rId20"/>
+                    <a:stretch>
+                      <a:fillRect/>
+                    </a:stretch>
+                  </pic:blipFill>
+                  <pic:spPr>
+                    <a:xfrm>
+                      <a:off x="0" y="0"/>
+                      <a:ext cx="5943600" cy="5033010"/>
+                    </a:xfrm>
+                    <a:prstGeom prst="rect">
+                      <a:avLst/>
+                    </a:prstGeom>
+                  </pic:spPr>
+                </pic:pic>
+              </a:graphicData>
+            </a:graphic>
+          </wp:inline>
+        </w:drawing>
+      </w:r>
+    </w:p>
+    <w:p>
+      <w:pPr>
+        <w:pStyle w:val="Caption"/>
+        <w:jc w:val="center"/>
+        <w:rPr>
+          <w:rFonts w:ascii="Calibri" w:hAnsi="Calibri" w:cs="Calibri"/>
+          <w:lang w:val="el-GR"/>
+        </w:rPr>
+      </w:pPr>
+      <w:proofErr w:type="spellStart"/>
+      <w:r>
+        <w:t>Εικόν</w:t>
+      </w:r>
+      <w:proofErr w:type="spellEnd"/>
+      <w:r>
+        <w:t xml:space="preserve">α </w:t>
+      </w:r>
+      <w:r>
+        <w:rPr>
+          <w:lang w:val="el-GR"/>
+        </w:rPr>
+        <w:t>13: Διαχείριση Χρηστών</w:t>
+      </w:r>
+    </w:p>
+    <w:p>
+      <w:pPr>
+        <w:rPr>
+          <w:rFonts w:ascii="Calibri" w:hAnsi="Calibri" w:cs="Calibri"/>
+          <w:lang w:val="el-GR"/>
+        </w:rPr>
+      </w:pPr>
+    </w:p>
+    <w:p>
+      <w:pPr>
+        <w:rPr>
+          <w:rFonts w:ascii="Calibri" w:hAnsi="Calibri" w:cs="Calibri"/>
+          <w:lang w:val="el-GR"/>
+        </w:rPr>
+      </w:pPr>
+    </w:p>
+    <w:p>
+      <w:pPr>
+        <w:rPr>
+          <w:rFonts w:ascii="Calibri" w:hAnsi="Calibri" w:cs="Calibri"/>
+          <w:lang w:val="el-GR"/>
+        </w:rPr>
+      </w:pPr>
+    </w:p>
+    <w:p>
+      <w:pPr>
+        <w:rPr>
+          <w:rFonts w:ascii="Calibri" w:hAnsi="Calibri" w:cs="Calibri"/>
+          <w:lang w:val="el-GR"/>
+        </w:rPr>
+      </w:pPr>
+    </w:p>
+    <w:p>
+      <w:pPr>
+        <w:rPr>
+          <w:rFonts w:ascii="Calibri" w:hAnsi="Calibri" w:cs="Calibri"/>
+          <w:lang w:val="el-GR"/>
+        </w:rPr>
+      </w:pPr>
+    </w:p>
+    <w:p>
+      <w:pPr>
+        <w:rPr>
+          <w:rFonts w:ascii="Calibri" w:hAnsi="Calibri" w:cs="Calibri"/>
+        </w:rPr>
+      </w:pPr>
+    </w:p>
+    <w:p>
+      <w:pPr>
+        <w:pBdr>
+          <w:top w:val="single" w:sz="4" w:space="1" w:color="auto"/>
+          <w:bottom w:val="single" w:sz="4" w:space="1" w:color="auto"/>
+        </w:pBdr>
+        <w:jc w:val="center"/>
+        <w:rPr>
+          <w:rFonts w:ascii="Calibri" w:hAnsi="Calibri" w:cs="Calibri"/>
+          <w:b/>
+          <w:bCs/>
+          <w:lang w:val="el-GR"/>
+        </w:rPr>
+      </w:pPr>
+      <w:r>
+        <w:rPr>
+          <w:rFonts w:ascii="Calibri" w:hAnsi="Calibri" w:cs="Calibri"/>
+          <w:b/>
+          <w:bCs/>
+          <w:lang w:val="el-GR"/>
+        </w:rPr>
+        <w:t>Προσθήκη Σχολίου</w:t>
+      </w:r>
+    </w:p>
+    <w:p>
+      <w:pPr>
+        <w:jc w:val="both"/>
+        <w:rPr>
+          <w:rFonts w:ascii="Calibri" w:hAnsi="Calibri" w:cs="Calibri"/>
+          <w:lang w:val="el-GR"/>
+        </w:rPr>
+      </w:pPr>
+      <w:r>
+        <w:rPr>
+          <w:rFonts w:ascii="Calibri" w:hAnsi="Calibri" w:cs="Calibri"/>
+          <w:lang w:val="el-GR"/>
+        </w:rPr>
+        <w:t xml:space="preserve">Στην εικόνα </w:t>
+      </w:r>
+      <w:r>
+        <w:rPr>
+          <w:rFonts w:ascii="Calibri" w:hAnsi="Calibri" w:cs="Calibri"/>
+          <w:lang w:val="el-GR"/>
+        </w:rPr>
+        <w:t>1</w:t>
+      </w:r>
+      <w:r>
+        <w:rPr>
+          <w:rFonts w:ascii="Calibri" w:hAnsi="Calibri" w:cs="Calibri"/>
+          <w:lang w:val="el-GR"/>
+        </w:rPr>
+        <w:t>4</w:t>
+      </w:r>
+      <w:r>
+        <w:rPr>
+          <w:rFonts w:ascii="Calibri" w:hAnsi="Calibri" w:cs="Calibri"/>
+          <w:lang w:val="el-GR"/>
+        </w:rPr>
+        <w:t>, παρουσιάζουμε το Διάγραμμα Ευρωστίας της Περίπτωσης Χρήσης «</w:t>
+      </w:r>
+      <w:r>
+        <w:rPr>
+          <w:rFonts w:ascii="Calibri" w:hAnsi="Calibri" w:cs="Calibri"/>
+          <w:lang w:val="el-GR"/>
+        </w:rPr>
+        <w:t>Προσθήκη Σχολίου</w:t>
+      </w:r>
+      <w:r>
+        <w:rPr>
+          <w:rFonts w:ascii="Calibri" w:hAnsi="Calibri" w:cs="Calibri"/>
+          <w:lang w:val="el-GR"/>
+        </w:rPr>
+        <w:t xml:space="preserve">». Ως Χρήστη θεωρούμε  τον </w:t>
+      </w:r>
+      <w:proofErr w:type="spellStart"/>
+      <w:r>
+        <w:rPr>
+          <w:rFonts w:ascii="Calibri" w:eastAsia="Arial" w:hAnsi="Calibri" w:cs="Calibri"/>
+          <w:i/>
+          <w:iCs/>
+          <w:lang w:val="el-GR"/>
+        </w:rPr>
+        <w:t>Αξιολογητή</w:t>
+      </w:r>
+      <w:proofErr w:type="spellEnd"/>
+      <w:r>
+        <w:rPr>
+          <w:rFonts w:ascii="Calibri" w:eastAsia="Arial" w:hAnsi="Calibri" w:cs="Calibri"/>
+          <w:i/>
+          <w:iCs/>
+          <w:lang w:val="el-GR"/>
+        </w:rPr>
+        <w:t xml:space="preserve"> </w:t>
+      </w:r>
+      <w:r>
+        <w:rPr>
+          <w:rFonts w:ascii="Calibri" w:eastAsia="Arial" w:hAnsi="Calibri" w:cs="Calibri"/>
+          <w:lang w:val="el-GR"/>
+        </w:rPr>
+        <w:t>και</w:t>
+      </w:r>
+      <w:r>
+        <w:rPr>
+          <w:rFonts w:ascii="Calibri" w:eastAsia="Arial" w:hAnsi="Calibri" w:cs="Calibri"/>
+          <w:i/>
+          <w:iCs/>
+          <w:lang w:val="el-GR"/>
+        </w:rPr>
+        <w:t xml:space="preserve"> τον Συνεργάτη</w:t>
+      </w:r>
+      <w:r>
+        <w:rPr>
+          <w:rFonts w:ascii="Calibri" w:hAnsi="Calibri" w:cs="Calibri"/>
+          <w:lang w:val="el-GR"/>
+        </w:rPr>
+        <w:t>.</w:t>
+      </w:r>
+      <w:r>
+        <w:rPr>
+          <w:lang w:val="el-GR"/>
+        </w:rPr>
+        <w:t xml:space="preserve"> </w:t>
+      </w:r>
+      <w:r>
+        <w:rPr>
+          <w:rFonts w:ascii="Calibri" w:hAnsi="Calibri" w:cs="Calibri"/>
+          <w:lang w:val="el-GR"/>
+        </w:rPr>
+        <w:t xml:space="preserve">Για τους σκοπούς του συγκεκριμένου διαγράμματος προσθέσαμε ως Χειριστή τον γενικό όρο </w:t>
+      </w:r>
+      <w:r>
+        <w:rPr>
+          <w:rFonts w:ascii="Calibri" w:hAnsi="Calibri" w:cs="Calibri"/>
+          <w:i/>
+          <w:iCs/>
+          <w:lang w:val="el-GR"/>
+        </w:rPr>
+        <w:t>Χρήστης</w:t>
+      </w:r>
+      <w:r>
+        <w:rPr>
+          <w:rFonts w:ascii="Calibri" w:hAnsi="Calibri" w:cs="Calibri"/>
+          <w:i/>
+          <w:iCs/>
+          <w:lang w:val="el-GR"/>
+        </w:rPr>
+        <w:t xml:space="preserve"> </w:t>
+      </w:r>
+      <w:r>
+        <w:rPr>
+          <w:rFonts w:ascii="Calibri" w:hAnsi="Calibri" w:cs="Calibri"/>
+          <w:i/>
+          <w:iCs/>
+          <w:lang w:val="el-GR"/>
+        </w:rPr>
+        <w:t>και παρουσιάζουμε το διάγραμμα προσθήκης σχολίου σε Περίπτωση Χρήσης (</w:t>
+      </w:r>
+      <w:r>
+        <w:rPr>
+          <w:rFonts w:ascii="Calibri" w:hAnsi="Calibri" w:cs="Calibri"/>
+          <w:i/>
+          <w:iCs/>
+        </w:rPr>
+        <w:t>U</w:t>
+      </w:r>
+      <w:r>
+        <w:rPr>
+          <w:rFonts w:ascii="Calibri" w:hAnsi="Calibri" w:cs="Calibri"/>
+          <w:i/>
+          <w:iCs/>
+        </w:rPr>
+        <w:t>s</w:t>
+      </w:r>
+      <w:r>
+        <w:rPr>
+          <w:rFonts w:ascii="Calibri" w:hAnsi="Calibri" w:cs="Calibri"/>
+          <w:i/>
+          <w:iCs/>
+        </w:rPr>
+        <w:t>e</w:t>
+      </w:r>
+      <w:r>
+        <w:rPr>
+          <w:rFonts w:ascii="Calibri" w:hAnsi="Calibri" w:cs="Calibri"/>
+          <w:i/>
+          <w:iCs/>
+          <w:lang w:val="el-GR"/>
+        </w:rPr>
+        <w:t xml:space="preserve"> </w:t>
+      </w:r>
+      <w:r>
+        <w:rPr>
+          <w:rFonts w:ascii="Calibri" w:hAnsi="Calibri" w:cs="Calibri"/>
+          <w:i/>
+          <w:iCs/>
+        </w:rPr>
+        <w:t>Case</w:t>
+      </w:r>
+      <w:r>
+        <w:rPr>
+          <w:rFonts w:ascii="Calibri" w:hAnsi="Calibri" w:cs="Calibri"/>
+          <w:i/>
+          <w:iCs/>
+          <w:lang w:val="el-GR"/>
+        </w:rPr>
+        <w:t>)</w:t>
+      </w:r>
+      <w:r>
+        <w:rPr>
+          <w:rFonts w:ascii="Calibri" w:hAnsi="Calibri" w:cs="Calibri"/>
+          <w:lang w:val="el-GR"/>
+        </w:rPr>
+        <w:t>.</w:t>
+      </w:r>
+    </w:p>
+    <w:p>
+      <w:pPr>
+        <w:keepNext/>
+        <w:jc w:val="center"/>
+      </w:pPr>
+      <w:r>
+        <w:rPr>
+          <w:rFonts w:ascii="Calibri" w:hAnsi="Calibri" w:cs="Calibri"/>
+          <w:lang w:val="el-GR"/>
+        </w:rPr>
+        <w:drawing>
+          <wp:inline distT="0" distB="0" distL="0" distR="0" wp14:anchorId="61852F84" wp14:editId="07230C53">
+            <wp:extent cx="5943600" cy="4474845"/>
+            <wp:effectExtent l="0" t="0" r="0" b="1905"/>
+            <wp:docPr id="330089002" name="Picture 1"/>
+            <wp:cNvGraphicFramePr>
+              <a:graphicFrameLocks xmlns:a="http://schemas.openxmlformats.org/drawingml/2006/main" noChangeAspect="1"/>
+            </wp:cNvGraphicFramePr>
+            <a:graphic xmlns:a="http://schemas.openxmlformats.org/drawingml/2006/main">
+              <a:graphicData uri="http://schemas.openxmlformats.org/drawingml/2006/picture">
+                <pic:pic xmlns:pic="http://schemas.openxmlformats.org/drawingml/2006/picture">
+                  <pic:nvPicPr>
+                    <pic:cNvPr id="330089002" name=""/>
+                    <pic:cNvPicPr/>
+                  </pic:nvPicPr>
+                  <pic:blipFill>
+                    <a:blip r:embed="rId21"/>
+                    <a:stretch>
+                      <a:fillRect/>
+                    </a:stretch>
+                  </pic:blipFill>
+                  <pic:spPr>
+                    <a:xfrm>
+                      <a:off x="0" y="0"/>
+                      <a:ext cx="5943600" cy="4474845"/>
+                    </a:xfrm>
+                    <a:prstGeom prst="rect">
+                      <a:avLst/>
+                    </a:prstGeom>
+                  </pic:spPr>
+                </pic:pic>
+              </a:graphicData>
+            </a:graphic>
+          </wp:inline>
+        </w:drawing>
+      </w:r>
+    </w:p>
+    <w:p>
+      <w:pPr>
+        <w:pStyle w:val="Caption"/>
+        <w:jc w:val="center"/>
+        <w:rPr>
+          <w:rFonts w:ascii="Calibri" w:hAnsi="Calibri" w:cs="Calibri"/>
+          <w:lang w:val="el-GR"/>
+        </w:rPr>
+      </w:pPr>
+      <w:proofErr w:type="spellStart"/>
+      <w:r>
+        <w:t>Εικόν</w:t>
+      </w:r>
+      <w:proofErr w:type="spellEnd"/>
+      <w:r>
+        <w:t xml:space="preserve">α </w:t>
+      </w:r>
+      <w:r>
+        <w:rPr>
+          <w:lang w:val="el-GR"/>
+        </w:rPr>
+        <w:t>14: Προσθήκη Σχολίου</w:t>
+      </w:r>
+    </w:p>
+    <w:p>
+      <w:pPr>
+        <w:jc w:val="both"/>
+        <w:rPr>
+          <w:rFonts w:ascii="Calibri" w:hAnsi="Calibri" w:cs="Calibri"/>
+          <w:lang w:val="el-GR"/>
+        </w:rPr>
+      </w:pPr>
+    </w:p>
+    <w:p>
+      <w:pPr>
+        <w:jc w:val="both"/>
+        <w:rPr>
+          <w:rFonts w:ascii="Calibri" w:hAnsi="Calibri" w:cs="Calibri"/>
+          <w:lang w:val="el-GR"/>
+        </w:rPr>
+      </w:pPr>
+    </w:p>
+    <w:p>
+      <w:pPr>
+        <w:jc w:val="both"/>
+        <w:rPr>
+          <w:rFonts w:ascii="Calibri" w:hAnsi="Calibri" w:cs="Calibri"/>
+          <w:lang w:val="el-GR"/>
+        </w:rPr>
+      </w:pPr>
+    </w:p>
+    <w:p>
+      <w:pPr>
+        <w:jc w:val="both"/>
+        <w:rPr>
+          <w:rFonts w:ascii="Calibri" w:hAnsi="Calibri" w:cs="Calibri"/>
+          <w:lang w:val="el-GR"/>
+        </w:rPr>
+      </w:pPr>
+    </w:p>
+    <w:p>
+      <w:pPr>
+        <w:jc w:val="both"/>
+        <w:rPr>
+          <w:rFonts w:ascii="Calibri" w:hAnsi="Calibri" w:cs="Calibri"/>
+          <w:lang w:val="el-GR"/>
+        </w:rPr>
+      </w:pPr>
+    </w:p>
+    <w:p>
+      <w:pPr>
+        <w:jc w:val="both"/>
+        <w:rPr>
+          <w:rFonts w:ascii="Calibri" w:hAnsi="Calibri" w:cs="Calibri"/>
+          <w:lang w:val="el-GR"/>
+        </w:rPr>
+      </w:pPr>
+    </w:p>
+    <w:p>
+      <w:pPr>
+        <w:jc w:val="both"/>
+        <w:rPr>
+          <w:rFonts w:ascii="Calibri" w:hAnsi="Calibri" w:cs="Calibri"/>
+          <w:lang w:val="el-GR"/>
+        </w:rPr>
+      </w:pPr>
+    </w:p>
+    <w:p>
+      <w:pPr>
+        <w:jc w:val="both"/>
+        <w:rPr>
+          <w:rFonts w:ascii="Calibri" w:hAnsi="Calibri" w:cs="Calibri"/>
+          <w:lang w:val="el-GR"/>
+        </w:rPr>
+      </w:pPr>
+    </w:p>
+    <w:p>
+      <w:pPr>
+        <w:jc w:val="both"/>
+        <w:rPr>
+          <w:rFonts w:ascii="Calibri" w:hAnsi="Calibri" w:cs="Calibri"/>
+          <w:lang w:val="el-GR"/>
+        </w:rPr>
+      </w:pPr>
+    </w:p>
+    <w:p>
+      <w:pPr>
+        <w:jc w:val="both"/>
+        <w:rPr>
+          <w:rFonts w:ascii="Calibri" w:hAnsi="Calibri" w:cs="Calibri"/>
+          <w:lang w:val="el-GR"/>
+        </w:rPr>
+      </w:pPr>
+    </w:p>
+    <w:p>
+      <w:pPr>
+        <w:jc w:val="both"/>
+        <w:rPr>
+          <w:rFonts w:ascii="Calibri" w:hAnsi="Calibri" w:cs="Calibri"/>
+          <w:lang w:val="el-GR"/>
+        </w:rPr>
+      </w:pPr>
+    </w:p>
+    <w:p>
+      <w:pPr>
+        <w:jc w:val="both"/>
+        <w:rPr>
+          <w:rFonts w:ascii="Calibri" w:hAnsi="Calibri" w:cs="Calibri"/>
+          <w:lang w:val="el-GR"/>
+        </w:rPr>
+      </w:pPr>
+    </w:p>
+    <w:p>
+      <w:pPr>
+        <w:jc w:val="both"/>
+        <w:rPr>
+          <w:rFonts w:ascii="Calibri" w:hAnsi="Calibri" w:cs="Calibri"/>
+          <w:lang w:val="el-GR"/>
+        </w:rPr>
+      </w:pPr>
+    </w:p>
+    <w:p>
+      <w:pPr>
+        <w:jc w:val="both"/>
+        <w:rPr>
+          <w:rFonts w:ascii="Calibri" w:hAnsi="Calibri" w:cs="Calibri"/>
+          <w:lang w:val="el-GR"/>
+        </w:rPr>
+      </w:pPr>
+    </w:p>
+    <w:p>
+      <w:pPr>
+        <w:jc w:val="both"/>
+        <w:rPr>
+          <w:rFonts w:ascii="Calibri" w:hAnsi="Calibri" w:cs="Calibri"/>
+          <w:lang w:val="el-GR"/>
+        </w:rPr>
+      </w:pPr>
+    </w:p>
+    <w:p>
+      <w:pPr>
+        <w:jc w:val="both"/>
+        <w:rPr>
+          <w:rFonts w:ascii="Calibri" w:hAnsi="Calibri" w:cs="Calibri"/>
+          <w:lang w:val="el-GR"/>
+        </w:rPr>
+      </w:pPr>
+    </w:p>
+    <w:p>
+      <w:pPr>
+        <w:jc w:val="both"/>
+        <w:rPr>
+          <w:rFonts w:ascii="Calibri" w:hAnsi="Calibri" w:cs="Calibri"/>
+          <w:lang w:val="el-GR"/>
+        </w:rPr>
+      </w:pPr>
+    </w:p>
+    <w:p>
+      <w:pPr>
+        <w:jc w:val="both"/>
+        <w:rPr>
+          <w:rFonts w:ascii="Calibri" w:hAnsi="Calibri" w:cs="Calibri"/>
+          <w:lang w:val="el-GR"/>
+        </w:rPr>
+      </w:pPr>
+    </w:p>
+    <w:p>
+      <w:pPr>
+        <w:jc w:val="both"/>
+        <w:rPr>
+          <w:rFonts w:ascii="Calibri" w:hAnsi="Calibri" w:cs="Calibri"/>
+          <w:lang w:val="el-GR"/>
+        </w:rPr>
+      </w:pPr>
+    </w:p>
+    <w:p>
+      <w:pPr>
+        <w:jc w:val="both"/>
+        <w:rPr>
+          <w:rFonts w:ascii="Calibri" w:hAnsi="Calibri" w:cs="Calibri"/>
+          <w:lang w:val="el-GR"/>
+        </w:rPr>
+      </w:pPr>
+    </w:p>
+    <w:p>
+      <w:pPr>
+        <w:jc w:val="both"/>
+        <w:rPr>
+          <w:rFonts w:ascii="Calibri" w:hAnsi="Calibri" w:cs="Calibri"/>
+          <w:lang w:val="el-GR"/>
+        </w:rPr>
+      </w:pPr>
+    </w:p>
+    <w:p>
+      <w:pPr>
+        <w:jc w:val="both"/>
+        <w:rPr>
+          <w:rFonts w:ascii="Calibri" w:hAnsi="Calibri" w:cs="Calibri"/>
+          <w:lang w:val="el-GR"/>
+        </w:rPr>
+      </w:pPr>
+    </w:p>
+    <w:p>
+      <w:pPr>
+        <w:pBdr>
+          <w:top w:val="single" w:sz="4" w:space="1" w:color="auto"/>
+          <w:bottom w:val="single" w:sz="4" w:space="1" w:color="auto"/>
+        </w:pBdr>
+        <w:jc w:val="center"/>
+        <w:rPr>
+          <w:rFonts w:ascii="Calibri" w:hAnsi="Calibri" w:cs="Calibri"/>
+          <w:b/>
+          <w:bCs/>
+          <w:lang w:val="el-GR"/>
+        </w:rPr>
+      </w:pPr>
+      <w:r>
+        <w:rPr>
+          <w:rFonts w:ascii="Calibri" w:hAnsi="Calibri" w:cs="Calibri"/>
+          <w:b/>
+          <w:bCs/>
+          <w:lang w:val="el-GR"/>
+        </w:rPr>
+        <w:t>Διαγραφή</w:t>
+      </w:r>
+      <w:r>
+        <w:rPr>
+          <w:rFonts w:ascii="Calibri" w:hAnsi="Calibri" w:cs="Calibri"/>
+          <w:b/>
+          <w:bCs/>
+          <w:lang w:val="el-GR"/>
+        </w:rPr>
+        <w:t xml:space="preserve"> Σχολίου</w:t>
+      </w:r>
+    </w:p>
+    <w:p>
+      <w:pPr>
+        <w:jc w:val="both"/>
+        <w:rPr>
+          <w:rFonts w:ascii="Calibri" w:hAnsi="Calibri" w:cs="Calibri"/>
+          <w:lang w:val="el-GR"/>
+        </w:rPr>
+      </w:pPr>
+      <w:r>
+        <w:rPr>
+          <w:rFonts w:ascii="Calibri" w:hAnsi="Calibri" w:cs="Calibri"/>
+          <w:lang w:val="el-GR"/>
+        </w:rPr>
+        <w:t xml:space="preserve">Στην εικόνα </w:t>
+      </w:r>
+      <w:r>
+        <w:rPr>
+          <w:rFonts w:ascii="Calibri" w:hAnsi="Calibri" w:cs="Calibri"/>
+          <w:lang w:val="el-GR"/>
+        </w:rPr>
+        <w:t>1</w:t>
+      </w:r>
+      <w:r>
+        <w:rPr>
+          <w:rFonts w:ascii="Calibri" w:hAnsi="Calibri" w:cs="Calibri"/>
+          <w:lang w:val="el-GR"/>
+        </w:rPr>
+        <w:t>5</w:t>
+      </w:r>
+      <w:r>
+        <w:rPr>
+          <w:rFonts w:ascii="Calibri" w:hAnsi="Calibri" w:cs="Calibri"/>
+          <w:lang w:val="el-GR"/>
+        </w:rPr>
+        <w:t>, παρουσιάζουμε το Διάγραμμα Ευρωστίας της Περίπτωσης Χρήσης «</w:t>
+      </w:r>
+      <w:r>
+        <w:rPr>
+          <w:rFonts w:ascii="Calibri" w:hAnsi="Calibri" w:cs="Calibri"/>
+          <w:lang w:val="el-GR"/>
+        </w:rPr>
+        <w:t xml:space="preserve">Διαγραφή </w:t>
+      </w:r>
+      <w:r>
+        <w:rPr>
+          <w:rFonts w:ascii="Calibri" w:hAnsi="Calibri" w:cs="Calibri"/>
+          <w:lang w:val="el-GR"/>
+        </w:rPr>
+        <w:t>Σχολίου</w:t>
+      </w:r>
+      <w:r>
+        <w:rPr>
+          <w:rFonts w:ascii="Calibri" w:hAnsi="Calibri" w:cs="Calibri"/>
+          <w:lang w:val="el-GR"/>
+        </w:rPr>
+        <w:t xml:space="preserve">». Ως Χρήστη θεωρούμε  τον </w:t>
+      </w:r>
+      <w:proofErr w:type="spellStart"/>
+      <w:r>
+        <w:rPr>
+          <w:rFonts w:ascii="Calibri" w:eastAsia="Arial" w:hAnsi="Calibri" w:cs="Calibri"/>
+          <w:i/>
+          <w:iCs/>
+          <w:lang w:val="el-GR"/>
+        </w:rPr>
+        <w:t>Αξιολογητή</w:t>
+      </w:r>
+      <w:proofErr w:type="spellEnd"/>
+      <w:r>
+        <w:rPr>
+          <w:rFonts w:ascii="Calibri" w:eastAsia="Arial" w:hAnsi="Calibri" w:cs="Calibri"/>
+          <w:i/>
+          <w:iCs/>
+          <w:lang w:val="el-GR"/>
+        </w:rPr>
+        <w:t xml:space="preserve"> </w:t>
+      </w:r>
+      <w:r>
+        <w:rPr>
+          <w:rFonts w:ascii="Calibri" w:eastAsia="Arial" w:hAnsi="Calibri" w:cs="Calibri"/>
+          <w:lang w:val="el-GR"/>
+        </w:rPr>
+        <w:t>και</w:t>
+      </w:r>
+      <w:r>
+        <w:rPr>
+          <w:rFonts w:ascii="Calibri" w:eastAsia="Arial" w:hAnsi="Calibri" w:cs="Calibri"/>
+          <w:i/>
+          <w:iCs/>
+          <w:lang w:val="el-GR"/>
+        </w:rPr>
+        <w:t xml:space="preserve"> τον Συνεργάτη</w:t>
+      </w:r>
+      <w:r>
+        <w:rPr>
+          <w:rFonts w:ascii="Calibri" w:hAnsi="Calibri" w:cs="Calibri"/>
+          <w:lang w:val="el-GR"/>
+        </w:rPr>
+        <w:t>.</w:t>
+      </w:r>
+      <w:r>
+        <w:rPr>
+          <w:lang w:val="el-GR"/>
+        </w:rPr>
+        <w:t xml:space="preserve"> </w:t>
+      </w:r>
+      <w:r>
+        <w:rPr>
+          <w:rFonts w:ascii="Calibri" w:hAnsi="Calibri" w:cs="Calibri"/>
+          <w:lang w:val="el-GR"/>
+        </w:rPr>
+        <w:t xml:space="preserve">Για τους σκοπούς του συγκεκριμένου διαγράμματος προσθέσαμε ως Χειριστή τον γενικό όρο </w:t>
+      </w:r>
+      <w:r>
+        <w:rPr>
+          <w:rFonts w:ascii="Calibri" w:hAnsi="Calibri" w:cs="Calibri"/>
+          <w:i/>
+          <w:iCs/>
+          <w:lang w:val="el-GR"/>
+        </w:rPr>
+        <w:t>Χρήστης</w:t>
+      </w:r>
+      <w:r>
+        <w:rPr>
+          <w:rFonts w:ascii="Calibri" w:hAnsi="Calibri" w:cs="Calibri"/>
+          <w:lang w:val="el-GR"/>
+        </w:rPr>
+        <w:t>.</w:t>
+      </w:r>
+    </w:p>
+    <w:p>
+      <w:pPr>
+        <w:jc w:val="both"/>
+        <w:rPr>
+          <w:lang w:val="el-GR"/>
+        </w:rPr>
+      </w:pPr>
+    </w:p>
+    <w:p>
+      <w:pPr>
+        <w:jc w:val="both"/>
+        <w:rPr>
+          <w:lang w:val="el-GR"/>
+        </w:rPr>
+      </w:pPr>
+    </w:p>
+    <w:p>
+      <w:pPr>
+        <w:jc w:val="both"/>
+        <w:rPr>
+          <w:lang w:val="el-GR"/>
+        </w:rPr>
+      </w:pPr>
+    </w:p>
+    <w:p>
+      <w:pPr>
+        <w:jc w:val="both"/>
+        <w:rPr>
+          <w:lang w:val="el-GR"/>
+        </w:rPr>
+      </w:pPr>
+    </w:p>
+    <w:p>
+      <w:pPr>
+        <w:jc w:val="both"/>
+        <w:rPr>
+          <w:lang w:val="el-GR"/>
+        </w:rPr>
+      </w:pPr>
+    </w:p>
+    <w:p>
+      <w:pPr>
+        <w:jc w:val="both"/>
+        <w:rPr>
+          <w:lang w:val="el-GR"/>
+        </w:rPr>
+      </w:pPr>
+    </w:p>
+    <w:p>
+      <w:pPr>
+        <w:jc w:val="both"/>
+        <w:rPr>
+          <w:lang w:val="el-GR"/>
+        </w:rPr>
+      </w:pPr>
+    </w:p>
+    <w:p>
+      <w:pPr>
+        <w:jc w:val="both"/>
+        <w:rPr>
+          <w:lang w:val="el-GR"/>
+        </w:rPr>
+      </w:pPr>
+    </w:p>
+    <w:p>
+      <w:pPr>
+        <w:jc w:val="both"/>
+        <w:rPr>
+          <w:lang w:val="el-GR"/>
+        </w:rPr>
+      </w:pPr>
+    </w:p>
+    <w:p>
+      <w:pPr>
+        <w:jc w:val="both"/>
+        <w:rPr>
+          <w:lang w:val="el-GR"/>
+        </w:rPr>
+      </w:pPr>
+    </w:p>
+    <w:p>
+      <w:pPr>
+        <w:jc w:val="both"/>
+        <w:rPr>
+          <w:lang w:val="el-GR"/>
+        </w:rPr>
+      </w:pPr>
+    </w:p>
+    <w:p>
+      <w:pPr>
+        <w:jc w:val="both"/>
+        <w:rPr>
+          <w:lang w:val="el-GR"/>
+        </w:rPr>
+      </w:pPr>
+    </w:p>
+    <w:p>
+      <w:pPr>
+        <w:jc w:val="both"/>
+        <w:rPr>
+          <w:lang w:val="el-GR"/>
+        </w:rPr>
+      </w:pPr>
+    </w:p>
+    <w:p>
+      <w:pPr>
+        <w:jc w:val="both"/>
+        <w:rPr>
+          <w:lang w:val="el-GR"/>
+        </w:rPr>
+      </w:pPr>
+    </w:p>
+    <w:p>
+      <w:pPr>
+        <w:jc w:val="both"/>
+        <w:rPr>
+          <w:lang w:val="el-GR"/>
+        </w:rPr>
+      </w:pPr>
+    </w:p>
+    <w:p>
+      <w:pPr>
+        <w:jc w:val="both"/>
+        <w:rPr>
+          <w:lang w:val="el-GR"/>
+        </w:rPr>
+      </w:pPr>
+    </w:p>
+    <w:p>
+      <w:pPr>
+        <w:jc w:val="both"/>
+        <w:rPr>
+          <w:lang w:val="el-GR"/>
+        </w:rPr>
+      </w:pPr>
+    </w:p>
+    <w:p>
+      <w:pPr>
+        <w:jc w:val="both"/>
+        <w:rPr>
+          <w:lang w:val="el-GR"/>
+        </w:rPr>
+      </w:pPr>
+    </w:p>
+    <w:p>
+      <w:pPr>
+        <w:jc w:val="both"/>
+        <w:rPr>
+          <w:lang w:val="el-GR"/>
+        </w:rPr>
+      </w:pPr>
+    </w:p>
+    <w:p>
+      <w:pPr>
+        <w:jc w:val="both"/>
+        <w:rPr>
+          <w:lang w:val="el-GR"/>
+        </w:rPr>
+      </w:pPr>
+    </w:p>
+    <w:p>
+      <w:pPr>
+        <w:jc w:val="both"/>
+        <w:rPr>
+          <w:lang w:val="el-GR"/>
+        </w:rPr>
+      </w:pPr>
+    </w:p>
+    <w:p>
+      <w:pPr>
+        <w:jc w:val="both"/>
+        <w:rPr>
+          <w:lang w:val="el-GR"/>
+        </w:rPr>
+      </w:pPr>
+    </w:p>
+    <w:p>
+      <w:pPr>
+        <w:pBdr>
+          <w:top w:val="single" w:sz="4" w:space="1" w:color="auto"/>
+          <w:bottom w:val="single" w:sz="4" w:space="1" w:color="auto"/>
+        </w:pBdr>
+        <w:jc w:val="center"/>
+        <w:rPr>
+          <w:rFonts w:ascii="Calibri" w:hAnsi="Calibri" w:cs="Calibri"/>
+          <w:b/>
+          <w:bCs/>
+          <w:lang w:val="el-GR"/>
+        </w:rPr>
+      </w:pPr>
+      <w:r>
+        <w:rPr>
+          <w:rFonts w:ascii="Calibri" w:hAnsi="Calibri" w:cs="Calibri"/>
+          <w:b/>
+          <w:bCs/>
+          <w:lang w:val="el-GR"/>
+        </w:rPr>
+        <w:t>Έγκριση / Απόρριψη</w:t>
+      </w:r>
+      <w:r>
+        <w:rPr>
+          <w:rFonts w:ascii="Calibri" w:hAnsi="Calibri" w:cs="Calibri"/>
+          <w:b/>
+          <w:bCs/>
+          <w:lang w:val="el-GR"/>
+        </w:rPr>
+        <w:t xml:space="preserve"> </w:t>
+      </w:r>
+      <w:r>
+        <w:rPr>
+          <w:rFonts w:ascii="Calibri" w:hAnsi="Calibri" w:cs="Calibri"/>
+          <w:b/>
+          <w:bCs/>
+        </w:rPr>
+        <w:t>Use</w:t>
+      </w:r>
+      <w:r>
+        <w:rPr>
+          <w:rFonts w:ascii="Calibri" w:hAnsi="Calibri" w:cs="Calibri"/>
+          <w:b/>
+          <w:bCs/>
+          <w:lang w:val="el-GR"/>
+        </w:rPr>
+        <w:t xml:space="preserve"> </w:t>
+      </w:r>
+      <w:r>
+        <w:rPr>
+          <w:rFonts w:ascii="Calibri" w:hAnsi="Calibri" w:cs="Calibri"/>
+          <w:b/>
+          <w:bCs/>
+        </w:rPr>
+        <w:t>Case</w:t>
+      </w:r>
+    </w:p>
+    <w:p>
+      <w:pPr>
+        <w:jc w:val="both"/>
+        <w:rPr>
+          <w:rFonts w:ascii="Calibri" w:hAnsi="Calibri" w:cs="Calibri"/>
+          <w:lang w:val="el-GR"/>
+        </w:rPr>
+      </w:pPr>
+      <w:r>
+        <w:rPr>
+          <w:rFonts w:ascii="Calibri" w:hAnsi="Calibri" w:cs="Calibri"/>
+          <w:lang w:val="el-GR"/>
+        </w:rPr>
+        <w:t xml:space="preserve">Στην εικόνα </w:t>
+      </w:r>
+      <w:r>
+        <w:rPr>
+          <w:rFonts w:ascii="Calibri" w:hAnsi="Calibri" w:cs="Calibri"/>
+          <w:lang w:val="el-GR"/>
+        </w:rPr>
+        <w:t>1</w:t>
+      </w:r>
+      <w:r>
+        <w:rPr>
+          <w:rFonts w:ascii="Calibri" w:hAnsi="Calibri" w:cs="Calibri"/>
+          <w:lang w:val="el-GR"/>
+        </w:rPr>
+        <w:t>6</w:t>
+      </w:r>
+      <w:r>
+        <w:rPr>
+          <w:rFonts w:ascii="Calibri" w:hAnsi="Calibri" w:cs="Calibri"/>
+          <w:lang w:val="el-GR"/>
+        </w:rPr>
+        <w:t>, παρουσιάζουμε το Διάγραμμα Ευρωστίας της Περίπτωσης Χρήσης «</w:t>
+      </w:r>
+      <w:r>
+        <w:rPr>
+          <w:rFonts w:ascii="Calibri" w:hAnsi="Calibri" w:cs="Calibri"/>
+          <w:lang w:val="el-GR"/>
+        </w:rPr>
+        <w:t xml:space="preserve">Έγκριση / Απόρριψη </w:t>
+      </w:r>
+      <w:r>
+        <w:rPr>
+          <w:rFonts w:ascii="Calibri" w:hAnsi="Calibri" w:cs="Calibri"/>
+        </w:rPr>
+        <w:t>Use</w:t>
+      </w:r>
+      <w:r>
+        <w:rPr>
+          <w:rFonts w:ascii="Calibri" w:hAnsi="Calibri" w:cs="Calibri"/>
+          <w:lang w:val="el-GR"/>
+        </w:rPr>
+        <w:t xml:space="preserve"> </w:t>
+      </w:r>
+      <w:r>
+        <w:rPr>
+          <w:rFonts w:ascii="Calibri" w:hAnsi="Calibri" w:cs="Calibri"/>
+        </w:rPr>
+        <w:t>Case</w:t>
+      </w:r>
+      <w:r>
+        <w:rPr>
+          <w:rFonts w:ascii="Calibri" w:hAnsi="Calibri" w:cs="Calibri"/>
+          <w:lang w:val="el-GR"/>
+        </w:rPr>
+        <w:t xml:space="preserve">». Ως Χρήστη θεωρούμε  τον </w:t>
+      </w:r>
+      <w:r>
+        <w:rPr>
+          <w:rFonts w:ascii="Calibri" w:eastAsia="Arial" w:hAnsi="Calibri" w:cs="Calibri"/>
+          <w:i/>
+          <w:iCs/>
+          <w:lang w:val="el-GR"/>
+        </w:rPr>
+        <w:t>Ιδιοκτήτη Οργανισμού</w:t>
+      </w:r>
+      <w:r>
+        <w:rPr>
+          <w:rFonts w:ascii="Calibri" w:hAnsi="Calibri" w:cs="Calibri"/>
+          <w:lang w:val="el-GR"/>
+        </w:rPr>
+        <w:t>.</w:t>
+      </w:r>
+    </w:p>
+    <w:p>
+      <w:pPr>
+        <w:rPr>
+          <w:rFonts w:ascii="Calibri" w:hAnsi="Calibri" w:cs="Calibri"/>
+          <w:lang w:val="el-GR"/>
+        </w:rPr>
+      </w:pPr>
+    </w:p>
+    <w:p>
+      <w:pPr>
+        <w:rPr>
+          <w:rFonts w:ascii="Calibri" w:hAnsi="Calibri" w:cs="Calibri"/>
+          <w:lang w:val="el-GR"/>
+        </w:rPr>
+      </w:pPr>
+    </w:p>
+    <w:p>
+      <w:pPr>
+        <w:rPr>
+          <w:rFonts w:ascii="Calibri" w:hAnsi="Calibri" w:cs="Calibri"/>
+          <w:lang w:val="el-GR"/>
+        </w:rPr>
+      </w:pPr>
     </w:p>
     <w:p>
       <w:pPr>
@@ -4345,7 +7125,7 @@
         </w:rPr>
         <w:t xml:space="preserve"> με τη χρήση του εργαλείου </w:t>
       </w:r>
-      <w:hyperlink r:id="rId17" w:history="1">
+      <w:hyperlink r:id="rId22" w:history="1">
         <w:r>
           <w:rPr>
             <w:rStyle w:val="Hyperlink"/>
@@ -4387,8 +7167,8 @@
       </w:pPr>
     </w:p>
     <w:sectPr>
-      <w:headerReference w:type="default" r:id="rId18"/>
-      <w:footerReference w:type="default" r:id="rId19"/>
+      <w:headerReference w:type="default" r:id="rId23"/>
+      <w:footerReference w:type="default" r:id="rId24"/>
       <w:pgSz w:w="12240" w:h="15840"/>
       <w:pgMar w:top="1440" w:right="1440" w:bottom="1440" w:left="1440" w:header="720" w:footer="720" w:gutter="0"/>
       <w:cols w:space="720"/>
@@ -5556,7 +8336,6 @@
   <w:style w:type="character" w:default="1" w:styleId="DefaultParagraphFont">
     <w:name w:val="Default Paragraph Font"/>
     <w:uiPriority w:val="1"/>
-    <w:semiHidden/>
     <w:unhideWhenUsed/>
   </w:style>
   <w:style w:type="table" w:default="1" w:styleId="TableNormal">

</xml_diff>

<commit_message>
docs: All robustness and updated use cases
</commit_message>
<xml_diff>
--- a/2nd_phase/Robustness-diagram-v0.1.docx
+++ b/2nd_phase/Robustness-diagram-v0.1.docx
@@ -5193,13 +5193,6 @@
       <w:r>
         <w:rPr>
           <w:rFonts w:ascii="Calibri" w:eastAsia="Arial" w:hAnsi="Calibri" w:cs="Calibri"/>
-          <w:lang w:val="el-GR"/>
-        </w:rPr>
-        <w:t xml:space="preserve">, </w:t>
-      </w:r>
-      <w:r>
-        <w:rPr>
-          <w:rFonts w:ascii="Calibri" w:eastAsia="Arial" w:hAnsi="Calibri" w:cs="Calibri"/>
           <w:i/>
           <w:iCs/>
           <w:sz w:val="22"/>
@@ -5243,6 +5236,66 @@
       <w:r>
         <w:rPr>
           <w:rFonts w:ascii="Calibri" w:hAnsi="Calibri" w:cs="Calibri"/>
+          <w:i/>
+          <w:iCs/>
+          <w:lang w:val="el-GR"/>
+        </w:rPr>
+        <w:t xml:space="preserve"> </w:t>
+      </w:r>
+      <w:r>
+        <w:rPr>
+          <w:rFonts w:ascii="Calibri" w:hAnsi="Calibri" w:cs="Calibri"/>
+          <w:lang w:val="el-GR"/>
+        </w:rPr>
+        <w:t>και</w:t>
+      </w:r>
+      <w:r>
+        <w:rPr>
+          <w:rFonts w:ascii="Calibri" w:hAnsi="Calibri" w:cs="Calibri"/>
+          <w:lang w:val="el-GR"/>
+        </w:rPr>
+        <w:t xml:space="preserve"> παρουσιάζουμε την </w:t>
+      </w:r>
+      <w:proofErr w:type="spellStart"/>
+      <w:r>
+        <w:rPr>
+          <w:rFonts w:ascii="Calibri" w:hAnsi="Calibri" w:cs="Calibri"/>
+          <w:lang w:val="el-GR"/>
+        </w:rPr>
+        <w:t>οπτικοποίηση</w:t>
+      </w:r>
+      <w:proofErr w:type="spellEnd"/>
+      <w:r>
+        <w:rPr>
+          <w:rFonts w:ascii="Calibri" w:hAnsi="Calibri" w:cs="Calibri"/>
+          <w:lang w:val="el-GR"/>
+        </w:rPr>
+        <w:t xml:space="preserve"> του διαγράμματος μέσω της εφαρμογής </w:t>
+      </w:r>
+      <w:r>
+        <w:rPr>
+          <w:rFonts w:ascii="Calibri" w:hAnsi="Calibri" w:cs="Calibri"/>
+        </w:rPr>
+        <w:t>plant</w:t>
+      </w:r>
+      <w:r>
+        <w:rPr>
+          <w:rFonts w:ascii="Calibri" w:hAnsi="Calibri" w:cs="Calibri"/>
+          <w:lang w:val="el-GR"/>
+        </w:rPr>
+        <w:t>-</w:t>
+      </w:r>
+      <w:proofErr w:type="spellStart"/>
+      <w:r>
+        <w:rPr>
+          <w:rFonts w:ascii="Calibri" w:hAnsi="Calibri" w:cs="Calibri"/>
+        </w:rPr>
+        <w:t>uml</w:t>
+      </w:r>
+      <w:proofErr w:type="spellEnd"/>
+      <w:r>
+        <w:rPr>
+          <w:rFonts w:ascii="Calibri" w:hAnsi="Calibri" w:cs="Calibri"/>
           <w:lang w:val="el-GR"/>
         </w:rPr>
         <w:t>.</w:t>
@@ -5250,177 +5303,122 @@
     </w:p>
     <w:p>
       <w:pPr>
-        <w:rPr>
-          <w:rFonts w:ascii="Calibri" w:hAnsi="Calibri" w:cs="Calibri"/>
-          <w:lang w:val="el-GR"/>
-        </w:rPr>
-      </w:pPr>
-    </w:p>
-    <w:p>
-      <w:pPr>
-        <w:rPr>
-          <w:rFonts w:ascii="Calibri" w:hAnsi="Calibri" w:cs="Calibri"/>
-          <w:lang w:val="el-GR"/>
-        </w:rPr>
-      </w:pPr>
-    </w:p>
-    <w:p>
-      <w:pPr>
-        <w:rPr>
-          <w:rFonts w:ascii="Calibri" w:hAnsi="Calibri" w:cs="Calibri"/>
-          <w:lang w:val="el-GR"/>
-        </w:rPr>
-      </w:pPr>
-    </w:p>
-    <w:p>
-      <w:pPr>
-        <w:rPr>
-          <w:rFonts w:ascii="Calibri" w:hAnsi="Calibri" w:cs="Calibri"/>
-          <w:lang w:val="el-GR"/>
-        </w:rPr>
-      </w:pPr>
-    </w:p>
-    <w:p>
-      <w:pPr>
-        <w:rPr>
-          <w:rFonts w:ascii="Calibri" w:hAnsi="Calibri" w:cs="Calibri"/>
-          <w:lang w:val="el-GR"/>
-        </w:rPr>
-      </w:pPr>
-    </w:p>
-    <w:p>
-      <w:pPr>
-        <w:rPr>
-          <w:rFonts w:ascii="Calibri" w:hAnsi="Calibri" w:cs="Calibri"/>
-          <w:lang w:val="el-GR"/>
-        </w:rPr>
-      </w:pPr>
-    </w:p>
-    <w:p>
-      <w:pPr>
-        <w:rPr>
-          <w:rFonts w:ascii="Calibri" w:hAnsi="Calibri" w:cs="Calibri"/>
-          <w:lang w:val="el-GR"/>
-        </w:rPr>
-      </w:pPr>
-    </w:p>
-    <w:p>
-      <w:pPr>
-        <w:rPr>
-          <w:rFonts w:ascii="Calibri" w:hAnsi="Calibri" w:cs="Calibri"/>
-          <w:lang w:val="el-GR"/>
-        </w:rPr>
-      </w:pPr>
-    </w:p>
-    <w:p>
-      <w:pPr>
-        <w:rPr>
-          <w:rFonts w:ascii="Calibri" w:hAnsi="Calibri" w:cs="Calibri"/>
-          <w:lang w:val="el-GR"/>
-        </w:rPr>
-      </w:pPr>
-    </w:p>
-    <w:p>
-      <w:pPr>
-        <w:rPr>
-          <w:rFonts w:ascii="Calibri" w:hAnsi="Calibri" w:cs="Calibri"/>
-          <w:lang w:val="el-GR"/>
-        </w:rPr>
-      </w:pPr>
-    </w:p>
-    <w:p>
-      <w:pPr>
-        <w:rPr>
-          <w:rFonts w:ascii="Calibri" w:hAnsi="Calibri" w:cs="Calibri"/>
-          <w:lang w:val="el-GR"/>
-        </w:rPr>
-      </w:pPr>
-    </w:p>
-    <w:p>
-      <w:pPr>
-        <w:rPr>
-          <w:rFonts w:ascii="Calibri" w:hAnsi="Calibri" w:cs="Calibri"/>
-          <w:lang w:val="el-GR"/>
-        </w:rPr>
-      </w:pPr>
-    </w:p>
-    <w:p>
-      <w:pPr>
-        <w:rPr>
-          <w:rFonts w:ascii="Calibri" w:hAnsi="Calibri" w:cs="Calibri"/>
-          <w:lang w:val="el-GR"/>
-        </w:rPr>
-      </w:pPr>
-    </w:p>
-    <w:p>
-      <w:pPr>
-        <w:rPr>
-          <w:rFonts w:ascii="Calibri" w:hAnsi="Calibri" w:cs="Calibri"/>
-          <w:lang w:val="el-GR"/>
-        </w:rPr>
-      </w:pPr>
-    </w:p>
-    <w:p>
-      <w:pPr>
-        <w:rPr>
-          <w:rFonts w:ascii="Calibri" w:hAnsi="Calibri" w:cs="Calibri"/>
-          <w:lang w:val="el-GR"/>
-        </w:rPr>
-      </w:pPr>
-    </w:p>
-    <w:p>
-      <w:pPr>
-        <w:rPr>
-          <w:rFonts w:ascii="Calibri" w:hAnsi="Calibri" w:cs="Calibri"/>
-          <w:lang w:val="el-GR"/>
-        </w:rPr>
-      </w:pPr>
-    </w:p>
-    <w:p>
-      <w:pPr>
-        <w:rPr>
-          <w:rFonts w:ascii="Calibri" w:hAnsi="Calibri" w:cs="Calibri"/>
-          <w:lang w:val="el-GR"/>
-        </w:rPr>
-      </w:pPr>
-    </w:p>
-    <w:p>
-      <w:pPr>
-        <w:rPr>
-          <w:rFonts w:ascii="Calibri" w:hAnsi="Calibri" w:cs="Calibri"/>
-          <w:lang w:val="el-GR"/>
-        </w:rPr>
-      </w:pPr>
-    </w:p>
-    <w:p>
-      <w:pPr>
-        <w:rPr>
-          <w:rFonts w:ascii="Calibri" w:hAnsi="Calibri" w:cs="Calibri"/>
-          <w:lang w:val="el-GR"/>
-        </w:rPr>
-      </w:pPr>
-    </w:p>
-    <w:p>
-      <w:pPr>
-        <w:rPr>
-          <w:rFonts w:ascii="Calibri" w:hAnsi="Calibri" w:cs="Calibri"/>
-          <w:lang w:val="el-GR"/>
-        </w:rPr>
-      </w:pPr>
-    </w:p>
-    <w:p>
-      <w:pPr>
-        <w:rPr>
-          <w:rFonts w:ascii="Calibri" w:hAnsi="Calibri" w:cs="Calibri"/>
-          <w:lang w:val="el-GR"/>
-        </w:rPr>
-      </w:pPr>
-    </w:p>
-    <w:p>
-      <w:pPr>
-        <w:rPr>
-          <w:rFonts w:ascii="Calibri" w:hAnsi="Calibri" w:cs="Calibri"/>
-          <w:lang w:val="el-GR"/>
+        <w:keepNext/>
+        <w:jc w:val="center"/>
+      </w:pPr>
+      <w:r>
+        <w:rPr>
+          <w:rFonts w:ascii="Calibri" w:hAnsi="Calibri" w:cs="Calibri"/>
+          <w:lang w:val="el-GR"/>
+        </w:rPr>
+        <w:drawing>
+          <wp:inline distT="0" distB="0" distL="0" distR="0" wp14:anchorId="7FB02E71" wp14:editId="5E1A83AA">
+            <wp:extent cx="5943600" cy="4500880"/>
+            <wp:effectExtent l="0" t="0" r="0" b="0"/>
+            <wp:docPr id="98226573" name="Picture 1"/>
+            <wp:cNvGraphicFramePr>
+              <a:graphicFrameLocks xmlns:a="http://schemas.openxmlformats.org/drawingml/2006/main" noChangeAspect="1"/>
+            </wp:cNvGraphicFramePr>
+            <a:graphic xmlns:a="http://schemas.openxmlformats.org/drawingml/2006/main">
+              <a:graphicData uri="http://schemas.openxmlformats.org/drawingml/2006/picture">
+                <pic:pic xmlns:pic="http://schemas.openxmlformats.org/drawingml/2006/picture">
+                  <pic:nvPicPr>
+                    <pic:cNvPr id="98226573" name=""/>
+                    <pic:cNvPicPr/>
+                  </pic:nvPicPr>
+                  <pic:blipFill>
+                    <a:blip r:embed="rId19"/>
+                    <a:stretch>
+                      <a:fillRect/>
+                    </a:stretch>
+                  </pic:blipFill>
+                  <pic:spPr>
+                    <a:xfrm>
+                      <a:off x="0" y="0"/>
+                      <a:ext cx="5943600" cy="4500880"/>
+                    </a:xfrm>
+                    <a:prstGeom prst="rect">
+                      <a:avLst/>
+                    </a:prstGeom>
+                  </pic:spPr>
+                </pic:pic>
+              </a:graphicData>
+            </a:graphic>
+          </wp:inline>
+        </w:drawing>
+      </w:r>
+    </w:p>
+    <w:p>
+      <w:pPr>
+        <w:pStyle w:val="Caption"/>
+        <w:jc w:val="center"/>
+        <w:rPr>
+          <w:rFonts w:ascii="Calibri" w:hAnsi="Calibri" w:cs="Calibri"/>
+          <w:lang w:val="el-GR"/>
+        </w:rPr>
+      </w:pPr>
+      <w:proofErr w:type="spellStart"/>
+      <w:r>
+        <w:t>Εικόν</w:t>
+      </w:r>
+      <w:proofErr w:type="spellEnd"/>
+      <w:r>
+        <w:t>α 11</w:t>
+      </w:r>
+      <w:r>
+        <w:rPr>
+          <w:lang w:val="el-GR"/>
+        </w:rPr>
+        <w:t xml:space="preserve">: Αντιγραφή παραγόμενου </w:t>
+      </w:r>
+      <w:r>
+        <w:t>script</w:t>
+      </w:r>
+    </w:p>
+    <w:p>
+      <w:pPr>
+        <w:rPr>
+          <w:rFonts w:ascii="Calibri" w:hAnsi="Calibri" w:cs="Calibri"/>
+          <w:lang w:val="el-GR"/>
+        </w:rPr>
+      </w:pPr>
+    </w:p>
+    <w:p>
+      <w:pPr>
+        <w:rPr>
+          <w:rFonts w:ascii="Calibri" w:hAnsi="Calibri" w:cs="Calibri"/>
+          <w:lang w:val="el-GR"/>
+        </w:rPr>
+      </w:pPr>
+    </w:p>
+    <w:p>
+      <w:pPr>
+        <w:rPr>
+          <w:rFonts w:ascii="Calibri" w:hAnsi="Calibri" w:cs="Calibri"/>
+          <w:lang w:val="el-GR"/>
+        </w:rPr>
+      </w:pPr>
+    </w:p>
+    <w:p>
+      <w:pPr>
+        <w:rPr>
+          <w:rFonts w:ascii="Calibri" w:hAnsi="Calibri" w:cs="Calibri"/>
+          <w:lang w:val="el-GR"/>
+        </w:rPr>
+      </w:pPr>
+    </w:p>
+    <w:p>
+      <w:pPr>
+        <w:rPr>
+          <w:rFonts w:ascii="Calibri" w:hAnsi="Calibri" w:cs="Calibri"/>
+          <w:lang w:val="el-GR"/>
+        </w:rPr>
+      </w:pPr>
+    </w:p>
+    <w:p>
+      <w:pPr>
+        <w:rPr>
+          <w:rFonts w:ascii="Calibri" w:hAnsi="Calibri" w:cs="Calibri"/>
         </w:rPr>
       </w:pPr>
     </w:p>
@@ -5553,6 +5551,7 @@
       <w:r>
         <w:rPr>
           <w:rFonts w:ascii="Calibri" w:hAnsi="Calibri" w:cs="Calibri"/>
+          <w:noProof/>
           <w:lang w:val="el-GR"/>
         </w:rPr>
         <w:drawing>
@@ -5571,7 +5570,7 @@
                     <pic:cNvPicPr/>
                   </pic:nvPicPr>
                   <pic:blipFill>
-                    <a:blip r:embed="rId19"/>
+                    <a:blip r:embed="rId20"/>
                     <a:stretch>
                       <a:fillRect/>
                     </a:stretch>
@@ -5601,13 +5600,11 @@
           <w:lang w:val="el-GR"/>
         </w:rPr>
       </w:pPr>
-      <w:proofErr w:type="spellStart"/>
-      <w:r>
-        <w:t>Εικόν</w:t>
-      </w:r>
-      <w:proofErr w:type="spellEnd"/>
-      <w:r>
-        <w:t>α 12</w:t>
+      <w:r>
+        <w:rPr>
+          <w:lang w:val="el-GR"/>
+        </w:rPr>
+        <w:t>Εικόνα 12</w:t>
       </w:r>
       <w:r>
         <w:rPr>
@@ -5647,6 +5644,7 @@
       <w:pPr>
         <w:rPr>
           <w:rFonts w:ascii="Calibri" w:hAnsi="Calibri" w:cs="Calibri"/>
+          <w:lang w:val="el-GR"/>
         </w:rPr>
       </w:pPr>
     </w:p>
@@ -5671,25 +5669,7 @@
           <w:bCs/>
           <w:lang w:val="el-GR"/>
         </w:rPr>
-        <w:t>Διαχείριση</w:t>
-      </w:r>
-      <w:r>
-        <w:rPr>
-          <w:rFonts w:ascii="Calibri" w:hAnsi="Calibri" w:cs="Calibri"/>
-          <w:b/>
-          <w:bCs/>
-          <w:lang w:val="el-GR"/>
-        </w:rPr>
-        <w:t xml:space="preserve"> </w:t>
-      </w:r>
-      <w:r>
-        <w:rPr>
-          <w:rFonts w:ascii="Calibri" w:hAnsi="Calibri" w:cs="Calibri"/>
-          <w:b/>
-          <w:bCs/>
-          <w:lang w:val="el-GR"/>
-        </w:rPr>
-        <w:t>Χρηστών</w:t>
+        <w:t>Διαχείριση Χρηστών</w:t>
       </w:r>
     </w:p>
     <w:p>
@@ -5767,6 +5747,7 @@
       <w:r>
         <w:rPr>
           <w:rFonts w:ascii="Calibri" w:hAnsi="Calibri" w:cs="Calibri"/>
+          <w:noProof/>
           <w:lang w:val="el-GR"/>
         </w:rPr>
         <w:drawing>
@@ -5785,7 +5766,7 @@
                     <pic:cNvPicPr/>
                   </pic:nvPicPr>
                   <pic:blipFill>
-                    <a:blip r:embed="rId20"/>
+                    <a:blip r:embed="rId21"/>
                     <a:stretch>
                       <a:fillRect/>
                     </a:stretch>
@@ -5815,13 +5796,11 @@
           <w:lang w:val="el-GR"/>
         </w:rPr>
       </w:pPr>
-      <w:proofErr w:type="spellStart"/>
-      <w:r>
-        <w:t>Εικόν</w:t>
-      </w:r>
-      <w:proofErr w:type="spellEnd"/>
-      <w:r>
-        <w:t xml:space="preserve">α </w:t>
+      <w:r>
+        <w:rPr>
+          <w:lang w:val="el-GR"/>
+        </w:rPr>
+        <w:t xml:space="preserve">Εικόνα </w:t>
       </w:r>
       <w:r>
         <w:rPr>
@@ -5874,6 +5853,7 @@
       <w:pPr>
         <w:rPr>
           <w:rFonts w:ascii="Calibri" w:hAnsi="Calibri" w:cs="Calibri"/>
+          <w:lang w:val="el-GR"/>
         </w:rPr>
       </w:pPr>
     </w:p>
@@ -6028,8 +6008,6 @@
       <w:r>
         <w:rPr>
           <w:rFonts w:ascii="Calibri" w:hAnsi="Calibri" w:cs="Calibri"/>
-          <w:i/>
-          <w:iCs/>
           <w:lang w:val="el-GR"/>
         </w:rPr>
         <w:t>και παρουσιάζουμε το διάγραμμα προσθήκης σχολίου σε Περίπτωση Χρήσης (</w:t>
@@ -6037,32 +6015,24 @@
       <w:r>
         <w:rPr>
           <w:rFonts w:ascii="Calibri" w:hAnsi="Calibri" w:cs="Calibri"/>
-          <w:i/>
-          <w:iCs/>
         </w:rPr>
         <w:t>U</w:t>
       </w:r>
       <w:r>
         <w:rPr>
           <w:rFonts w:ascii="Calibri" w:hAnsi="Calibri" w:cs="Calibri"/>
-          <w:i/>
-          <w:iCs/>
         </w:rPr>
         <w:t>s</w:t>
       </w:r>
       <w:r>
         <w:rPr>
           <w:rFonts w:ascii="Calibri" w:hAnsi="Calibri" w:cs="Calibri"/>
-          <w:i/>
-          <w:iCs/>
         </w:rPr>
         <w:t>e</w:t>
       </w:r>
       <w:r>
         <w:rPr>
           <w:rFonts w:ascii="Calibri" w:hAnsi="Calibri" w:cs="Calibri"/>
-          <w:i/>
-          <w:iCs/>
           <w:lang w:val="el-GR"/>
         </w:rPr>
         <w:t xml:space="preserve"> </w:t>
@@ -6070,16 +6040,12 @@
       <w:r>
         <w:rPr>
           <w:rFonts w:ascii="Calibri" w:hAnsi="Calibri" w:cs="Calibri"/>
-          <w:i/>
-          <w:iCs/>
         </w:rPr>
         <w:t>Case</w:t>
       </w:r>
       <w:r>
         <w:rPr>
           <w:rFonts w:ascii="Calibri" w:hAnsi="Calibri" w:cs="Calibri"/>
-          <w:i/>
-          <w:iCs/>
           <w:lang w:val="el-GR"/>
         </w:rPr>
         <w:t>)</w:t>
@@ -6099,14 +6065,13 @@
       </w:pPr>
       <w:r>
         <w:rPr>
-          <w:rFonts w:ascii="Calibri" w:hAnsi="Calibri" w:cs="Calibri"/>
-          <w:lang w:val="el-GR"/>
+          <w:noProof/>
         </w:rPr>
         <w:drawing>
-          <wp:inline distT="0" distB="0" distL="0" distR="0" wp14:anchorId="61852F84" wp14:editId="07230C53">
-            <wp:extent cx="5943600" cy="4474845"/>
-            <wp:effectExtent l="0" t="0" r="0" b="1905"/>
-            <wp:docPr id="330089002" name="Picture 1"/>
+          <wp:inline distT="0" distB="0" distL="0" distR="0" wp14:anchorId="122788DF" wp14:editId="7BBED8E5">
+            <wp:extent cx="5943600" cy="4509135"/>
+            <wp:effectExtent l="0" t="0" r="0" b="5715"/>
+            <wp:docPr id="1302439238" name="Picture 1"/>
             <wp:cNvGraphicFramePr>
               <a:graphicFrameLocks xmlns:a="http://schemas.openxmlformats.org/drawingml/2006/main" noChangeAspect="1"/>
             </wp:cNvGraphicFramePr>
@@ -6114,11 +6079,11 @@
               <a:graphicData uri="http://schemas.openxmlformats.org/drawingml/2006/picture">
                 <pic:pic xmlns:pic="http://schemas.openxmlformats.org/drawingml/2006/picture">
                   <pic:nvPicPr>
-                    <pic:cNvPr id="330089002" name=""/>
+                    <pic:cNvPr id="1302439238" name=""/>
                     <pic:cNvPicPr/>
                   </pic:nvPicPr>
                   <pic:blipFill>
-                    <a:blip r:embed="rId21"/>
+                    <a:blip r:embed="rId22"/>
                     <a:stretch>
                       <a:fillRect/>
                     </a:stretch>
@@ -6126,7 +6091,7 @@
                   <pic:spPr>
                     <a:xfrm>
                       <a:off x="0" y="0"/>
-                      <a:ext cx="5943600" cy="4474845"/>
+                      <a:ext cx="5943600" cy="4509135"/>
                     </a:xfrm>
                     <a:prstGeom prst="rect">
                       <a:avLst/>
@@ -6148,13 +6113,11 @@
           <w:lang w:val="el-GR"/>
         </w:rPr>
       </w:pPr>
-      <w:proofErr w:type="spellStart"/>
-      <w:r>
-        <w:t>Εικόν</w:t>
-      </w:r>
-      <w:proofErr w:type="spellEnd"/>
-      <w:r>
-        <w:t xml:space="preserve">α </w:t>
+      <w:r>
+        <w:rPr>
+          <w:lang w:val="el-GR"/>
+        </w:rPr>
+        <w:t xml:space="preserve">Εικόνα </w:t>
       </w:r>
       <w:r>
         <w:rPr>
@@ -6162,150 +6125,6 @@
         </w:rPr>
         <w:t>14: Προσθήκη Σχολίου</w:t>
       </w:r>
-    </w:p>
-    <w:p>
-      <w:pPr>
-        <w:jc w:val="both"/>
-        <w:rPr>
-          <w:rFonts w:ascii="Calibri" w:hAnsi="Calibri" w:cs="Calibri"/>
-          <w:lang w:val="el-GR"/>
-        </w:rPr>
-      </w:pPr>
-    </w:p>
-    <w:p>
-      <w:pPr>
-        <w:jc w:val="both"/>
-        <w:rPr>
-          <w:rFonts w:ascii="Calibri" w:hAnsi="Calibri" w:cs="Calibri"/>
-          <w:lang w:val="el-GR"/>
-        </w:rPr>
-      </w:pPr>
-    </w:p>
-    <w:p>
-      <w:pPr>
-        <w:jc w:val="both"/>
-        <w:rPr>
-          <w:rFonts w:ascii="Calibri" w:hAnsi="Calibri" w:cs="Calibri"/>
-          <w:lang w:val="el-GR"/>
-        </w:rPr>
-      </w:pPr>
-    </w:p>
-    <w:p>
-      <w:pPr>
-        <w:jc w:val="both"/>
-        <w:rPr>
-          <w:rFonts w:ascii="Calibri" w:hAnsi="Calibri" w:cs="Calibri"/>
-          <w:lang w:val="el-GR"/>
-        </w:rPr>
-      </w:pPr>
-    </w:p>
-    <w:p>
-      <w:pPr>
-        <w:jc w:val="both"/>
-        <w:rPr>
-          <w:rFonts w:ascii="Calibri" w:hAnsi="Calibri" w:cs="Calibri"/>
-          <w:lang w:val="el-GR"/>
-        </w:rPr>
-      </w:pPr>
-    </w:p>
-    <w:p>
-      <w:pPr>
-        <w:jc w:val="both"/>
-        <w:rPr>
-          <w:rFonts w:ascii="Calibri" w:hAnsi="Calibri" w:cs="Calibri"/>
-          <w:lang w:val="el-GR"/>
-        </w:rPr>
-      </w:pPr>
-    </w:p>
-    <w:p>
-      <w:pPr>
-        <w:jc w:val="both"/>
-        <w:rPr>
-          <w:rFonts w:ascii="Calibri" w:hAnsi="Calibri" w:cs="Calibri"/>
-          <w:lang w:val="el-GR"/>
-        </w:rPr>
-      </w:pPr>
-    </w:p>
-    <w:p>
-      <w:pPr>
-        <w:jc w:val="both"/>
-        <w:rPr>
-          <w:rFonts w:ascii="Calibri" w:hAnsi="Calibri" w:cs="Calibri"/>
-          <w:lang w:val="el-GR"/>
-        </w:rPr>
-      </w:pPr>
-    </w:p>
-    <w:p>
-      <w:pPr>
-        <w:jc w:val="both"/>
-        <w:rPr>
-          <w:rFonts w:ascii="Calibri" w:hAnsi="Calibri" w:cs="Calibri"/>
-          <w:lang w:val="el-GR"/>
-        </w:rPr>
-      </w:pPr>
-    </w:p>
-    <w:p>
-      <w:pPr>
-        <w:jc w:val="both"/>
-        <w:rPr>
-          <w:rFonts w:ascii="Calibri" w:hAnsi="Calibri" w:cs="Calibri"/>
-          <w:lang w:val="el-GR"/>
-        </w:rPr>
-      </w:pPr>
-    </w:p>
-    <w:p>
-      <w:pPr>
-        <w:jc w:val="both"/>
-        <w:rPr>
-          <w:rFonts w:ascii="Calibri" w:hAnsi="Calibri" w:cs="Calibri"/>
-          <w:lang w:val="el-GR"/>
-        </w:rPr>
-      </w:pPr>
-    </w:p>
-    <w:p>
-      <w:pPr>
-        <w:jc w:val="both"/>
-        <w:rPr>
-          <w:rFonts w:ascii="Calibri" w:hAnsi="Calibri" w:cs="Calibri"/>
-          <w:lang w:val="el-GR"/>
-        </w:rPr>
-      </w:pPr>
-    </w:p>
-    <w:p>
-      <w:pPr>
-        <w:jc w:val="both"/>
-        <w:rPr>
-          <w:rFonts w:ascii="Calibri" w:hAnsi="Calibri" w:cs="Calibri"/>
-          <w:lang w:val="el-GR"/>
-        </w:rPr>
-      </w:pPr>
-    </w:p>
-    <w:p>
-      <w:pPr>
-        <w:jc w:val="both"/>
-        <w:rPr>
-          <w:rFonts w:ascii="Calibri" w:hAnsi="Calibri" w:cs="Calibri"/>
-          <w:lang w:val="el-GR"/>
-        </w:rPr>
-      </w:pPr>
-    </w:p>
-    <w:p>
-      <w:pPr>
-        <w:jc w:val="both"/>
-        <w:rPr>
-          <w:rFonts w:ascii="Calibri" w:hAnsi="Calibri" w:cs="Calibri"/>
-          <w:lang w:val="el-GR"/>
-        </w:rPr>
-      </w:pPr>
-    </w:p>
-    <w:p>
-      <w:pPr>
-        <w:jc w:val="both"/>
-        <w:rPr>
-          <w:rFonts w:ascii="Calibri" w:hAnsi="Calibri" w:cs="Calibri"/>
-          <w:lang w:val="el-GR"/>
-        </w:rPr>
-      </w:pPr>
     </w:p>
     <w:p>
       <w:pPr>
@@ -6382,16 +6201,7 @@
           <w:bCs/>
           <w:lang w:val="el-GR"/>
         </w:rPr>
-        <w:t>Διαγραφή</w:t>
-      </w:r>
-      <w:r>
-        <w:rPr>
-          <w:rFonts w:ascii="Calibri" w:hAnsi="Calibri" w:cs="Calibri"/>
-          <w:b/>
-          <w:bCs/>
-          <w:lang w:val="el-GR"/>
-        </w:rPr>
-        <w:t xml:space="preserve"> Σχολίου</w:t>
+        <w:t>Διαγραφή Σχολίου</w:t>
       </w:r>
     </w:p>
     <w:p>
@@ -6435,21 +6245,14 @@
           <w:rFonts w:ascii="Calibri" w:hAnsi="Calibri" w:cs="Calibri"/>
           <w:lang w:val="el-GR"/>
         </w:rPr>
-        <w:t xml:space="preserve">Διαγραφή </w:t>
-      </w:r>
-      <w:r>
-        <w:rPr>
-          <w:rFonts w:ascii="Calibri" w:hAnsi="Calibri" w:cs="Calibri"/>
-          <w:lang w:val="el-GR"/>
-        </w:rPr>
-        <w:t>Σχολίου</w:t>
-      </w:r>
-      <w:r>
-        <w:rPr>
-          <w:rFonts w:ascii="Calibri" w:hAnsi="Calibri" w:cs="Calibri"/>
-          <w:lang w:val="el-GR"/>
-        </w:rPr>
-        <w:t xml:space="preserve">». Ως Χρήστη θεωρούμε  τον </w:t>
+        <w:t>Διαγραφή Σχολίου</w:t>
+      </w:r>
+      <w:r>
+        <w:rPr>
+          <w:rFonts w:ascii="Calibri" w:hAnsi="Calibri" w:cs="Calibri"/>
+          <w:lang w:val="el-GR"/>
+        </w:rPr>
+        <w:t xml:space="preserve">». Ως Χρήστη θεωρούμε τον </w:t>
       </w:r>
       <w:proofErr w:type="spellStart"/>
       <w:r>
@@ -6519,6 +6322,55 @@
       <w:r>
         <w:rPr>
           <w:rFonts w:ascii="Calibri" w:hAnsi="Calibri" w:cs="Calibri"/>
+          <w:i/>
+          <w:iCs/>
+          <w:lang w:val="el-GR"/>
+        </w:rPr>
+        <w:t xml:space="preserve"> </w:t>
+      </w:r>
+      <w:r>
+        <w:rPr>
+          <w:rFonts w:ascii="Calibri" w:hAnsi="Calibri" w:cs="Calibri"/>
+          <w:lang w:val="el-GR"/>
+        </w:rPr>
+        <w:t xml:space="preserve">και παρουσιάζουμε το διάγραμμα </w:t>
+      </w:r>
+      <w:r>
+        <w:rPr>
+          <w:rFonts w:ascii="Calibri" w:hAnsi="Calibri" w:cs="Calibri"/>
+          <w:lang w:val="el-GR"/>
+        </w:rPr>
+        <w:t>διαγραφής</w:t>
+      </w:r>
+      <w:r>
+        <w:rPr>
+          <w:rFonts w:ascii="Calibri" w:hAnsi="Calibri" w:cs="Calibri"/>
+          <w:lang w:val="el-GR"/>
+        </w:rPr>
+        <w:t xml:space="preserve"> σχολίου σε </w:t>
+      </w:r>
+      <w:r>
+        <w:rPr>
+          <w:rFonts w:ascii="Calibri" w:hAnsi="Calibri" w:cs="Calibri"/>
+        </w:rPr>
+        <w:t>CRC</w:t>
+      </w:r>
+      <w:r>
+        <w:rPr>
+          <w:rFonts w:ascii="Calibri" w:hAnsi="Calibri" w:cs="Calibri"/>
+          <w:lang w:val="el-GR"/>
+        </w:rPr>
+        <w:t xml:space="preserve"> </w:t>
+      </w:r>
+      <w:r>
+        <w:rPr>
+          <w:rFonts w:ascii="Calibri" w:hAnsi="Calibri" w:cs="Calibri"/>
+        </w:rPr>
+        <w:t>Card</w:t>
+      </w:r>
+      <w:r>
+        <w:rPr>
+          <w:rFonts w:ascii="Calibri" w:hAnsi="Calibri" w:cs="Calibri"/>
           <w:lang w:val="el-GR"/>
         </w:rPr>
         <w:t>.</w:t>
@@ -6526,99 +6378,118 @@
     </w:p>
     <w:p>
       <w:pPr>
-        <w:jc w:val="both"/>
-        <w:rPr>
-          <w:lang w:val="el-GR"/>
-        </w:rPr>
-      </w:pPr>
-    </w:p>
-    <w:p>
-      <w:pPr>
-        <w:jc w:val="both"/>
-        <w:rPr>
-          <w:lang w:val="el-GR"/>
-        </w:rPr>
-      </w:pPr>
-    </w:p>
-    <w:p>
-      <w:pPr>
-        <w:jc w:val="both"/>
-        <w:rPr>
-          <w:lang w:val="el-GR"/>
-        </w:rPr>
-      </w:pPr>
-    </w:p>
-    <w:p>
-      <w:pPr>
-        <w:jc w:val="both"/>
-        <w:rPr>
-          <w:lang w:val="el-GR"/>
-        </w:rPr>
-      </w:pPr>
-    </w:p>
-    <w:p>
-      <w:pPr>
-        <w:jc w:val="both"/>
-        <w:rPr>
-          <w:lang w:val="el-GR"/>
-        </w:rPr>
-      </w:pPr>
-    </w:p>
-    <w:p>
-      <w:pPr>
-        <w:jc w:val="both"/>
-        <w:rPr>
-          <w:lang w:val="el-GR"/>
-        </w:rPr>
-      </w:pPr>
-    </w:p>
-    <w:p>
-      <w:pPr>
-        <w:jc w:val="both"/>
-        <w:rPr>
-          <w:lang w:val="el-GR"/>
-        </w:rPr>
-      </w:pPr>
-    </w:p>
-    <w:p>
-      <w:pPr>
-        <w:jc w:val="both"/>
-        <w:rPr>
-          <w:lang w:val="el-GR"/>
-        </w:rPr>
-      </w:pPr>
-    </w:p>
-    <w:p>
-      <w:pPr>
-        <w:jc w:val="both"/>
-        <w:rPr>
-          <w:lang w:val="el-GR"/>
-        </w:rPr>
-      </w:pPr>
-    </w:p>
-    <w:p>
-      <w:pPr>
-        <w:jc w:val="both"/>
-        <w:rPr>
-          <w:lang w:val="el-GR"/>
-        </w:rPr>
-      </w:pPr>
-    </w:p>
-    <w:p>
-      <w:pPr>
-        <w:jc w:val="both"/>
-        <w:rPr>
-          <w:lang w:val="el-GR"/>
-        </w:rPr>
-      </w:pPr>
-    </w:p>
-    <w:p>
-      <w:pPr>
-        <w:jc w:val="both"/>
-        <w:rPr>
-          <w:lang w:val="el-GR"/>
-        </w:rPr>
-      </w:pPr>
+        <w:keepNext/>
+        <w:jc w:val="center"/>
+      </w:pPr>
+      <w:r>
+        <w:rPr>
+          <w:noProof/>
+        </w:rPr>
+        <w:drawing>
+          <wp:inline distT="0" distB="0" distL="0" distR="0" wp14:anchorId="378ECCA6" wp14:editId="0BA8157A">
+            <wp:extent cx="5943600" cy="3458845"/>
+            <wp:effectExtent l="0" t="0" r="0" b="8255"/>
+            <wp:docPr id="1516627963" name="Picture 1"/>
+            <wp:cNvGraphicFramePr>
+              <a:graphicFrameLocks xmlns:a="http://schemas.openxmlformats.org/drawingml/2006/main" noChangeAspect="1"/>
+            </wp:cNvGraphicFramePr>
+            <a:graphic xmlns:a="http://schemas.openxmlformats.org/drawingml/2006/main">
+              <a:graphicData uri="http://schemas.openxmlformats.org/drawingml/2006/picture">
+                <pic:pic xmlns:pic="http://schemas.openxmlformats.org/drawingml/2006/picture">
+                  <pic:nvPicPr>
+                    <pic:cNvPr id="1516627963" name=""/>
+                    <pic:cNvPicPr/>
+                  </pic:nvPicPr>
+                  <pic:blipFill>
+                    <a:blip r:embed="rId23"/>
+                    <a:stretch>
+                      <a:fillRect/>
+                    </a:stretch>
+                  </pic:blipFill>
+                  <pic:spPr>
+                    <a:xfrm>
+                      <a:off x="0" y="0"/>
+                      <a:ext cx="5943600" cy="3458845"/>
+                    </a:xfrm>
+                    <a:prstGeom prst="rect">
+                      <a:avLst/>
+                    </a:prstGeom>
+                  </pic:spPr>
+                </pic:pic>
+              </a:graphicData>
+            </a:graphic>
+          </wp:inline>
+        </w:drawing>
+      </w:r>
+    </w:p>
+    <w:p>
+      <w:pPr>
+        <w:pStyle w:val="Caption"/>
+        <w:jc w:val="center"/>
+        <w:rPr>
+          <w:lang w:val="el-GR"/>
+        </w:rPr>
+      </w:pPr>
+      <w:r>
+        <w:rPr>
+          <w:lang w:val="el-GR"/>
+        </w:rPr>
+        <w:t xml:space="preserve">Εικόνα </w:t>
+      </w:r>
+      <w:r>
+        <w:rPr>
+          <w:lang w:val="el-GR"/>
+        </w:rPr>
+        <w:t>1</w:t>
+      </w:r>
+      <w:r>
+        <w:fldChar w:fldCharType="begin"/>
+      </w:r>
+      <w:r>
+        <w:rPr>
+          <w:lang w:val="el-GR"/>
+        </w:rPr>
+        <w:instrText xml:space="preserve"> </w:instrText>
+      </w:r>
+      <w:r>
+        <w:instrText>SEQ</w:instrText>
+      </w:r>
+      <w:r>
+        <w:rPr>
+          <w:lang w:val="el-GR"/>
+        </w:rPr>
+        <w:instrText xml:space="preserve"> Εικόνα \* </w:instrText>
+      </w:r>
+      <w:r>
+        <w:instrText>ARABIC</w:instrText>
+      </w:r>
+      <w:r>
+        <w:rPr>
+          <w:lang w:val="el-GR"/>
+        </w:rPr>
+        <w:instrText xml:space="preserve"> </w:instrText>
+      </w:r>
+      <w:r>
+        <w:fldChar w:fldCharType="separate"/>
+      </w:r>
+      <w:r>
+        <w:rPr>
+          <w:noProof/>
+        </w:rPr>
+        <w:t>6</w:t>
+      </w:r>
+      <w:r>
+        <w:rPr>
+          <w:noProof/>
+        </w:rPr>
+        <w:fldChar w:fldCharType="end"/>
+      </w:r>
+      <w:r>
+        <w:rPr>
+          <w:lang w:val="el-GR"/>
+        </w:rPr>
+        <w:t>: Διαγραφή Σχολίου</w:t>
+      </w:r>
     </w:p>
     <w:p>
       <w:pPr>
@@ -6721,16 +6592,7 @@
           <w:bCs/>
           <w:lang w:val="el-GR"/>
         </w:rPr>
-        <w:t>Έγκριση / Απόρριψη</w:t>
-      </w:r>
-      <w:r>
-        <w:rPr>
-          <w:rFonts w:ascii="Calibri" w:hAnsi="Calibri" w:cs="Calibri"/>
-          <w:b/>
-          <w:bCs/>
-          <w:lang w:val="el-GR"/>
-        </w:rPr>
-        <w:t xml:space="preserve"> </w:t>
+        <w:t xml:space="preserve">Έγκριση / Απόρριψη </w:t>
       </w:r>
       <w:r>
         <w:rPr>
@@ -6846,99 +6708,122 @@
     </w:p>
     <w:p>
       <w:pPr>
-        <w:rPr>
-          <w:rFonts w:ascii="Calibri" w:hAnsi="Calibri" w:cs="Calibri"/>
-          <w:lang w:val="el-GR"/>
-        </w:rPr>
-      </w:pPr>
-    </w:p>
-    <w:p>
-      <w:pPr>
-        <w:rPr>
-          <w:rFonts w:ascii="Calibri" w:hAnsi="Calibri" w:cs="Calibri"/>
-          <w:lang w:val="el-GR"/>
-        </w:rPr>
-      </w:pPr>
-    </w:p>
-    <w:p>
-      <w:pPr>
-        <w:rPr>
-          <w:rFonts w:ascii="Calibri" w:hAnsi="Calibri" w:cs="Calibri"/>
-          <w:lang w:val="el-GR"/>
-        </w:rPr>
-      </w:pPr>
-    </w:p>
-    <w:p>
-      <w:pPr>
-        <w:rPr>
-          <w:rFonts w:ascii="Calibri" w:hAnsi="Calibri" w:cs="Calibri"/>
-          <w:lang w:val="el-GR"/>
-        </w:rPr>
-      </w:pPr>
-    </w:p>
-    <w:p>
-      <w:pPr>
-        <w:rPr>
-          <w:rFonts w:ascii="Calibri" w:hAnsi="Calibri" w:cs="Calibri"/>
-          <w:lang w:val="el-GR"/>
-        </w:rPr>
-      </w:pPr>
-    </w:p>
-    <w:p>
-      <w:pPr>
-        <w:rPr>
-          <w:rFonts w:ascii="Calibri" w:hAnsi="Calibri" w:cs="Calibri"/>
-          <w:lang w:val="el-GR"/>
-        </w:rPr>
-      </w:pPr>
-    </w:p>
-    <w:p>
-      <w:pPr>
-        <w:rPr>
-          <w:rFonts w:ascii="Calibri" w:hAnsi="Calibri" w:cs="Calibri"/>
-          <w:lang w:val="el-GR"/>
-        </w:rPr>
-      </w:pPr>
-    </w:p>
-    <w:p>
-      <w:pPr>
-        <w:rPr>
-          <w:rFonts w:ascii="Calibri" w:hAnsi="Calibri" w:cs="Calibri"/>
-          <w:lang w:val="el-GR"/>
-        </w:rPr>
-      </w:pPr>
-    </w:p>
-    <w:p>
-      <w:pPr>
-        <w:rPr>
-          <w:rFonts w:ascii="Calibri" w:hAnsi="Calibri" w:cs="Calibri"/>
-          <w:lang w:val="el-GR"/>
-        </w:rPr>
-      </w:pPr>
-    </w:p>
-    <w:p>
-      <w:pPr>
-        <w:rPr>
-          <w:rFonts w:ascii="Calibri" w:hAnsi="Calibri" w:cs="Calibri"/>
-          <w:lang w:val="el-GR"/>
-        </w:rPr>
-      </w:pPr>
-    </w:p>
-    <w:p>
-      <w:pPr>
-        <w:rPr>
-          <w:rFonts w:ascii="Calibri" w:hAnsi="Calibri" w:cs="Calibri"/>
-          <w:lang w:val="el-GR"/>
-        </w:rPr>
-      </w:pPr>
-    </w:p>
-    <w:p>
-      <w:pPr>
-        <w:rPr>
-          <w:rFonts w:ascii="Calibri" w:hAnsi="Calibri" w:cs="Calibri"/>
-          <w:lang w:val="el-GR"/>
-        </w:rPr>
-      </w:pPr>
+        <w:keepNext/>
+        <w:jc w:val="center"/>
+      </w:pPr>
+      <w:r>
+        <w:rPr>
+          <w:noProof/>
+        </w:rPr>
+        <w:drawing>
+          <wp:inline distT="0" distB="0" distL="0" distR="0" wp14:anchorId="5B0DAEC7" wp14:editId="53A1B81B">
+            <wp:extent cx="5943600" cy="3493135"/>
+            <wp:effectExtent l="0" t="0" r="0" b="0"/>
+            <wp:docPr id="701257878" name="Picture 1"/>
+            <wp:cNvGraphicFramePr>
+              <a:graphicFrameLocks xmlns:a="http://schemas.openxmlformats.org/drawingml/2006/main" noChangeAspect="1"/>
+            </wp:cNvGraphicFramePr>
+            <a:graphic xmlns:a="http://schemas.openxmlformats.org/drawingml/2006/main">
+              <a:graphicData uri="http://schemas.openxmlformats.org/drawingml/2006/picture">
+                <pic:pic xmlns:pic="http://schemas.openxmlformats.org/drawingml/2006/picture">
+                  <pic:nvPicPr>
+                    <pic:cNvPr id="701257878" name=""/>
+                    <pic:cNvPicPr/>
+                  </pic:nvPicPr>
+                  <pic:blipFill>
+                    <a:blip r:embed="rId24"/>
+                    <a:stretch>
+                      <a:fillRect/>
+                    </a:stretch>
+                  </pic:blipFill>
+                  <pic:spPr>
+                    <a:xfrm>
+                      <a:off x="0" y="0"/>
+                      <a:ext cx="5943600" cy="3493135"/>
+                    </a:xfrm>
+                    <a:prstGeom prst="rect">
+                      <a:avLst/>
+                    </a:prstGeom>
+                  </pic:spPr>
+                </pic:pic>
+              </a:graphicData>
+            </a:graphic>
+          </wp:inline>
+        </w:drawing>
+      </w:r>
+    </w:p>
+    <w:p>
+      <w:pPr>
+        <w:pStyle w:val="Caption"/>
+        <w:jc w:val="center"/>
+        <w:rPr>
+          <w:rFonts w:ascii="Calibri" w:hAnsi="Calibri" w:cs="Calibri"/>
+          <w:lang w:val="el-GR"/>
+        </w:rPr>
+      </w:pPr>
+      <w:r>
+        <w:rPr>
+          <w:lang w:val="el-GR"/>
+        </w:rPr>
+        <w:t>Εικόνα 1</w:t>
+      </w:r>
+      <w:r>
+        <w:fldChar w:fldCharType="begin"/>
+      </w:r>
+      <w:r>
+        <w:rPr>
+          <w:lang w:val="el-GR"/>
+        </w:rPr>
+        <w:instrText xml:space="preserve"> </w:instrText>
+      </w:r>
+      <w:r>
+        <w:instrText>SEQ</w:instrText>
+      </w:r>
+      <w:r>
+        <w:rPr>
+          <w:lang w:val="el-GR"/>
+        </w:rPr>
+        <w:instrText xml:space="preserve"> Εικόνα \* </w:instrText>
+      </w:r>
+      <w:r>
+        <w:instrText>ARABIC</w:instrText>
+      </w:r>
+      <w:r>
+        <w:rPr>
+          <w:lang w:val="el-GR"/>
+        </w:rPr>
+        <w:instrText xml:space="preserve"> </w:instrText>
+      </w:r>
+      <w:r>
+        <w:fldChar w:fldCharType="separate"/>
+      </w:r>
+      <w:r>
+        <w:rPr>
+          <w:noProof/>
+        </w:rPr>
+        <w:t>7</w:t>
+      </w:r>
+      <w:r>
+        <w:fldChar w:fldCharType="end"/>
+      </w:r>
+      <w:r>
+        <w:rPr>
+          <w:lang w:val="el-GR"/>
+        </w:rPr>
+        <w:t xml:space="preserve">: Έγκριση / Απόρριψη </w:t>
+      </w:r>
+      <w:r>
+        <w:t>Use</w:t>
+      </w:r>
+      <w:r>
+        <w:rPr>
+          <w:lang w:val="el-GR"/>
+        </w:rPr>
+        <w:t xml:space="preserve"> </w:t>
+      </w:r>
+      <w:r>
+        <w:t>Case</w:t>
+      </w:r>
     </w:p>
     <w:p>
       <w:pPr>
@@ -7125,7 +7010,7 @@
         </w:rPr>
         <w:t xml:space="preserve"> με τη χρήση του εργαλείου </w:t>
       </w:r>
-      <w:hyperlink r:id="rId22" w:history="1">
+      <w:hyperlink r:id="rId25" w:history="1">
         <w:r>
           <w:rPr>
             <w:rStyle w:val="Hyperlink"/>
@@ -7167,8 +7052,8 @@
       </w:pPr>
     </w:p>
     <w:sectPr>
-      <w:headerReference w:type="default" r:id="rId23"/>
-      <w:footerReference w:type="default" r:id="rId24"/>
+      <w:headerReference w:type="default" r:id="rId26"/>
+      <w:footerReference w:type="default" r:id="rId27"/>
       <w:pgSz w:w="12240" w:h="15840"/>
       <w:pgMar w:top="1440" w:right="1440" w:bottom="1440" w:left="1440" w:header="720" w:footer="720" w:gutter="0"/>
       <w:cols w:space="720"/>
@@ -8336,6 +8221,7 @@
   <w:style w:type="character" w:default="1" w:styleId="DefaultParagraphFont">
     <w:name w:val="Default Paragraph Font"/>
     <w:uiPriority w:val="1"/>
+    <w:semiHidden/>
     <w:unhideWhenUsed/>
   </w:style>
   <w:style w:type="table" w:default="1" w:styleId="TableNormal">

</xml_diff>

<commit_message>
docs: New file robustness
</commit_message>
<xml_diff>
--- a/2nd_phase/Robustness-diagram-v0.1.docx
+++ b/2nd_phase/Robustness-diagram-v0.1.docx
@@ -1599,6 +1599,7 @@
         <w:rPr>
           <w:rFonts w:ascii="Calibri" w:hAnsi="Calibri" w:cs="Calibri"/>
           <w:noProof/>
+          <w:lang w:val="el-GR"/>
         </w:rPr>
         <w:t>1</w:t>
       </w:r>
@@ -1923,6 +1924,7 @@
         <w:rPr>
           <w:rFonts w:ascii="Calibri" w:hAnsi="Calibri" w:cs="Calibri"/>
           <w:noProof/>
+          <w:lang w:val="el-GR"/>
         </w:rPr>
         <w:t>2</w:t>
       </w:r>
@@ -2275,6 +2277,7 @@
         <w:rPr>
           <w:rFonts w:ascii="Calibri" w:hAnsi="Calibri" w:cs="Calibri"/>
           <w:noProof/>
+          <w:lang w:val="el-GR"/>
         </w:rPr>
         <w:t>3</w:t>
       </w:r>
@@ -2648,6 +2651,7 @@
         <w:rPr>
           <w:rFonts w:ascii="Calibri" w:hAnsi="Calibri" w:cs="Calibri"/>
           <w:noProof/>
+          <w:lang w:val="el-GR"/>
         </w:rPr>
         <w:t>4</w:t>
       </w:r>
@@ -5309,6 +5313,7 @@
       <w:r>
         <w:rPr>
           <w:rFonts w:ascii="Calibri" w:hAnsi="Calibri" w:cs="Calibri"/>
+          <w:noProof/>
           <w:lang w:val="el-GR"/>
         </w:rPr>
         <w:drawing>
@@ -5357,13 +5362,11 @@
           <w:lang w:val="el-GR"/>
         </w:rPr>
       </w:pPr>
-      <w:proofErr w:type="spellStart"/>
-      <w:r>
-        <w:t>Εικόν</w:t>
-      </w:r>
-      <w:proofErr w:type="spellEnd"/>
-      <w:r>
-        <w:t>α 11</w:t>
+      <w:r>
+        <w:rPr>
+          <w:lang w:val="el-GR"/>
+        </w:rPr>
+        <w:t>Εικόνα 11</w:t>
       </w:r>
       <w:r>
         <w:rPr>
@@ -5419,6 +5422,7 @@
       <w:pPr>
         <w:rPr>
           <w:rFonts w:ascii="Calibri" w:hAnsi="Calibri" w:cs="Calibri"/>
+          <w:lang w:val="el-GR"/>
         </w:rPr>
       </w:pPr>
     </w:p>
@@ -6443,46 +6447,7 @@
         <w:t>1</w:t>
       </w:r>
       <w:r>
-        <w:fldChar w:fldCharType="begin"/>
-      </w:r>
-      <w:r>
-        <w:rPr>
-          <w:lang w:val="el-GR"/>
-        </w:rPr>
-        <w:instrText xml:space="preserve"> </w:instrText>
-      </w:r>
-      <w:r>
-        <w:instrText>SEQ</w:instrText>
-      </w:r>
-      <w:r>
-        <w:rPr>
-          <w:lang w:val="el-GR"/>
-        </w:rPr>
-        <w:instrText xml:space="preserve"> Εικόνα \* </w:instrText>
-      </w:r>
-      <w:r>
-        <w:instrText>ARABIC</w:instrText>
-      </w:r>
-      <w:r>
-        <w:rPr>
-          <w:lang w:val="el-GR"/>
-        </w:rPr>
-        <w:instrText xml:space="preserve"> </w:instrText>
-      </w:r>
-      <w:r>
-        <w:fldChar w:fldCharType="separate"/>
-      </w:r>
-      <w:r>
-        <w:rPr>
-          <w:noProof/>
-        </w:rPr>
-        <w:t>6</w:t>
-      </w:r>
-      <w:r>
-        <w:rPr>
-          <w:noProof/>
-        </w:rPr>
-        <w:fldChar w:fldCharType="end"/>
+        <w:t>5</w:t>
       </w:r>
       <w:r>
         <w:rPr>
@@ -6712,14 +6677,11 @@
         <w:jc w:val="center"/>
       </w:pPr>
       <w:r>
-        <w:rPr>
-          <w:noProof/>
-        </w:rPr>
         <w:drawing>
-          <wp:inline distT="0" distB="0" distL="0" distR="0" wp14:anchorId="5B0DAEC7" wp14:editId="53A1B81B">
-            <wp:extent cx="5943600" cy="3493135"/>
-            <wp:effectExtent l="0" t="0" r="0" b="0"/>
-            <wp:docPr id="701257878" name="Picture 1"/>
+          <wp:inline distT="0" distB="0" distL="0" distR="0" wp14:anchorId="72274569" wp14:editId="75BB715A">
+            <wp:extent cx="5943600" cy="3175000"/>
+            <wp:effectExtent l="0" t="0" r="0" b="6350"/>
+            <wp:docPr id="368233503" name="Picture 1"/>
             <wp:cNvGraphicFramePr>
               <a:graphicFrameLocks xmlns:a="http://schemas.openxmlformats.org/drawingml/2006/main" noChangeAspect="1"/>
             </wp:cNvGraphicFramePr>
@@ -6727,7 +6689,7 @@
               <a:graphicData uri="http://schemas.openxmlformats.org/drawingml/2006/picture">
                 <pic:pic xmlns:pic="http://schemas.openxmlformats.org/drawingml/2006/picture">
                   <pic:nvPicPr>
-                    <pic:cNvPr id="701257878" name=""/>
+                    <pic:cNvPr id="368233503" name=""/>
                     <pic:cNvPicPr/>
                   </pic:nvPicPr>
                   <pic:blipFill>
@@ -6739,7 +6701,7 @@
                   <pic:spPr>
                     <a:xfrm>
                       <a:off x="0" y="0"/>
-                      <a:ext cx="5943600" cy="3493135"/>
+                      <a:ext cx="5943600" cy="3175000"/>
                     </a:xfrm>
                     <a:prstGeom prst="rect">
                       <a:avLst/>
@@ -6768,43 +6730,10 @@
         <w:t>Εικόνα 1</w:t>
       </w:r>
       <w:r>
-        <w:fldChar w:fldCharType="begin"/>
-      </w:r>
-      <w:r>
-        <w:rPr>
-          <w:lang w:val="el-GR"/>
-        </w:rPr>
-        <w:instrText xml:space="preserve"> </w:instrText>
-      </w:r>
-      <w:r>
-        <w:instrText>SEQ</w:instrText>
-      </w:r>
-      <w:r>
-        <w:rPr>
-          <w:lang w:val="el-GR"/>
-        </w:rPr>
-        <w:instrText xml:space="preserve"> Εικόνα \* </w:instrText>
-      </w:r>
-      <w:r>
-        <w:instrText>ARABIC</w:instrText>
-      </w:r>
-      <w:r>
-        <w:rPr>
-          <w:lang w:val="el-GR"/>
-        </w:rPr>
-        <w:instrText xml:space="preserve"> </w:instrText>
-      </w:r>
-      <w:r>
-        <w:fldChar w:fldCharType="separate"/>
-      </w:r>
-      <w:r>
-        <w:rPr>
-          <w:noProof/>
-        </w:rPr>
-        <w:t>7</w:t>
-      </w:r>
-      <w:r>
-        <w:fldChar w:fldCharType="end"/>
+        <w:rPr>
+          <w:lang w:val="el-GR"/>
+        </w:rPr>
+        <w:t>6</w:t>
       </w:r>
       <w:r>
         <w:rPr>
@@ -6885,7 +6814,13 @@
       <w:pPr>
         <w:rPr>
           <w:rFonts w:ascii="Calibri" w:hAnsi="Calibri" w:cs="Calibri"/>
-          <w:lang w:val="el-GR"/>
+        </w:rPr>
+      </w:pPr>
+    </w:p>
+    <w:p>
+      <w:pPr>
+        <w:rPr>
+          <w:rFonts w:ascii="Calibri" w:hAnsi="Calibri" w:cs="Calibri"/>
         </w:rPr>
       </w:pPr>
     </w:p>

</xml_diff>